<commit_message>
Word build: A4, Supplementary Material as .docx, word count from the rendered text
- build_docx.py sets A4 with 2.5 cm margins and builds
  submission/supplementary_material.docx from supplementary.md alongside the
  manuscript; the supplement's references to manuscript equations read
  "Eq. (n) of the main text". The LaTeX classes take a4paper as well.
- Word count on the title page is measured on the .docx itself: Sections 1-6
  from the "1 Introduction" heading to the Declarations, table cells,
  figure captions, references and declarations excluded; table captions,
  table notes, headings and rendered citations counted. It gives 10,035.
- Tables checked cell by cell against the Markdown: Table 1 (96 cells) and
  all 32 supplement tables (1,537 cells) agree; the only differences are a
  typographic apostrophe and an escaped "|" read differently by the checker.

verify_tex all PASS; check_all 10/10; both LaTeX documents compile with no
errors and no undefined references.
</commit_message>
<xml_diff>
--- a/paper/submission/manuscript.docx
+++ b/paper/submission/manuscript.docx
@@ -65,6 +65,24 @@
       </w:r>
       <w:r>
         <w:t xml:space="preserve">Corresponding author. E-mail: ycogurcu@cu.edu.tr</w:t>
+      </w:r>
+    </w:p>
+    <w:p>
+      <w:pPr>
+        <w:pStyle w:val="BodyText"/>
+      </w:pPr>
+      <w:r>
+        <w:rPr>
+          <w:b/>
+          <w:bCs/>
+        </w:rPr>
+        <w:t xml:space="preserve">Word count:</w:t>
+      </w:r>
+      <w:r>
+        <w:t xml:space="preserve"> </w:t>
+      </w:r>
+      <w:r>
+        <w:t xml:space="preserve">10,035 words in the main text, excluding references, tables, figure captions and declarations.</w:t>
       </w:r>
     </w:p>
     <w:bookmarkStart w:id="18" w:name="abstract"/>
@@ -6014,12 +6032,12 @@
         <w:tblLook w:firstRow="1" w:lastRow="0" w:firstColumn="0" w:lastColumn="0" w:noHBand="0" w:noVBand="0" w:val="0020"/>
       </w:tblPr>
       <w:tblGrid>
-        <w:gridCol w:w="3218"/>
-        <w:gridCol w:w="731"/>
-        <w:gridCol w:w="1170"/>
-        <w:gridCol w:w="1024"/>
-        <w:gridCol w:w="878"/>
-        <w:gridCol w:w="2340"/>
+        <w:gridCol w:w="3118"/>
+        <w:gridCol w:w="709"/>
+        <w:gridCol w:w="1134"/>
+        <w:gridCol w:w="992"/>
+        <w:gridCol w:w="850"/>
+        <w:gridCol w:w="2268"/>
       </w:tblGrid>
       <w:tr>
         <w:trPr>
@@ -6027,7 +6045,7 @@
         </w:trPr>
         <w:tc>
           <w:tcPr>
-            <w:tcW w:type="dxa" w:w="3218"/>
+            <w:tcW w:type="dxa" w:w="3118"/>
           </w:tcPr>
           <w:p>
             <w:pPr>
@@ -6040,7 +6058,7 @@
         </w:tc>
         <w:tc>
           <w:tcPr>
-            <w:tcW w:type="dxa" w:w="731"/>
+            <w:tcW w:type="dxa" w:w="709"/>
           </w:tcPr>
           <w:p>
             <w:pPr>
@@ -6053,7 +6071,7 @@
         </w:tc>
         <w:tc>
           <w:tcPr>
-            <w:tcW w:type="dxa" w:w="1170"/>
+            <w:tcW w:type="dxa" w:w="1134"/>
           </w:tcPr>
           <w:p>
             <w:pPr>
@@ -6066,7 +6084,7 @@
         </w:tc>
         <w:tc>
           <w:tcPr>
-            <w:tcW w:type="dxa" w:w="1024"/>
+            <w:tcW w:type="dxa" w:w="992"/>
           </w:tcPr>
           <w:p>
             <w:pPr>
@@ -6079,7 +6097,7 @@
         </w:tc>
         <w:tc>
           <w:tcPr>
-            <w:tcW w:type="dxa" w:w="878"/>
+            <w:tcW w:type="dxa" w:w="850"/>
           </w:tcPr>
           <w:p>
             <w:pPr>
@@ -6092,7 +6110,7 @@
         </w:tc>
         <w:tc>
           <w:tcPr>
-            <w:tcW w:type="dxa" w:w="2340"/>
+            <w:tcW w:type="dxa" w:w="2268"/>
           </w:tcPr>
           <w:p>
             <w:pPr>
@@ -6107,7 +6125,7 @@
       <w:tr>
         <w:tc>
           <w:tcPr>
-            <w:tcW w:type="dxa" w:w="3218"/>
+            <w:tcW w:type="dxa" w:w="3118"/>
           </w:tcPr>
           <w:p>
             <w:pPr>
@@ -6120,7 +6138,7 @@
         </w:tc>
         <w:tc>
           <w:tcPr>
-            <w:tcW w:type="dxa" w:w="731"/>
+            <w:tcW w:type="dxa" w:w="709"/>
           </w:tcPr>
           <w:p>
             <w:pPr>
@@ -6133,7 +6151,7 @@
         </w:tc>
         <w:tc>
           <w:tcPr>
-            <w:tcW w:type="dxa" w:w="1170"/>
+            <w:tcW w:type="dxa" w:w="1134"/>
           </w:tcPr>
           <w:p>
             <w:pPr>
@@ -6146,7 +6164,7 @@
         </w:tc>
         <w:tc>
           <w:tcPr>
-            <w:tcW w:type="dxa" w:w="1024"/>
+            <w:tcW w:type="dxa" w:w="992"/>
           </w:tcPr>
           <w:p>
             <w:pPr>
@@ -6159,7 +6177,7 @@
         </w:tc>
         <w:tc>
           <w:tcPr>
-            <w:tcW w:type="dxa" w:w="878"/>
+            <w:tcW w:type="dxa" w:w="850"/>
           </w:tcPr>
           <w:p>
             <w:pPr>
@@ -6172,7 +6190,7 @@
         </w:tc>
         <w:tc>
           <w:tcPr>
-            <w:tcW w:type="dxa" w:w="2340"/>
+            <w:tcW w:type="dxa" w:w="2268"/>
           </w:tcPr>
           <w:p>
             <w:pPr>
@@ -6187,7 +6205,7 @@
       <w:tr>
         <w:tc>
           <w:tcPr>
-            <w:tcW w:type="dxa" w:w="3218"/>
+            <w:tcW w:type="dxa" w:w="3118"/>
           </w:tcPr>
           <w:p>
             <w:pPr>
@@ -6197,7 +6215,7 @@
         </w:tc>
         <w:tc>
           <w:tcPr>
-            <w:tcW w:type="dxa" w:w="731"/>
+            <w:tcW w:type="dxa" w:w="709"/>
           </w:tcPr>
           <w:p>
             <w:pPr>
@@ -6210,7 +6228,7 @@
         </w:tc>
         <w:tc>
           <w:tcPr>
-            <w:tcW w:type="dxa" w:w="1170"/>
+            <w:tcW w:type="dxa" w:w="1134"/>
           </w:tcPr>
           <w:p>
             <w:pPr>
@@ -6223,7 +6241,7 @@
         </w:tc>
         <w:tc>
           <w:tcPr>
-            <w:tcW w:type="dxa" w:w="1024"/>
+            <w:tcW w:type="dxa" w:w="992"/>
           </w:tcPr>
           <w:p>
             <w:pPr>
@@ -6236,7 +6254,7 @@
         </w:tc>
         <w:tc>
           <w:tcPr>
-            <w:tcW w:type="dxa" w:w="878"/>
+            <w:tcW w:type="dxa" w:w="850"/>
           </w:tcPr>
           <w:p>
             <w:pPr>
@@ -6249,7 +6267,7 @@
         </w:tc>
         <w:tc>
           <w:tcPr>
-            <w:tcW w:type="dxa" w:w="2340"/>
+            <w:tcW w:type="dxa" w:w="2268"/>
           </w:tcPr>
           <w:p>
             <w:pPr>
@@ -6264,7 +6282,7 @@
       <w:tr>
         <w:tc>
           <w:tcPr>
-            <w:tcW w:type="dxa" w:w="3218"/>
+            <w:tcW w:type="dxa" w:w="3118"/>
           </w:tcPr>
           <w:p>
             <w:pPr>
@@ -6274,7 +6292,7 @@
         </w:tc>
         <w:tc>
           <w:tcPr>
-            <w:tcW w:type="dxa" w:w="731"/>
+            <w:tcW w:type="dxa" w:w="709"/>
           </w:tcPr>
           <w:p>
             <w:pPr>
@@ -6287,7 +6305,7 @@
         </w:tc>
         <w:tc>
           <w:tcPr>
-            <w:tcW w:type="dxa" w:w="1170"/>
+            <w:tcW w:type="dxa" w:w="1134"/>
           </w:tcPr>
           <w:p>
             <w:pPr>
@@ -6300,7 +6318,7 @@
         </w:tc>
         <w:tc>
           <w:tcPr>
-            <w:tcW w:type="dxa" w:w="1024"/>
+            <w:tcW w:type="dxa" w:w="992"/>
           </w:tcPr>
           <w:p>
             <w:pPr>
@@ -6313,7 +6331,7 @@
         </w:tc>
         <w:tc>
           <w:tcPr>
-            <w:tcW w:type="dxa" w:w="878"/>
+            <w:tcW w:type="dxa" w:w="850"/>
           </w:tcPr>
           <w:p>
             <w:pPr>
@@ -6326,7 +6344,7 @@
         </w:tc>
         <w:tc>
           <w:tcPr>
-            <w:tcW w:type="dxa" w:w="2340"/>
+            <w:tcW w:type="dxa" w:w="2268"/>
           </w:tcPr>
           <w:p>
             <w:pPr>
@@ -6341,7 +6359,7 @@
       <w:tr>
         <w:tc>
           <w:tcPr>
-            <w:tcW w:type="dxa" w:w="3218"/>
+            <w:tcW w:type="dxa" w:w="3118"/>
           </w:tcPr>
           <w:p>
             <w:pPr>
@@ -6354,7 +6372,7 @@
         </w:tc>
         <w:tc>
           <w:tcPr>
-            <w:tcW w:type="dxa" w:w="731"/>
+            <w:tcW w:type="dxa" w:w="709"/>
           </w:tcPr>
           <w:p>
             <w:pPr>
@@ -6367,7 +6385,7 @@
         </w:tc>
         <w:tc>
           <w:tcPr>
-            <w:tcW w:type="dxa" w:w="1170"/>
+            <w:tcW w:type="dxa" w:w="1134"/>
           </w:tcPr>
           <w:p>
             <w:pPr>
@@ -6380,7 +6398,7 @@
         </w:tc>
         <w:tc>
           <w:tcPr>
-            <w:tcW w:type="dxa" w:w="1024"/>
+            <w:tcW w:type="dxa" w:w="992"/>
           </w:tcPr>
           <w:p>
             <w:pPr>
@@ -6393,7 +6411,7 @@
         </w:tc>
         <w:tc>
           <w:tcPr>
-            <w:tcW w:type="dxa" w:w="878"/>
+            <w:tcW w:type="dxa" w:w="850"/>
           </w:tcPr>
           <w:p>
             <w:pPr>
@@ -6406,7 +6424,7 @@
         </w:tc>
         <w:tc>
           <w:tcPr>
-            <w:tcW w:type="dxa" w:w="2340"/>
+            <w:tcW w:type="dxa" w:w="2268"/>
           </w:tcPr>
           <w:p>
             <w:pPr>
@@ -6421,7 +6439,7 @@
       <w:tr>
         <w:tc>
           <w:tcPr>
-            <w:tcW w:type="dxa" w:w="3218"/>
+            <w:tcW w:type="dxa" w:w="3118"/>
           </w:tcPr>
           <w:p>
             <w:pPr>
@@ -6431,7 +6449,7 @@
         </w:tc>
         <w:tc>
           <w:tcPr>
-            <w:tcW w:type="dxa" w:w="731"/>
+            <w:tcW w:type="dxa" w:w="709"/>
           </w:tcPr>
           <w:p>
             <w:pPr>
@@ -6444,7 +6462,7 @@
         </w:tc>
         <w:tc>
           <w:tcPr>
-            <w:tcW w:type="dxa" w:w="1170"/>
+            <w:tcW w:type="dxa" w:w="1134"/>
           </w:tcPr>
           <w:p>
             <w:pPr>
@@ -6457,7 +6475,7 @@
         </w:tc>
         <w:tc>
           <w:tcPr>
-            <w:tcW w:type="dxa" w:w="1024"/>
+            <w:tcW w:type="dxa" w:w="992"/>
           </w:tcPr>
           <w:p>
             <w:pPr>
@@ -6470,7 +6488,7 @@
         </w:tc>
         <w:tc>
           <w:tcPr>
-            <w:tcW w:type="dxa" w:w="878"/>
+            <w:tcW w:type="dxa" w:w="850"/>
           </w:tcPr>
           <w:p>
             <w:pPr>
@@ -6483,7 +6501,7 @@
         </w:tc>
         <w:tc>
           <w:tcPr>
-            <w:tcW w:type="dxa" w:w="2340"/>
+            <w:tcW w:type="dxa" w:w="2268"/>
           </w:tcPr>
           <w:p>
             <w:pPr>
@@ -6498,7 +6516,7 @@
       <w:tr>
         <w:tc>
           <w:tcPr>
-            <w:tcW w:type="dxa" w:w="3218"/>
+            <w:tcW w:type="dxa" w:w="3118"/>
           </w:tcPr>
           <w:p>
             <w:pPr>
@@ -6508,7 +6526,7 @@
         </w:tc>
         <w:tc>
           <w:tcPr>
-            <w:tcW w:type="dxa" w:w="731"/>
+            <w:tcW w:type="dxa" w:w="709"/>
           </w:tcPr>
           <w:p>
             <w:pPr>
@@ -6521,7 +6539,7 @@
         </w:tc>
         <w:tc>
           <w:tcPr>
-            <w:tcW w:type="dxa" w:w="1170"/>
+            <w:tcW w:type="dxa" w:w="1134"/>
           </w:tcPr>
           <w:p>
             <w:pPr>
@@ -6534,7 +6552,7 @@
         </w:tc>
         <w:tc>
           <w:tcPr>
-            <w:tcW w:type="dxa" w:w="1024"/>
+            <w:tcW w:type="dxa" w:w="992"/>
           </w:tcPr>
           <w:p>
             <w:pPr>
@@ -6547,7 +6565,7 @@
         </w:tc>
         <w:tc>
           <w:tcPr>
-            <w:tcW w:type="dxa" w:w="878"/>
+            <w:tcW w:type="dxa" w:w="850"/>
           </w:tcPr>
           <w:p>
             <w:pPr>
@@ -6560,7 +6578,7 @@
         </w:tc>
         <w:tc>
           <w:tcPr>
-            <w:tcW w:type="dxa" w:w="2340"/>
+            <w:tcW w:type="dxa" w:w="2268"/>
           </w:tcPr>
           <w:p>
             <w:pPr>
@@ -6575,7 +6593,7 @@
       <w:tr>
         <w:tc>
           <w:tcPr>
-            <w:tcW w:type="dxa" w:w="3218"/>
+            <w:tcW w:type="dxa" w:w="3118"/>
           </w:tcPr>
           <w:p>
             <w:pPr>
@@ -6588,7 +6606,7 @@
         </w:tc>
         <w:tc>
           <w:tcPr>
-            <w:tcW w:type="dxa" w:w="731"/>
+            <w:tcW w:type="dxa" w:w="709"/>
           </w:tcPr>
           <w:p>
             <w:pPr>
@@ -6601,7 +6619,7 @@
         </w:tc>
         <w:tc>
           <w:tcPr>
-            <w:tcW w:type="dxa" w:w="1170"/>
+            <w:tcW w:type="dxa" w:w="1134"/>
           </w:tcPr>
           <w:p>
             <w:pPr>
@@ -6614,7 +6632,7 @@
         </w:tc>
         <w:tc>
           <w:tcPr>
-            <w:tcW w:type="dxa" w:w="1024"/>
+            <w:tcW w:type="dxa" w:w="992"/>
           </w:tcPr>
           <w:p>
             <w:pPr>
@@ -6627,7 +6645,7 @@
         </w:tc>
         <w:tc>
           <w:tcPr>
-            <w:tcW w:type="dxa" w:w="878"/>
+            <w:tcW w:type="dxa" w:w="850"/>
           </w:tcPr>
           <w:p>
             <w:pPr>
@@ -6640,7 +6658,7 @@
         </w:tc>
         <w:tc>
           <w:tcPr>
-            <w:tcW w:type="dxa" w:w="2340"/>
+            <w:tcW w:type="dxa" w:w="2268"/>
           </w:tcPr>
           <w:p>
             <w:pPr>
@@ -6655,7 +6673,7 @@
       <w:tr>
         <w:tc>
           <w:tcPr>
-            <w:tcW w:type="dxa" w:w="3218"/>
+            <w:tcW w:type="dxa" w:w="3118"/>
           </w:tcPr>
           <w:p>
             <w:pPr>
@@ -6665,7 +6683,7 @@
         </w:tc>
         <w:tc>
           <w:tcPr>
-            <w:tcW w:type="dxa" w:w="731"/>
+            <w:tcW w:type="dxa" w:w="709"/>
           </w:tcPr>
           <w:p>
             <w:pPr>
@@ -6678,7 +6696,7 @@
         </w:tc>
         <w:tc>
           <w:tcPr>
-            <w:tcW w:type="dxa" w:w="1170"/>
+            <w:tcW w:type="dxa" w:w="1134"/>
           </w:tcPr>
           <w:p>
             <w:pPr>
@@ -6691,7 +6709,7 @@
         </w:tc>
         <w:tc>
           <w:tcPr>
-            <w:tcW w:type="dxa" w:w="1024"/>
+            <w:tcW w:type="dxa" w:w="992"/>
           </w:tcPr>
           <w:p>
             <w:pPr>
@@ -6704,7 +6722,7 @@
         </w:tc>
         <w:tc>
           <w:tcPr>
-            <w:tcW w:type="dxa" w:w="878"/>
+            <w:tcW w:type="dxa" w:w="850"/>
           </w:tcPr>
           <w:p>
             <w:pPr>
@@ -6717,7 +6735,7 @@
         </w:tc>
         <w:tc>
           <w:tcPr>
-            <w:tcW w:type="dxa" w:w="2340"/>
+            <w:tcW w:type="dxa" w:w="2268"/>
           </w:tcPr>
           <w:p>
             <w:pPr>
@@ -6732,7 +6750,7 @@
       <w:tr>
         <w:tc>
           <w:tcPr>
-            <w:tcW w:type="dxa" w:w="3218"/>
+            <w:tcW w:type="dxa" w:w="3118"/>
           </w:tcPr>
           <w:p>
             <w:pPr>
@@ -6742,7 +6760,7 @@
         </w:tc>
         <w:tc>
           <w:tcPr>
-            <w:tcW w:type="dxa" w:w="731"/>
+            <w:tcW w:type="dxa" w:w="709"/>
           </w:tcPr>
           <w:p>
             <w:pPr>
@@ -6755,7 +6773,7 @@
         </w:tc>
         <w:tc>
           <w:tcPr>
-            <w:tcW w:type="dxa" w:w="1170"/>
+            <w:tcW w:type="dxa" w:w="1134"/>
           </w:tcPr>
           <w:p>
             <w:pPr>
@@ -6768,7 +6786,7 @@
         </w:tc>
         <w:tc>
           <w:tcPr>
-            <w:tcW w:type="dxa" w:w="1024"/>
+            <w:tcW w:type="dxa" w:w="992"/>
           </w:tcPr>
           <w:p>
             <w:pPr>
@@ -6781,7 +6799,7 @@
         </w:tc>
         <w:tc>
           <w:tcPr>
-            <w:tcW w:type="dxa" w:w="878"/>
+            <w:tcW w:type="dxa" w:w="850"/>
           </w:tcPr>
           <w:p>
             <w:pPr>
@@ -6794,7 +6812,7 @@
         </w:tc>
         <w:tc>
           <w:tcPr>
-            <w:tcW w:type="dxa" w:w="2340"/>
+            <w:tcW w:type="dxa" w:w="2268"/>
           </w:tcPr>
           <w:p>
             <w:pPr>
@@ -6809,7 +6827,7 @@
       <w:tr>
         <w:tc>
           <w:tcPr>
-            <w:tcW w:type="dxa" w:w="3218"/>
+            <w:tcW w:type="dxa" w:w="3118"/>
           </w:tcPr>
           <w:p>
             <w:pPr>
@@ -6822,7 +6840,7 @@
         </w:tc>
         <w:tc>
           <w:tcPr>
-            <w:tcW w:type="dxa" w:w="731"/>
+            <w:tcW w:type="dxa" w:w="709"/>
           </w:tcPr>
           <w:p>
             <w:pPr>
@@ -6835,7 +6853,7 @@
         </w:tc>
         <w:tc>
           <w:tcPr>
-            <w:tcW w:type="dxa" w:w="1170"/>
+            <w:tcW w:type="dxa" w:w="1134"/>
           </w:tcPr>
           <w:p>
             <w:pPr>
@@ -6848,7 +6866,7 @@
         </w:tc>
         <w:tc>
           <w:tcPr>
-            <w:tcW w:type="dxa" w:w="1024"/>
+            <w:tcW w:type="dxa" w:w="992"/>
           </w:tcPr>
           <w:p>
             <w:pPr>
@@ -6861,7 +6879,7 @@
         </w:tc>
         <w:tc>
           <w:tcPr>
-            <w:tcW w:type="dxa" w:w="878"/>
+            <w:tcW w:type="dxa" w:w="850"/>
           </w:tcPr>
           <w:p>
             <w:pPr>
@@ -6874,7 +6892,7 @@
         </w:tc>
         <w:tc>
           <w:tcPr>
-            <w:tcW w:type="dxa" w:w="2340"/>
+            <w:tcW w:type="dxa" w:w="2268"/>
           </w:tcPr>
           <w:p>
             <w:pPr>
@@ -6889,7 +6907,7 @@
       <w:tr>
         <w:tc>
           <w:tcPr>
-            <w:tcW w:type="dxa" w:w="3218"/>
+            <w:tcW w:type="dxa" w:w="3118"/>
           </w:tcPr>
           <w:p>
             <w:pPr>
@@ -6899,7 +6917,7 @@
         </w:tc>
         <w:tc>
           <w:tcPr>
-            <w:tcW w:type="dxa" w:w="731"/>
+            <w:tcW w:type="dxa" w:w="709"/>
           </w:tcPr>
           <w:p>
             <w:pPr>
@@ -6912,7 +6930,7 @@
         </w:tc>
         <w:tc>
           <w:tcPr>
-            <w:tcW w:type="dxa" w:w="1170"/>
+            <w:tcW w:type="dxa" w:w="1134"/>
           </w:tcPr>
           <w:p>
             <w:pPr>
@@ -6925,7 +6943,7 @@
         </w:tc>
         <w:tc>
           <w:tcPr>
-            <w:tcW w:type="dxa" w:w="1024"/>
+            <w:tcW w:type="dxa" w:w="992"/>
           </w:tcPr>
           <w:p>
             <w:pPr>
@@ -6938,7 +6956,7 @@
         </w:tc>
         <w:tc>
           <w:tcPr>
-            <w:tcW w:type="dxa" w:w="878"/>
+            <w:tcW w:type="dxa" w:w="850"/>
           </w:tcPr>
           <w:p>
             <w:pPr>
@@ -6951,7 +6969,7 @@
         </w:tc>
         <w:tc>
           <w:tcPr>
-            <w:tcW w:type="dxa" w:w="2340"/>
+            <w:tcW w:type="dxa" w:w="2268"/>
           </w:tcPr>
           <w:p>
             <w:pPr>
@@ -6966,7 +6984,7 @@
       <w:tr>
         <w:tc>
           <w:tcPr>
-            <w:tcW w:type="dxa" w:w="3218"/>
+            <w:tcW w:type="dxa" w:w="3118"/>
           </w:tcPr>
           <w:p>
             <w:pPr>
@@ -6976,7 +6994,7 @@
         </w:tc>
         <w:tc>
           <w:tcPr>
-            <w:tcW w:type="dxa" w:w="731"/>
+            <w:tcW w:type="dxa" w:w="709"/>
           </w:tcPr>
           <w:p>
             <w:pPr>
@@ -6989,7 +7007,7 @@
         </w:tc>
         <w:tc>
           <w:tcPr>
-            <w:tcW w:type="dxa" w:w="1170"/>
+            <w:tcW w:type="dxa" w:w="1134"/>
           </w:tcPr>
           <w:p>
             <w:pPr>
@@ -7002,7 +7020,7 @@
         </w:tc>
         <w:tc>
           <w:tcPr>
-            <w:tcW w:type="dxa" w:w="1024"/>
+            <w:tcW w:type="dxa" w:w="992"/>
           </w:tcPr>
           <w:p>
             <w:pPr>
@@ -7015,7 +7033,7 @@
         </w:tc>
         <w:tc>
           <w:tcPr>
-            <w:tcW w:type="dxa" w:w="878"/>
+            <w:tcW w:type="dxa" w:w="850"/>
           </w:tcPr>
           <w:p>
             <w:pPr>
@@ -7028,7 +7046,7 @@
         </w:tc>
         <w:tc>
           <w:tcPr>
-            <w:tcW w:type="dxa" w:w="2340"/>
+            <w:tcW w:type="dxa" w:w="2268"/>
           </w:tcPr>
           <w:p>
             <w:pPr>
@@ -7043,7 +7061,7 @@
       <w:tr>
         <w:tc>
           <w:tcPr>
-            <w:tcW w:type="dxa" w:w="3218"/>
+            <w:tcW w:type="dxa" w:w="3118"/>
           </w:tcPr>
           <w:p>
             <w:pPr>
@@ -7056,7 +7074,7 @@
         </w:tc>
         <w:tc>
           <w:tcPr>
-            <w:tcW w:type="dxa" w:w="731"/>
+            <w:tcW w:type="dxa" w:w="709"/>
           </w:tcPr>
           <w:p>
             <w:pPr>
@@ -7069,7 +7087,7 @@
         </w:tc>
         <w:tc>
           <w:tcPr>
-            <w:tcW w:type="dxa" w:w="1170"/>
+            <w:tcW w:type="dxa" w:w="1134"/>
           </w:tcPr>
           <w:p>
             <w:pPr>
@@ -7082,7 +7100,7 @@
         </w:tc>
         <w:tc>
           <w:tcPr>
-            <w:tcW w:type="dxa" w:w="1024"/>
+            <w:tcW w:type="dxa" w:w="992"/>
           </w:tcPr>
           <w:p>
             <w:pPr>
@@ -7095,7 +7113,7 @@
         </w:tc>
         <w:tc>
           <w:tcPr>
-            <w:tcW w:type="dxa" w:w="878"/>
+            <w:tcW w:type="dxa" w:w="850"/>
           </w:tcPr>
           <w:p>
             <w:pPr>
@@ -7108,7 +7126,7 @@
         </w:tc>
         <w:tc>
           <w:tcPr>
-            <w:tcW w:type="dxa" w:w="2340"/>
+            <w:tcW w:type="dxa" w:w="2268"/>
           </w:tcPr>
           <w:p>
             <w:pPr>
@@ -7123,7 +7141,7 @@
       <w:tr>
         <w:tc>
           <w:tcPr>
-            <w:tcW w:type="dxa" w:w="3218"/>
+            <w:tcW w:type="dxa" w:w="3118"/>
           </w:tcPr>
           <w:p>
             <w:pPr>
@@ -7133,7 +7151,7 @@
         </w:tc>
         <w:tc>
           <w:tcPr>
-            <w:tcW w:type="dxa" w:w="731"/>
+            <w:tcW w:type="dxa" w:w="709"/>
           </w:tcPr>
           <w:p>
             <w:pPr>
@@ -7146,7 +7164,7 @@
         </w:tc>
         <w:tc>
           <w:tcPr>
-            <w:tcW w:type="dxa" w:w="1170"/>
+            <w:tcW w:type="dxa" w:w="1134"/>
           </w:tcPr>
           <w:p>
             <w:pPr>
@@ -7159,7 +7177,7 @@
         </w:tc>
         <w:tc>
           <w:tcPr>
-            <w:tcW w:type="dxa" w:w="1024"/>
+            <w:tcW w:type="dxa" w:w="992"/>
           </w:tcPr>
           <w:p>
             <w:pPr>
@@ -7172,7 +7190,7 @@
         </w:tc>
         <w:tc>
           <w:tcPr>
-            <w:tcW w:type="dxa" w:w="878"/>
+            <w:tcW w:type="dxa" w:w="850"/>
           </w:tcPr>
           <w:p>
             <w:pPr>
@@ -7185,7 +7203,7 @@
         </w:tc>
         <w:tc>
           <w:tcPr>
-            <w:tcW w:type="dxa" w:w="2340"/>
+            <w:tcW w:type="dxa" w:w="2268"/>
           </w:tcPr>
           <w:p>
             <w:pPr>
@@ -7200,7 +7218,7 @@
       <w:tr>
         <w:tc>
           <w:tcPr>
-            <w:tcW w:type="dxa" w:w="3218"/>
+            <w:tcW w:type="dxa" w:w="3118"/>
           </w:tcPr>
           <w:p>
             <w:pPr>
@@ -7210,7 +7228,7 @@
         </w:tc>
         <w:tc>
           <w:tcPr>
-            <w:tcW w:type="dxa" w:w="731"/>
+            <w:tcW w:type="dxa" w:w="709"/>
           </w:tcPr>
           <w:p>
             <w:pPr>
@@ -7223,7 +7241,7 @@
         </w:tc>
         <w:tc>
           <w:tcPr>
-            <w:tcW w:type="dxa" w:w="1170"/>
+            <w:tcW w:type="dxa" w:w="1134"/>
           </w:tcPr>
           <w:p>
             <w:pPr>
@@ -7236,7 +7254,7 @@
         </w:tc>
         <w:tc>
           <w:tcPr>
-            <w:tcW w:type="dxa" w:w="1024"/>
+            <w:tcW w:type="dxa" w:w="992"/>
           </w:tcPr>
           <w:p>
             <w:pPr>
@@ -7249,7 +7267,7 @@
         </w:tc>
         <w:tc>
           <w:tcPr>
-            <w:tcW w:type="dxa" w:w="878"/>
+            <w:tcW w:type="dxa" w:w="850"/>
           </w:tcPr>
           <w:p>
             <w:pPr>
@@ -7262,7 +7280,7 @@
         </w:tc>
         <w:tc>
           <w:tcPr>
-            <w:tcW w:type="dxa" w:w="2340"/>
+            <w:tcW w:type="dxa" w:w="2268"/>
           </w:tcPr>
           <w:p>
             <w:pPr>
@@ -13431,6 +13449,8 @@
       <w:footnotePr>
         <w:numRestart w:val="eachSect"/>
       </w:footnotePr>
+      <w:pgSz w:h="16838" w:w="11906"/>
+      <w:pgMar w:bottom="1417" w:left="1417" w:right="1417" w:top="1417"/>
       <w:lnNumType w:countBy="1" w:restart="continuous"/>
     </w:sectPr>
   </w:body>
@@ -13838,8 +13858,9 @@
     </w:pPr>
     <w:rPr>
       <w:rFonts w:ascii="Times New Roman" w:cs="Times New Roman" w:cstheme="majorBidi" w:eastAsia="Times New Roman" w:eastAsiaTheme="majorEastAsia" w:hAnsi="Times New Roman"/>
+      <w:b/>
       <w:spacing w:val="15"/>
-      <w:sz w:val="28"/>
+      <w:sz w:val="26"/>
       <w:szCs w:val="28"/>
     </w:rPr>
   </w:style>

</xml_diff>

<commit_message>
Data availability: the analysis repository is public at github.com/dryuemco/thermal-twin
The placeholder is replaced by the URL and the private-repository NEEDS AUTHOR
INPUT note is removed. manuscript.tex/.pdf and the .docx files rebuilt.
verify_tex all PASS; manuscript compiles with no errors or undefined references.
</commit_message>
<xml_diff>
--- a/paper/submission/manuscript.docx
+++ b/paper/submission/manuscript.docx
@@ -10954,7 +10954,7 @@
       </w:r>
     </w:p>
     <w:bookmarkEnd w:id="59"/>
-    <w:bookmarkStart w:id="68" w:name="declarations"/>
+    <w:bookmarkStart w:id="69" w:name="declarations"/>
     <w:p>
       <w:pPr>
         <w:pStyle w:val="Heading1"/>
@@ -10963,7 +10963,7 @@
         <w:t xml:space="preserve">Declarations</w:t>
       </w:r>
     </w:p>
-    <w:bookmarkStart w:id="61" w:name="data-and-code-availability"/>
+    <w:bookmarkStart w:id="62" w:name="data-and-code-availability"/>
     <w:p>
       <w:pPr>
         <w:pStyle w:val="Heading2"/>
@@ -11067,13 +11067,21 @@
         <w:pStyle w:val="BodyText"/>
       </w:pPr>
       <w:r>
-        <w:t xml:space="preserve">The analysis code, the frozen numeric outputs and the Supplementary Material are at [repository URL</w:t>
-      </w:r>
-      <w:r>
-        <w:t xml:space="preserve"> </w:t>
-      </w:r>
-      <w:r>
-        <w:t xml:space="preserve">to be added]. Figs. 1–8 and the graphical abstract are drawn by the scripts in</w:t>
+        <w:t xml:space="preserve">The analysis code, the frozen numeric outputs and the Supplementary Material are at</w:t>
+      </w:r>
+      <w:r>
+        <w:t xml:space="preserve"> </w:t>
+      </w:r>
+      <w:hyperlink r:id="rId61">
+        <w:r>
+          <w:rPr>
+            <w:rStyle w:val="Hyperlink"/>
+          </w:rPr>
+          <w:t xml:space="preserve">https://github.com/dryuemco/thermal-twin</w:t>
+        </w:r>
+      </w:hyperlink>
+      <w:r>
+        <w:t xml:space="preserve">. Figs. 1–8 and the graphical abstract are drawn by the scripts in</w:t>
       </w:r>
       <w:r>
         <w:t xml:space="preserve"> </w:t>
@@ -11160,8 +11168,8 @@
         <w:t xml:space="preserve">is about ±0.02 to 0.03 (Section S3.5(vi)).</w:t>
       </w:r>
     </w:p>
-    <w:bookmarkEnd w:id="61"/>
-    <w:bookmarkStart w:id="62" w:name="funding"/>
+    <w:bookmarkEnd w:id="62"/>
+    <w:bookmarkStart w:id="63" w:name="funding"/>
     <w:p>
       <w:pPr>
         <w:pStyle w:val="Heading2"/>
@@ -11217,8 +11225,8 @@
         <w:t xml:space="preserve">).</w:t>
       </w:r>
     </w:p>
-    <w:bookmarkEnd w:id="62"/>
-    <w:bookmarkStart w:id="63" w:name="acknowledgments"/>
+    <w:bookmarkEnd w:id="63"/>
+    <w:bookmarkStart w:id="64" w:name="acknowledgments"/>
     <w:p>
       <w:pPr>
         <w:pStyle w:val="Heading2"/>
@@ -11253,8 +11261,8 @@
         <w:t xml:space="preserve">possible.</w:t>
       </w:r>
     </w:p>
-    <w:bookmarkEnd w:id="63"/>
-    <w:bookmarkStart w:id="64" w:name="competing-interests"/>
+    <w:bookmarkEnd w:id="64"/>
+    <w:bookmarkStart w:id="65" w:name="competing-interests"/>
     <w:p>
       <w:pPr>
         <w:pStyle w:val="Heading2"/>
@@ -11271,8 +11279,8 @@
         <w:t xml:space="preserve">The authors declare no competing interests.</w:t>
       </w:r>
     </w:p>
-    <w:bookmarkEnd w:id="64"/>
-    <w:bookmarkStart w:id="65" w:name="ethics-approval"/>
+    <w:bookmarkEnd w:id="65"/>
+    <w:bookmarkStart w:id="66" w:name="ethics-approval"/>
     <w:p>
       <w:pPr>
         <w:pStyle w:val="Heading2"/>
@@ -11295,8 +11303,8 @@
         <w:t xml:space="preserve">identifiable data.</w:t>
       </w:r>
     </w:p>
-    <w:bookmarkEnd w:id="65"/>
-    <w:bookmarkStart w:id="66" w:name="author-contributions"/>
+    <w:bookmarkEnd w:id="66"/>
+    <w:bookmarkStart w:id="67" w:name="author-contributions"/>
     <w:p>
       <w:pPr>
         <w:pStyle w:val="Heading2"/>
@@ -11357,8 +11365,8 @@
         <w:t xml:space="preserve">analysis, Investigation, Writing – original draft, Writing – review and editing, Supervision.</w:t>
       </w:r>
     </w:p>
-    <w:bookmarkEnd w:id="66"/>
-    <w:bookmarkStart w:id="67" w:name="X1f74eb43af444059c7518034463b6c89b1cacf4"/>
+    <w:bookmarkEnd w:id="67"/>
+    <w:bookmarkStart w:id="68" w:name="X1f74eb43af444059c7518034463b6c89b1cacf4"/>
     <w:p>
       <w:pPr>
         <w:pStyle w:val="Heading2"/>
@@ -11399,9 +11407,9 @@
         <w:t xml:space="preserve">publication.</w:t>
       </w:r>
     </w:p>
-    <w:bookmarkEnd w:id="67"/>
     <w:bookmarkEnd w:id="68"/>
-    <w:bookmarkStart w:id="146" w:name="references"/>
+    <w:bookmarkEnd w:id="69"/>
+    <w:bookmarkStart w:id="147" w:name="references"/>
     <w:p>
       <w:pPr>
         <w:pStyle w:val="Heading1"/>
@@ -11410,8 +11418,8 @@
         <w:t xml:space="preserve">References</w:t>
       </w:r>
     </w:p>
-    <w:bookmarkStart w:id="145" w:name="refs"/>
-    <w:bookmarkStart w:id="70" w:name="ref-AlkanAkinci2023"/>
+    <w:bookmarkStart w:id="146" w:name="refs"/>
+    <w:bookmarkStart w:id="71" w:name="ref-AlkanAkinci2023"/>
     <w:p>
       <w:pPr>
         <w:pStyle w:val="Bibliography"/>
@@ -11449,7 +11457,7 @@
       <w:r>
         <w:t xml:space="preserve"> </w:t>
       </w:r>
-      <w:hyperlink r:id="rId69">
+      <w:hyperlink r:id="rId70">
         <w:r>
           <w:rPr>
             <w:rStyle w:val="Hyperlink"/>
@@ -11458,8 +11466,8 @@
         </w:r>
       </w:hyperlink>
     </w:p>
-    <w:bookmarkEnd w:id="70"/>
-    <w:bookmarkStart w:id="72" w:name="ref-Archibald2013"/>
+    <w:bookmarkEnd w:id="71"/>
+    <w:bookmarkStart w:id="73" w:name="ref-Archibald2013"/>
     <w:p>
       <w:pPr>
         <w:pStyle w:val="Bibliography"/>
@@ -11470,7 +11478,7 @@
       <w:r>
         <w:t xml:space="preserve"> </w:t>
       </w:r>
-      <w:hyperlink r:id="rId71">
+      <w:hyperlink r:id="rId72">
         <w:r>
           <w:rPr>
             <w:rStyle w:val="Hyperlink"/>
@@ -11479,8 +11487,8 @@
         </w:r>
       </w:hyperlink>
     </w:p>
-    <w:bookmarkEnd w:id="72"/>
-    <w:bookmarkStart w:id="74" w:name="ref-Barve2011"/>
+    <w:bookmarkEnd w:id="73"/>
+    <w:bookmarkStart w:id="75" w:name="ref-Barve2011"/>
     <w:p>
       <w:pPr>
         <w:pStyle w:val="Bibliography"/>
@@ -11491,7 +11499,7 @@
       <w:r>
         <w:t xml:space="preserve"> </w:t>
       </w:r>
-      <w:hyperlink r:id="rId73">
+      <w:hyperlink r:id="rId74">
         <w:r>
           <w:rPr>
             <w:rStyle w:val="Hyperlink"/>
@@ -11500,8 +11508,8 @@
         </w:r>
       </w:hyperlink>
     </w:p>
-    <w:bookmarkEnd w:id="74"/>
-    <w:bookmarkStart w:id="76" w:name="ref-Boschetti2019"/>
+    <w:bookmarkEnd w:id="75"/>
+    <w:bookmarkStart w:id="77" w:name="ref-Boschetti2019"/>
     <w:p>
       <w:pPr>
         <w:pStyle w:val="Bibliography"/>
@@ -11536,7 +11544,7 @@
       <w:r>
         <w:t xml:space="preserve"> </w:t>
       </w:r>
-      <w:hyperlink r:id="rId75">
+      <w:hyperlink r:id="rId76">
         <w:r>
           <w:rPr>
             <w:rStyle w:val="Hyperlink"/>
@@ -11545,8 +11553,8 @@
         </w:r>
       </w:hyperlink>
     </w:p>
-    <w:bookmarkEnd w:id="76"/>
-    <w:bookmarkStart w:id="78" w:name="ref-Breiman2001"/>
+    <w:bookmarkEnd w:id="77"/>
+    <w:bookmarkStart w:id="79" w:name="ref-Breiman2001"/>
     <w:p>
       <w:pPr>
         <w:pStyle w:val="Bibliography"/>
@@ -11557,7 +11565,7 @@
       <w:r>
         <w:t xml:space="preserve"> </w:t>
       </w:r>
-      <w:hyperlink r:id="rId77">
+      <w:hyperlink r:id="rId78">
         <w:r>
           <w:rPr>
             <w:rStyle w:val="Hyperlink"/>
@@ -11566,8 +11574,8 @@
         </w:r>
       </w:hyperlink>
     </w:p>
-    <w:bookmarkEnd w:id="78"/>
-    <w:bookmarkStart w:id="80" w:name="ref-Chuvieco2004"/>
+    <w:bookmarkEnd w:id="79"/>
+    <w:bookmarkStart w:id="81" w:name="ref-Chuvieco2004"/>
     <w:p>
       <w:pPr>
         <w:pStyle w:val="Bibliography"/>
@@ -11590,7 +11598,7 @@
       <w:r>
         <w:t xml:space="preserve"> </w:t>
       </w:r>
-      <w:hyperlink r:id="rId79">
+      <w:hyperlink r:id="rId80">
         <w:r>
           <w:rPr>
             <w:rStyle w:val="Hyperlink"/>
@@ -11599,8 +11607,8 @@
         </w:r>
       </w:hyperlink>
     </w:p>
-    <w:bookmarkEnd w:id="80"/>
-    <w:bookmarkStart w:id="82" w:name="ref-Dimarco2026"/>
+    <w:bookmarkEnd w:id="81"/>
+    <w:bookmarkStart w:id="83" w:name="ref-Dimarco2026"/>
     <w:p>
       <w:pPr>
         <w:pStyle w:val="Bibliography"/>
@@ -11623,7 +11631,7 @@
       <w:r>
         <w:t xml:space="preserve"> </w:t>
       </w:r>
-      <w:hyperlink r:id="rId81">
+      <w:hyperlink r:id="rId82">
         <w:r>
           <w:rPr>
             <w:rStyle w:val="Hyperlink"/>
@@ -11632,8 +11640,8 @@
         </w:r>
       </w:hyperlink>
     </w:p>
-    <w:bookmarkEnd w:id="82"/>
-    <w:bookmarkStart w:id="84" w:name="ref-Gelabert2025"/>
+    <w:bookmarkEnd w:id="83"/>
+    <w:bookmarkStart w:id="85" w:name="ref-Gelabert2025"/>
     <w:p>
       <w:pPr>
         <w:pStyle w:val="Bibliography"/>
@@ -11653,7 +11661,7 @@
       <w:r>
         <w:t xml:space="preserve"> </w:t>
       </w:r>
-      <w:hyperlink r:id="rId83">
+      <w:hyperlink r:id="rId84">
         <w:r>
           <w:rPr>
             <w:rStyle w:val="Hyperlink"/>
@@ -11662,8 +11670,8 @@
         </w:r>
       </w:hyperlink>
     </w:p>
-    <w:bookmarkEnd w:id="84"/>
-    <w:bookmarkStart w:id="86" w:name="ref-Giglio2018"/>
+    <w:bookmarkEnd w:id="85"/>
+    <w:bookmarkStart w:id="87" w:name="ref-Giglio2018"/>
     <w:p>
       <w:pPr>
         <w:pStyle w:val="Bibliography"/>
@@ -11698,7 +11706,7 @@
       <w:r>
         <w:t xml:space="preserve"> </w:t>
       </w:r>
-      <w:hyperlink r:id="rId85">
+      <w:hyperlink r:id="rId86">
         <w:r>
           <w:rPr>
             <w:rStyle w:val="Hyperlink"/>
@@ -11707,8 +11715,8 @@
         </w:r>
       </w:hyperlink>
     </w:p>
-    <w:bookmarkEnd w:id="86"/>
-    <w:bookmarkStart w:id="88" w:name="ref-Gorelick2017"/>
+    <w:bookmarkEnd w:id="87"/>
+    <w:bookmarkStart w:id="89" w:name="ref-Gorelick2017"/>
     <w:p>
       <w:pPr>
         <w:pStyle w:val="Bibliography"/>
@@ -11740,7 +11748,7 @@
       <w:r>
         <w:t xml:space="preserve"> </w:t>
       </w:r>
-      <w:hyperlink r:id="rId87">
+      <w:hyperlink r:id="rId88">
         <w:r>
           <w:rPr>
             <w:rStyle w:val="Hyperlink"/>
@@ -11749,8 +11757,8 @@
         </w:r>
       </w:hyperlink>
     </w:p>
-    <w:bookmarkEnd w:id="88"/>
-    <w:bookmarkStart w:id="90" w:name="ref-Huang2026"/>
+    <w:bookmarkEnd w:id="89"/>
+    <w:bookmarkStart w:id="91" w:name="ref-Huang2026"/>
     <w:p>
       <w:pPr>
         <w:pStyle w:val="Bibliography"/>
@@ -11761,7 +11769,7 @@
       <w:r>
         <w:t xml:space="preserve"> </w:t>
       </w:r>
-      <w:hyperlink r:id="rId89">
+      <w:hyperlink r:id="rId90">
         <w:r>
           <w:rPr>
             <w:rStyle w:val="Hyperlink"/>
@@ -11770,8 +11778,8 @@
         </w:r>
       </w:hyperlink>
     </w:p>
-    <w:bookmarkEnd w:id="90"/>
-    <w:bookmarkStart w:id="92" w:name="ref-Iban2022"/>
+    <w:bookmarkEnd w:id="91"/>
+    <w:bookmarkStart w:id="93" w:name="ref-Iban2022"/>
     <w:p>
       <w:pPr>
         <w:pStyle w:val="Bibliography"/>
@@ -11824,7 +11832,7 @@
       <w:r>
         <w:t xml:space="preserve"> </w:t>
       </w:r>
-      <w:hyperlink r:id="rId91">
+      <w:hyperlink r:id="rId92">
         <w:r>
           <w:rPr>
             <w:rStyle w:val="Hyperlink"/>
@@ -11833,8 +11841,8 @@
         </w:r>
       </w:hyperlink>
     </w:p>
-    <w:bookmarkEnd w:id="92"/>
-    <w:bookmarkStart w:id="94" w:name="ref-Jodhani2026"/>
+    <w:bookmarkEnd w:id="93"/>
+    <w:bookmarkStart w:id="95" w:name="ref-Jodhani2026"/>
     <w:p>
       <w:pPr>
         <w:pStyle w:val="Bibliography"/>
@@ -11845,7 +11853,7 @@
       <w:r>
         <w:t xml:space="preserve"> </w:t>
       </w:r>
-      <w:hyperlink r:id="rId93">
+      <w:hyperlink r:id="rId94">
         <w:r>
           <w:rPr>
             <w:rStyle w:val="Hyperlink"/>
@@ -11854,8 +11862,8 @@
         </w:r>
       </w:hyperlink>
     </w:p>
-    <w:bookmarkEnd w:id="94"/>
-    <w:bookmarkStart w:id="96" w:name="ref-Kondylatos2023"/>
+    <w:bookmarkEnd w:id="95"/>
+    <w:bookmarkStart w:id="97" w:name="ref-Kondylatos2023"/>
     <w:p>
       <w:pPr>
         <w:pStyle w:val="Bibliography"/>
@@ -11884,7 +11892,7 @@
       <w:r>
         <w:t xml:space="preserve"> </w:t>
       </w:r>
-      <w:hyperlink r:id="rId95">
+      <w:hyperlink r:id="rId96">
         <w:r>
           <w:rPr>
             <w:rStyle w:val="Hyperlink"/>
@@ -11893,8 +11901,8 @@
         </w:r>
       </w:hyperlink>
     </w:p>
-    <w:bookmarkEnd w:id="96"/>
-    <w:bookmarkStart w:id="98" w:name="ref-Liu2025"/>
+    <w:bookmarkEnd w:id="97"/>
+    <w:bookmarkStart w:id="99" w:name="ref-Liu2025"/>
     <w:p>
       <w:pPr>
         <w:pStyle w:val="Bibliography"/>
@@ -11914,7 +11922,7 @@
       <w:r>
         <w:t xml:space="preserve"> </w:t>
       </w:r>
-      <w:hyperlink r:id="rId97">
+      <w:hyperlink r:id="rId98">
         <w:r>
           <w:rPr>
             <w:rStyle w:val="Hyperlink"/>
@@ -11923,8 +11931,8 @@
         </w:r>
       </w:hyperlink>
     </w:p>
-    <w:bookmarkEnd w:id="98"/>
-    <w:bookmarkStart w:id="100" w:name="ref-Lobo2008"/>
+    <w:bookmarkEnd w:id="99"/>
+    <w:bookmarkStart w:id="101" w:name="ref-Lobo2008"/>
     <w:p>
       <w:pPr>
         <w:pStyle w:val="Bibliography"/>
@@ -11944,7 +11952,7 @@
       <w:r>
         <w:t xml:space="preserve"> </w:t>
       </w:r>
-      <w:hyperlink r:id="rId99">
+      <w:hyperlink r:id="rId100">
         <w:r>
           <w:rPr>
             <w:rStyle w:val="Hyperlink"/>
@@ -11953,8 +11961,8 @@
         </w:r>
       </w:hyperlink>
     </w:p>
-    <w:bookmarkEnd w:id="100"/>
-    <w:bookmarkStart w:id="102" w:name="ref-Maffei2018"/>
+    <w:bookmarkEnd w:id="101"/>
+    <w:bookmarkStart w:id="103" w:name="ref-Maffei2018"/>
     <w:p>
       <w:pPr>
         <w:pStyle w:val="Bibliography"/>
@@ -11965,7 +11973,7 @@
       <w:r>
         <w:t xml:space="preserve"> </w:t>
       </w:r>
-      <w:hyperlink r:id="rId101">
+      <w:hyperlink r:id="rId102">
         <w:r>
           <w:rPr>
             <w:rStyle w:val="Hyperlink"/>
@@ -11974,8 +11982,8 @@
         </w:r>
       </w:hyperlink>
     </w:p>
-    <w:bookmarkEnd w:id="102"/>
-    <w:bookmarkStart w:id="104" w:name="ref-Maffei2021"/>
+    <w:bookmarkEnd w:id="103"/>
+    <w:bookmarkStart w:id="105" w:name="ref-Maffei2021"/>
     <w:p>
       <w:pPr>
         <w:pStyle w:val="Bibliography"/>
@@ -11986,7 +11994,7 @@
       <w:r>
         <w:t xml:space="preserve"> </w:t>
       </w:r>
-      <w:hyperlink r:id="rId103">
+      <w:hyperlink r:id="rId104">
         <w:r>
           <w:rPr>
             <w:rStyle w:val="Hyperlink"/>
@@ -11995,8 +12003,8 @@
         </w:r>
       </w:hyperlink>
     </w:p>
-    <w:bookmarkEnd w:id="104"/>
-    <w:bookmarkStart w:id="106" w:name="ref-MaffeiMenenti2019"/>
+    <w:bookmarkEnd w:id="105"/>
+    <w:bookmarkStart w:id="107" w:name="ref-MaffeiMenenti2019"/>
     <w:p>
       <w:pPr>
         <w:pStyle w:val="Bibliography"/>
@@ -12007,7 +12015,7 @@
       <w:r>
         <w:t xml:space="preserve"> </w:t>
       </w:r>
-      <w:hyperlink r:id="rId105">
+      <w:hyperlink r:id="rId106">
         <w:r>
           <w:rPr>
             <w:rStyle w:val="Hyperlink"/>
@@ -12016,8 +12024,8 @@
         </w:r>
       </w:hyperlink>
     </w:p>
-    <w:bookmarkEnd w:id="106"/>
-    <w:bookmarkStart w:id="108" w:name="ref-Meyer2018"/>
+    <w:bookmarkEnd w:id="107"/>
+    <w:bookmarkStart w:id="109" w:name="ref-Meyer2018"/>
     <w:p>
       <w:pPr>
         <w:pStyle w:val="Bibliography"/>
@@ -12028,7 +12036,7 @@
       <w:r>
         <w:t xml:space="preserve"> </w:t>
       </w:r>
-      <w:hyperlink r:id="rId107">
+      <w:hyperlink r:id="rId108">
         <w:r>
           <w:rPr>
             <w:rStyle w:val="Hyperlink"/>
@@ -12037,8 +12045,8 @@
         </w:r>
       </w:hyperlink>
     </w:p>
-    <w:bookmarkEnd w:id="108"/>
-    <w:bookmarkStart w:id="110" w:name="ref-MorenoTorres2012"/>
+    <w:bookmarkEnd w:id="109"/>
+    <w:bookmarkStart w:id="111" w:name="ref-MorenoTorres2012"/>
     <w:p>
       <w:pPr>
         <w:pStyle w:val="Bibliography"/>
@@ -12049,7 +12057,7 @@
       <w:r>
         <w:t xml:space="preserve"> </w:t>
       </w:r>
-      <w:hyperlink r:id="rId109">
+      <w:hyperlink r:id="rId110">
         <w:r>
           <w:rPr>
             <w:rStyle w:val="Hyperlink"/>
@@ -12058,8 +12066,8 @@
         </w:r>
       </w:hyperlink>
     </w:p>
-    <w:bookmarkEnd w:id="110"/>
-    <w:bookmarkStart w:id="112" w:name="ref-MunozSabater2021"/>
+    <w:bookmarkEnd w:id="111"/>
+    <w:bookmarkStart w:id="113" w:name="ref-MunozSabater2021"/>
     <w:p>
       <w:pPr>
         <w:pStyle w:val="Bibliography"/>
@@ -12079,7 +12087,7 @@
       <w:r>
         <w:t xml:space="preserve"> </w:t>
       </w:r>
-      <w:hyperlink r:id="rId111">
+      <w:hyperlink r:id="rId112">
         <w:r>
           <w:rPr>
             <w:rStyle w:val="Hyperlink"/>
@@ -12088,8 +12096,8 @@
         </w:r>
       </w:hyperlink>
     </w:p>
-    <w:bookmarkEnd w:id="112"/>
-    <w:bookmarkStart w:id="114" w:name="ref-Pausas2021"/>
+    <w:bookmarkEnd w:id="113"/>
+    <w:bookmarkStart w:id="115" w:name="ref-Pausas2021"/>
     <w:p>
       <w:pPr>
         <w:pStyle w:val="Bibliography"/>
@@ -12100,7 +12108,7 @@
       <w:r>
         <w:t xml:space="preserve"> </w:t>
       </w:r>
-      <w:hyperlink r:id="rId113">
+      <w:hyperlink r:id="rId114">
         <w:r>
           <w:rPr>
             <w:rStyle w:val="Hyperlink"/>
@@ -12109,8 +12117,8 @@
         </w:r>
       </w:hyperlink>
     </w:p>
-    <w:bookmarkEnd w:id="114"/>
-    <w:bookmarkStart w:id="116" w:name="ref-Persello2012"/>
+    <w:bookmarkEnd w:id="115"/>
+    <w:bookmarkStart w:id="117" w:name="ref-Persello2012"/>
     <w:p>
       <w:pPr>
         <w:pStyle w:val="Bibliography"/>
@@ -12121,7 +12129,7 @@
       <w:r>
         <w:t xml:space="preserve"> </w:t>
       </w:r>
-      <w:hyperlink r:id="rId115">
+      <w:hyperlink r:id="rId116">
         <w:r>
           <w:rPr>
             <w:rStyle w:val="Hyperlink"/>
@@ -12130,8 +12138,8 @@
         </w:r>
       </w:hyperlink>
     </w:p>
-    <w:bookmarkEnd w:id="116"/>
-    <w:bookmarkStart w:id="118" w:name="ref-Ploton2020"/>
+    <w:bookmarkEnd w:id="117"/>
+    <w:bookmarkStart w:id="119" w:name="ref-Ploton2020"/>
     <w:p>
       <w:pPr>
         <w:pStyle w:val="Bibliography"/>
@@ -12142,7 +12150,7 @@
       <w:r>
         <w:t xml:space="preserve"> </w:t>
       </w:r>
-      <w:hyperlink r:id="rId117">
+      <w:hyperlink r:id="rId118">
         <w:r>
           <w:rPr>
             <w:rStyle w:val="Hyperlink"/>
@@ -12151,8 +12159,8 @@
         </w:r>
       </w:hyperlink>
     </w:p>
-    <w:bookmarkEnd w:id="118"/>
-    <w:bookmarkStart w:id="120" w:name="ref-Podschwit2022"/>
+    <w:bookmarkEnd w:id="119"/>
+    <w:bookmarkStart w:id="121" w:name="ref-Podschwit2022"/>
     <w:p>
       <w:pPr>
         <w:pStyle w:val="Bibliography"/>
@@ -12175,7 +12183,7 @@
       <w:r>
         <w:t xml:space="preserve"> </w:t>
       </w:r>
-      <w:hyperlink r:id="rId119">
+      <w:hyperlink r:id="rId120">
         <w:r>
           <w:rPr>
             <w:rStyle w:val="Hyperlink"/>
@@ -12184,8 +12192,8 @@
         </w:r>
       </w:hyperlink>
     </w:p>
-    <w:bookmarkEnd w:id="120"/>
-    <w:bookmarkStart w:id="122" w:name="ref-Roberts2017"/>
+    <w:bookmarkEnd w:id="121"/>
+    <w:bookmarkStart w:id="123" w:name="ref-Roberts2017"/>
     <w:p>
       <w:pPr>
         <w:pStyle w:val="Bibliography"/>
@@ -12196,7 +12204,7 @@
       <w:r>
         <w:t xml:space="preserve"> </w:t>
       </w:r>
-      <w:hyperlink r:id="rId121">
+      <w:hyperlink r:id="rId122">
         <w:r>
           <w:rPr>
             <w:rStyle w:val="Hyperlink"/>
@@ -12205,8 +12213,8 @@
         </w:r>
       </w:hyperlink>
     </w:p>
-    <w:bookmarkEnd w:id="122"/>
-    <w:bookmarkStart w:id="124" w:name="ref-Rousseau2022"/>
+    <w:bookmarkEnd w:id="123"/>
+    <w:bookmarkStart w:id="125" w:name="ref-Rousseau2022"/>
     <w:p>
       <w:pPr>
         <w:pStyle w:val="Bibliography"/>
@@ -12217,7 +12225,7 @@
       <w:r>
         <w:t xml:space="preserve"> </w:t>
       </w:r>
-      <w:hyperlink r:id="rId123">
+      <w:hyperlink r:id="rId124">
         <w:r>
           <w:rPr>
             <w:rStyle w:val="Hyperlink"/>
@@ -12226,8 +12234,8 @@
         </w:r>
       </w:hyperlink>
     </w:p>
-    <w:bookmarkEnd w:id="124"/>
-    <w:bookmarkStart w:id="126" w:name="ref-Sandholt2002"/>
+    <w:bookmarkEnd w:id="125"/>
+    <w:bookmarkStart w:id="127" w:name="ref-Sandholt2002"/>
     <w:p>
       <w:pPr>
         <w:pStyle w:val="Bibliography"/>
@@ -12238,7 +12246,7 @@
       <w:r>
         <w:t xml:space="preserve"> </w:t>
       </w:r>
-      <w:hyperlink r:id="rId125">
+      <w:hyperlink r:id="rId126">
         <w:r>
           <w:rPr>
             <w:rStyle w:val="Hyperlink"/>
@@ -12247,8 +12255,8 @@
         </w:r>
       </w:hyperlink>
     </w:p>
-    <w:bookmarkEnd w:id="126"/>
-    <w:bookmarkStart w:id="128" w:name="ref-Sun2016"/>
+    <w:bookmarkEnd w:id="127"/>
+    <w:bookmarkStart w:id="129" w:name="ref-Sun2016"/>
     <w:p>
       <w:pPr>
         <w:pStyle w:val="Bibliography"/>
@@ -12277,7 +12285,7 @@
       <w:r>
         <w:t xml:space="preserve"> </w:t>
       </w:r>
-      <w:hyperlink r:id="rId127">
+      <w:hyperlink r:id="rId128">
         <w:r>
           <w:rPr>
             <w:rStyle w:val="Hyperlink"/>
@@ -12286,8 +12294,8 @@
         </w:r>
       </w:hyperlink>
     </w:p>
-    <w:bookmarkEnd w:id="128"/>
-    <w:bookmarkStart w:id="130" w:name="ref-Tuia2016"/>
+    <w:bookmarkEnd w:id="129"/>
+    <w:bookmarkStart w:id="131" w:name="ref-Tuia2016"/>
     <w:p>
       <w:pPr>
         <w:pStyle w:val="Bibliography"/>
@@ -12298,7 +12306,7 @@
       <w:r>
         <w:t xml:space="preserve"> </w:t>
       </w:r>
-      <w:hyperlink r:id="rId129">
+      <w:hyperlink r:id="rId130">
         <w:r>
           <w:rPr>
             <w:rStyle w:val="Hyperlink"/>
@@ -12307,8 +12315,8 @@
         </w:r>
       </w:hyperlink>
     </w:p>
-    <w:bookmarkEnd w:id="130"/>
-    <w:bookmarkStart w:id="132" w:name="ref-Valavi2019"/>
+    <w:bookmarkEnd w:id="131"/>
+    <w:bookmarkStart w:id="133" w:name="ref-Valavi2019"/>
     <w:p>
       <w:pPr>
         <w:pStyle w:val="Bibliography"/>
@@ -12340,7 +12348,7 @@
       <w:r>
         <w:t xml:space="preserve"> </w:t>
       </w:r>
-      <w:hyperlink r:id="rId131">
+      <w:hyperlink r:id="rId132">
         <w:r>
           <w:rPr>
             <w:rStyle w:val="Hyperlink"/>
@@ -12349,8 +12357,8 @@
         </w:r>
       </w:hyperlink>
     </w:p>
-    <w:bookmarkEnd w:id="132"/>
-    <w:bookmarkStart w:id="134" w:name="ref-VanDerWal2009"/>
+    <w:bookmarkEnd w:id="133"/>
+    <w:bookmarkStart w:id="135" w:name="ref-VanDerWal2009"/>
     <w:p>
       <w:pPr>
         <w:pStyle w:val="Bibliography"/>
@@ -12361,7 +12369,7 @@
       <w:r>
         <w:t xml:space="preserve"> </w:t>
       </w:r>
-      <w:hyperlink r:id="rId133">
+      <w:hyperlink r:id="rId134">
         <w:r>
           <w:rPr>
             <w:rStyle w:val="Hyperlink"/>
@@ -12370,8 +12378,8 @@
         </w:r>
       </w:hyperlink>
     </w:p>
-    <w:bookmarkEnd w:id="134"/>
-    <w:bookmarkStart w:id="136" w:name="ref-Vesk2021"/>
+    <w:bookmarkEnd w:id="135"/>
+    <w:bookmarkStart w:id="137" w:name="ref-Vesk2021"/>
     <w:p>
       <w:pPr>
         <w:pStyle w:val="Bibliography"/>
@@ -12382,7 +12390,7 @@
       <w:r>
         <w:t xml:space="preserve"> </w:t>
       </w:r>
-      <w:hyperlink r:id="rId135">
+      <w:hyperlink r:id="rId136">
         <w:r>
           <w:rPr>
             <w:rStyle w:val="Hyperlink"/>
@@ -12391,8 +12399,8 @@
         </w:r>
       </w:hyperlink>
     </w:p>
-    <w:bookmarkEnd w:id="136"/>
-    <w:bookmarkStart w:id="138" w:name="ref-Vibhandik2026"/>
+    <w:bookmarkEnd w:id="137"/>
+    <w:bookmarkStart w:id="139" w:name="ref-Vibhandik2026"/>
     <w:p>
       <w:pPr>
         <w:pStyle w:val="Bibliography"/>
@@ -12403,7 +12411,7 @@
       <w:r>
         <w:t xml:space="preserve"> </w:t>
       </w:r>
-      <w:hyperlink r:id="rId137">
+      <w:hyperlink r:id="rId138">
         <w:r>
           <w:rPr>
             <w:rStyle w:val="Hyperlink"/>
@@ -12412,8 +12420,8 @@
         </w:r>
       </w:hyperlink>
     </w:p>
-    <w:bookmarkEnd w:id="138"/>
-    <w:bookmarkStart w:id="140" w:name="ref-Xu2026"/>
+    <w:bookmarkEnd w:id="139"/>
+    <w:bookmarkStart w:id="141" w:name="ref-Xu2026"/>
     <w:p>
       <w:pPr>
         <w:pStyle w:val="Bibliography"/>
@@ -12424,7 +12432,7 @@
       <w:r>
         <w:t xml:space="preserve"> </w:t>
       </w:r>
-      <w:hyperlink r:id="rId139">
+      <w:hyperlink r:id="rId140">
         <w:r>
           <w:rPr>
             <w:rStyle w:val="Hyperlink"/>
@@ -12433,8 +12441,8 @@
         </w:r>
       </w:hyperlink>
     </w:p>
-    <w:bookmarkEnd w:id="140"/>
-    <w:bookmarkStart w:id="142" w:name="ref-Yebra2013"/>
+    <w:bookmarkEnd w:id="141"/>
+    <w:bookmarkStart w:id="143" w:name="ref-Yebra2013"/>
     <w:p>
       <w:pPr>
         <w:pStyle w:val="Bibliography"/>
@@ -12445,7 +12453,7 @@
       <w:r>
         <w:t xml:space="preserve"> </w:t>
       </w:r>
-      <w:hyperlink r:id="rId141">
+      <w:hyperlink r:id="rId142">
         <w:r>
           <w:rPr>
             <w:rStyle w:val="Hyperlink"/>
@@ -12454,8 +12462,8 @@
         </w:r>
       </w:hyperlink>
     </w:p>
-    <w:bookmarkEnd w:id="142"/>
-    <w:bookmarkStart w:id="144" w:name="ref-Zanaga2022"/>
+    <w:bookmarkEnd w:id="143"/>
+    <w:bookmarkStart w:id="145" w:name="ref-Zanaga2022"/>
     <w:p>
       <w:pPr>
         <w:pStyle w:val="Bibliography"/>
@@ -12484,7 +12492,7 @@
       <w:r>
         <w:t xml:space="preserve"> </w:t>
       </w:r>
-      <w:hyperlink r:id="rId143">
+      <w:hyperlink r:id="rId144">
         <w:r>
           <w:rPr>
             <w:rStyle w:val="Hyperlink"/>
@@ -12493,10 +12501,10 @@
         </w:r>
       </w:hyperlink>
     </w:p>
-    <w:bookmarkEnd w:id="144"/>
     <w:bookmarkEnd w:id="145"/>
     <w:bookmarkEnd w:id="146"/>
-    <w:bookmarkStart w:id="147" w:name="figure-captions"/>
+    <w:bookmarkEnd w:id="147"/>
+    <w:bookmarkStart w:id="148" w:name="figure-captions"/>
     <w:p>
       <w:pPr>
         <w:pStyle w:val="Heading1"/>
@@ -13443,7 +13451,7 @@
         <w:t xml:space="preserve">Manavgat stays interval-supported, which is why the contrast is stated at the point estimates. Manavgat values are on the corrected label (Section 3.2).</w:t>
       </w:r>
     </w:p>
-    <w:bookmarkEnd w:id="147"/>
+    <w:bookmarkEnd w:id="148"/>
     <w:sectPr>
       <w:footerReference r:id="rId9" w:type="default"/>
       <w:footnotePr>

</xml_diff>

<commit_message>
README, MIT licence, and the five frozen step8a datasets for a runnable clone
- README.md: study, the five regions and the main findings, Fig. 8 and Fig. 4
  previews, layout (labelfix_rerun marked as internal working notes for the
  data and the pipeline at 6381f4c, citation, funding, acknowledgments, AI
  assistance, licence.
- LICENSE: MIT, Yunus Emre Cogurcu and Emrehan Metin.
- paper/data/<region>/step8a_500m_modeling_dataset.parquet for Manavgat,
  Bejis, Mugla, Evia (extended) and Montiferru, copied from the frozen export;
  each SHA-256 equals the pipeline's record (27 MB in total).
- _canonical.py reads them by default; THERMAL_TWIN_DATA still selects a
  pipeline output tree. The local default path is gone.
- Data availability names the modelling datasets among what the repository holds.

With THERMAL_TWIN_DATA unset: appendix_tables 16/16 and 49 sources, check_all
10/10, verify_tex all PASS; manuscript compiles with no errors.
</commit_message>
<xml_diff>
--- a/paper/submission/manuscript.docx
+++ b/paper/submission/manuscript.docx
@@ -11067,7 +11067,13 @@
         <w:pStyle w:val="BodyText"/>
       </w:pPr>
       <w:r>
-        <w:t xml:space="preserve">The analysis code, the frozen numeric outputs and the Supplementary Material are at</w:t>
+        <w:t xml:space="preserve">The analysis code, the five modelling datasets, the frozen numeric outputs and the Supplementary</w:t>
+      </w:r>
+      <w:r>
+        <w:t xml:space="preserve"> </w:t>
+      </w:r>
+      <w:r>
+        <w:t xml:space="preserve">Material are at</w:t>
       </w:r>
       <w:r>
         <w:t xml:space="preserve"> </w:t>

</xml_diff>

<commit_message>
Main text under 10,000 words; highlights.tex is the highlights source
- Five repeated or signposting sentences removed, 69 rendered words: the
  opening of 1.3 and of 5.1, "The 20-cell row is indicative (above)" in
  Table 1's note (stated in 4.2), and two Conclusions sentences stated in 4.3
  and 4.5. No claim or number changes; 5.1's first sentence now names "the
  first finding". Word count on the title page: 9,966.
- paper/highlights.tex is the highlights source and a submission file of its
  own; highlights.md moves to paper/archive/. build_tex.mjs and the graphical
  abstract's assert read the .tex; build_docx.py copies it to submission/.
  build_tex's header comment names Ecological Informatics.

check_all 10/10; verify_tex all PASS; both LaTeX documents compile cleanly.
</commit_message>
<xml_diff>
--- a/paper/submission/manuscript.docx
+++ b/paper/submission/manuscript.docx
@@ -82,7 +82,7 @@
         <w:t xml:space="preserve"> </w:t>
       </w:r>
       <w:r>
-        <w:t xml:space="preserve">10,035 words in the main text, excluding references, tables, figure captions and declarations.</w:t>
+        <w:t xml:space="preserve">9,966 words in the main text, excluding references, tables, figure captions and declarations.</w:t>
       </w:r>
     </w:p>
     <w:bookmarkStart w:id="18" w:name="abstract"/>
@@ -470,20 +470,6 @@
     <w:p>
       <w:pPr>
         <w:pStyle w:val="FirstParagraph"/>
-      </w:pPr>
-      <w:r>
-        <w:t xml:space="preserve">Three findings carry this paper, stated here as claims and established in Section 4, which carries</w:t>
-      </w:r>
-      <w:r>
-        <w:t xml:space="preserve"> </w:t>
-      </w:r>
-      <w:r>
-        <w:t xml:space="preserve">every interval.</w:t>
-      </w:r>
-    </w:p>
-    <w:p>
-      <w:pPr>
-        <w:pStyle w:val="BodyText"/>
       </w:pPr>
       <w:r>
         <w:rPr>
@@ -7308,7 +7294,7 @@
         <w:t xml:space="preserve"> </w:t>
       </w:r>
       <w:r>
-        <w:t xml:space="preserve">The 20-cell row is indicative (above). The 10-cell row, with 16</w:t>
+        <w:t xml:space="preserve">The 10-cell row, with 16</w:t>
       </w:r>
       <w:r>
         <w:t xml:space="preserve"> </w:t>
@@ -9292,13 +9278,7 @@
         <w:pStyle w:val="FirstParagraph"/>
       </w:pPr>
       <w:r>
-        <w:t xml:space="preserve">Section 1.3 states the three findings and Section 4 establishes them; this section argues from them.</w:t>
-      </w:r>
-      <w:r>
-        <w:t xml:space="preserve"> </w:t>
-      </w:r>
-      <w:r>
-        <w:t xml:space="preserve">The first is not a caveat attached to the</w:t>
+        <w:t xml:space="preserve">The first finding is not a caveat attached to the</w:t>
       </w:r>
       <w:r>
         <w:t xml:space="preserve"> </w:t>
@@ -10684,13 +10664,7 @@
         <w:t xml:space="preserve"> </w:t>
       </w:r>
       <w:r>
-        <w:t xml:space="preserve">negative pool rather than class balance. That is the size of the predictor-block increments this</w:t>
-      </w:r>
-      <w:r>
-        <w:t xml:space="preserve"> </w:t>
-      </w:r>
-      <w:r>
-        <w:t xml:space="preserve">design itself measures. A region-wide validation figure should therefore be read as an upper bound</w:t>
+        <w:t xml:space="preserve">negative pool rather than class balance. A region-wide validation figure should therefore be read as an upper bound</w:t>
       </w:r>
       <w:r>
         <w:t xml:space="preserve"> </w:t>
@@ -10796,13 +10770,7 @@
         <w:t xml:space="preserve"> </w:t>
       </w:r>
       <w:r>
-        <w:t xml:space="preserve">by pair. The static baseline transfers no better on either frame, so this is not a peculiarity of</w:t>
-      </w:r>
-      <w:r>
-        <w:t xml:space="preserve"> </w:t>
-      </w:r>
-      <w:r>
-        <w:t xml:space="preserve">thermal predictors. Label-free alignment compresses most directions towards chance rather than</w:t>
+        <w:t xml:space="preserve">by pair. Label-free alignment compresses most directions towards chance rather than</w:t>
       </w:r>
       <w:r>
         <w:t xml:space="preserve"> </w:t>

</xml_diff>

<commit_message>
Revision round B: seed replication, CORAL variants and placebo, permutation tests, stratified intervals, capture metric, Bejís pre-label check; round 7 runs from released files
</commit_message>
<xml_diff>
--- a/paper/submission/manuscript.docx
+++ b/paper/submission/manuscript.docx
@@ -96,7 +96,7 @@
         <w:t xml:space="preserve"> </w:t>
       </w:r>
       <w:r>
-        <w:t xml:space="preserve">8,233 words in the main text (Sections 1 to 6, table captions and notes included; tables, references, declarations and figure captions excluded). Abstract 250 words.</w:t>
+        <w:t xml:space="preserve">8,422 words in the main text (Sections 1 to 6, table captions and notes included; tables, references, declarations and figure captions excluded). Abstract 250 words.</w:t>
       </w:r>
     </w:p>
     <w:bookmarkStart w:id="18" w:name="abstract"/>
@@ -5260,7 +5260,13 @@
         <w:t xml:space="preserve"> </w:t>
       </w:r>
       <w:r>
-        <w:t xml:space="preserve">direction-level intervals are conditional on one fitted source model. Across five bootstrap seeds,</w:t>
+        <w:t xml:space="preserve">direction-level intervals are conditional on one fitted source model. Refitting with ten seeds,</w:t>
+      </w:r>
+      <w:r>
+        <w:t xml:space="preserve"> </w:t>
+      </w:r>
+      <w:r>
+        <w:t xml:space="preserve">however, changed mean transfer by at most 0.003 (Section S1.23). Across five bootstrap seeds,</w:t>
       </w:r>
       <w:r>
         <w:t xml:space="preserve"> </w:t>
@@ -8897,19 +8903,19 @@
         <w:t xml:space="preserve"> </w:t>
       </w:r>
       <w:r>
-        <w:t xml:space="preserve">zero: clustering by target region and clustering by source region (Section S1.22). In an exploratory</w:t>
-      </w:r>
-      <w:r>
-        <w:t xml:space="preserve"> </w:t>
-      </w:r>
-      <w:r>
-        <w:t xml:space="preserve">equivalence test with a margin of ±0.05, set after the results, the collar gain was within the margin</w:t>
-      </w:r>
-      <w:r>
-        <w:t xml:space="preserve"> </w:t>
-      </w:r>
-      <w:r>
-        <w:t xml:space="preserve">under four of six units. It was not within the margin under the pigeonhole bootstrap or the region</w:t>
+        <w:t xml:space="preserve">zero: clustering by target region and clustering by source region (Section S1.22). In an exploratory equivalence test with a margin of ±0.05, set after the results, the gain on the</w:t>
+      </w:r>
+      <w:r>
+        <w:t xml:space="preserve"> </w:t>
+      </w:r>
+      <w:r>
+        <w:t xml:space="preserve">original study areas was within the margin under all six units that can be computed, and the collar</w:t>
+      </w:r>
+      <w:r>
+        <w:t xml:space="preserve"> </w:t>
+      </w:r>
+      <w:r>
+        <w:t xml:space="preserve">gain under four of six. It was not within the margin under the pigeonhole bootstrap or the region</w:t>
       </w:r>
       <w:r>
         <w:t xml:space="preserve"> </w:t>
@@ -9073,19 +9079,25 @@
         <w:t xml:space="preserve"> </w:t>
       </w:r>
       <w:r>
-        <w:t xml:space="preserve">low-lying. When elevation is held constant through deciles, the Manavgat LST association falls to</w:t>
-      </w:r>
-      <w:r>
-        <w:t xml:space="preserve"> </w:t>
-      </w:r>
-      <w:r>
-        <w:t xml:space="preserve">0.455 on the original area and 0.403 on the collar. After the linear effect of elevation is removed,</w:t>
-      </w:r>
-      <w:r>
-        <w:t xml:space="preserve"> </w:t>
-      </w:r>
-      <w:r>
-        <w:t xml:space="preserve">it is 0.446 and 0.409 (Section S1.11). These stratified values are point estimates. Together, they</w:t>
+        <w:t xml:space="preserve">low-lying. When elevation is held constant through deciles, the Manavgat LST association falls to 0.403</w:t>
+      </w:r>
+      <w:r>
+        <w:t xml:space="preserve"> </w:t>
+      </w:r>
+      <w:r>
+        <w:t xml:space="preserve">[0.343, 0.464] on the collar, and after the linear effect of elevation is removed it is 0.409 [0.350,</w:t>
+      </w:r>
+      <w:r>
+        <w:t xml:space="preserve"> </w:t>
+      </w:r>
+      <w:r>
+        <w:t xml:space="preserve">0.475]. On the original area the same values are 0.455 and 0.446, with intervals that include 0.5</w:t>
+      </w:r>
+      <w:r>
+        <w:t xml:space="preserve"> </w:t>
+      </w:r>
+      <w:r>
+        <w:t xml:space="preserve">(Sections S1.11 and S1.23). These results</w:t>
       </w:r>
       <w:r>
         <w:t xml:space="preserve"> </w:t>
@@ -9315,7 +9327,13 @@
         <w:t xml:space="preserve"> </w:t>
       </w:r>
       <w:r>
-        <w:t xml:space="preserve">targets.</w:t>
+        <w:t xml:space="preserve">targets. Without the eight directions that involve Manavgat, mean transfer was 0.566, which is still</w:t>
+      </w:r>
+      <w:r>
+        <w:t xml:space="preserve"> </w:t>
+      </w:r>
+      <w:r>
+        <w:t xml:space="preserve">far below within-region skill (Section S1.23).</w:t>
       </w:r>
     </w:p>
     <w:p>
@@ -9366,13 +9384,25 @@
         <w:t xml:space="preserve"> </w:t>
       </w:r>
       <w:r>
-        <w:t xml:space="preserve">0.070 to 0.287. Seven of twenty directions were below their own baseline. At 5 km blocking, two of</w:t>
-      </w:r>
-      <w:r>
-        <w:t xml:space="preserve"> </w:t>
-      </w:r>
-      <w:r>
-        <w:t xml:space="preserve">these seven had intervals below the baseline, both into Manavgat (Table S11).</w:t>
+        <w:t xml:space="preserve">0.070 to 0.287. Seven of twenty directions were below their own baseline. At 5 km blocking, two of these seven had intervals below the baseline, both into Manavgat (Table</w:t>
+      </w:r>
+      <w:r>
+        <w:t xml:space="preserve"> </w:t>
+      </w:r>
+      <w:r>
+        <w:t xml:space="preserve">S11). In map terms, the 10 % of target cells with the highest scores contained on average 10.3 % of</w:t>
+      </w:r>
+      <w:r>
+        <w:t xml:space="preserve"> </w:t>
+      </w:r>
+      <w:r>
+        <w:t xml:space="preserve">the burned cells, which is what a random ranking gives, and eight of twenty directions did worse.</w:t>
+      </w:r>
+      <w:r>
+        <w:t xml:space="preserve"> </w:t>
+      </w:r>
+      <w:r>
+        <w:t xml:space="preserve">Within regions, the same share was 35.5 % (Section S1.23).</w:t>
       </w:r>
     </w:p>
     <w:p>
@@ -9553,13 +9583,31 @@
         <w:t xml:space="preserve"> </w:t>
       </w:r>
       <w:r>
-        <w:t xml:space="preserve">S1.10). A movement toward chance is also what any loss of information would produce, so these</w:t>
-      </w:r>
-      <w:r>
-        <w:t xml:space="preserve"> </w:t>
-      </w:r>
-      <w:r>
-        <w:t xml:space="preserve">results do not show that the methods removed a distribution shift.</w:t>
+        <w:t xml:space="preserve">S1.10). A movement toward chance is also what any loss of information would produce. Indeed, aligning the</w:t>
+      </w:r>
+      <w:r>
+        <w:t xml:space="preserve"> </w:t>
+      </w:r>
+      <w:r>
+        <w:t xml:space="preserve">source with the covariance of a third, unrelated region moved 15 of 20 directions toward chance as</w:t>
+      </w:r>
+      <w:r>
+        <w:t xml:space="preserve"> </w:t>
+      </w:r>
+      <w:r>
+        <w:t xml:space="preserve">well (mean 0.507). CORAL with a stronger regularisation (λ = 1, mean 0.512) or on two thermal</w:t>
+      </w:r>
+      <w:r>
+        <w:t xml:space="preserve"> </w:t>
+      </w:r>
+      <w:r>
+        <w:t xml:space="preserve">components (0.523) did not help either (Section S1.23). These results therefore do not show that</w:t>
+      </w:r>
+      <w:r>
+        <w:t xml:space="preserve"> </w:t>
+      </w:r>
+      <w:r>
+        <w:t xml:space="preserve">the methods removed a distribution shift.</w:t>
       </w:r>
     </w:p>
     <w:bookmarkEnd w:id="46"/>
@@ -9689,19 +9737,19 @@
         <w:t xml:space="preserve"> </w:t>
       </w:r>
       <w:r>
-        <w:t xml:space="preserve">changed after the label correction. On the original study areas, none predicted transfer with an</w:t>
-      </w:r>
-      <w:r>
-        <w:t xml:space="preserve"> </w:t>
-      </w:r>
-      <w:r>
-        <w:t xml:space="preserve">interval that excludes zero (Table S17); one measure is defined on only six directions and is not</w:t>
-      </w:r>
-      <w:r>
-        <w:t xml:space="preserve"> </w:t>
-      </w:r>
-      <w:r>
-        <w:t xml:space="preserve">interpreted. The contrast pairs illustrate this at the point estimates (Fig. 8). Manavgat and Muğla</w:t>
+        <w:t xml:space="preserve">changed after the label correction. On the original study areas, none predicted transfer with an interval that excludes zero (Table</w:t>
+      </w:r>
+      <w:r>
+        <w:t xml:space="preserve"> </w:t>
+      </w:r>
+      <w:r>
+        <w:t xml:space="preserve">S17), and in a permutation test over all 120 orderings of the five regions no measure reached</w:t>
+      </w:r>
+      <w:r>
+        <w:t xml:space="preserve"> </w:t>
+      </w:r>
+      <w:r>
+        <w:t xml:space="preserve">p &lt; 0.10 (Section S1.23). One measure is defined on only six directions and is not interpreted. The contrast pairs illustrate this at the point estimates (Fig. 8). Manavgat and Muğla</w:t>
       </w:r>
       <w:r>
         <w:t xml:space="preserve"> </w:t>
@@ -10192,13 +10240,13 @@
         <w:t xml:space="preserve"> </w:t>
       </w:r>
       <w:r>
-        <w:t xml:space="preserve">elsewhere, and no similarity measure tested here could replace the measurement. In precision terms,</w:t>
-      </w:r>
-      <w:r>
-        <w:t xml:space="preserve"> </w:t>
-      </w:r>
-      <w:r>
-        <w:t xml:space="preserve">a model moved to a new region did not usefully rank the burned cells there (Section 4.5). Target</w:t>
+        <w:t xml:space="preserve">elsewhere, and no similarity measure tested here could replace the measurement. A model moved to a new region did not usefully rank the burned cells there: its highest-scored</w:t>
+      </w:r>
+      <w:r>
+        <w:t xml:space="preserve"> </w:t>
+      </w:r>
+      <w:r>
+        <w:t xml:space="preserve">10 % of cells contained about as many burned cells as a random choice (Section 4.5). Target</w:t>
       </w:r>
       <w:r>
         <w:t xml:space="preserve"> </w:t>
@@ -10406,19 +10454,25 @@
           <w:b/>
           <w:bCs/>
         </w:rPr>
-        <w:t xml:space="preserve">Intervals are conditional on one fitted forest.</w:t>
-      </w:r>
-      <w:r>
-        <w:t xml:space="preserve"> </w:t>
-      </w:r>
-      <w:r>
-        <w:t xml:space="preserve">The random-forest seed is fixed, and under</w:t>
-      </w:r>
-      <w:r>
-        <w:t xml:space="preserve"> </w:t>
-      </w:r>
-      <w:r>
-        <w:t xml:space="preserve">another scikit-learn version single directions moved by up to 0.047 (Section 3.13; S3.5(vi)).</w:t>
+        <w:t xml:space="preserve">Point estimates depend on the software version.</w:t>
+      </w:r>
+      <w:r>
+        <w:t xml:space="preserve"> </w:t>
+      </w:r>
+      <w:r>
+        <w:t xml:space="preserve">Under another scikit-learn version, single</w:t>
+      </w:r>
+      <w:r>
+        <w:t xml:space="preserve"> </w:t>
+      </w:r>
+      <w:r>
+        <w:t xml:space="preserve">directions moved by up to 0.047, while ten random-forest seeds changed mean transfer by at most</w:t>
+      </w:r>
+      <w:r>
+        <w:t xml:space="preserve"> </w:t>
+      </w:r>
+      <w:r>
+        <w:t xml:space="preserve">0.003 (Section 3.13; S1.23; S3.5(vi)).</w:t>
       </w:r>
     </w:p>
     <w:p>

</xml_diff>

<commit_message>
Pre-fire land cover check (WorldCover 2020); Zenodo and citation metadata
</commit_message>
<xml_diff>
--- a/paper/submission/manuscript.docx
+++ b/paper/submission/manuscript.docx
@@ -96,7 +96,7 @@
         <w:t xml:space="preserve"> </w:t>
       </w:r>
       <w:r>
-        <w:t xml:space="preserve">8,422 words in the main text (Sections 1 to 6, table captions and notes included; tables, references, declarations and figure captions excluded). Abstract 250 words.</w:t>
+        <w:t xml:space="preserve">8,485 words in the main text (Sections 1 to 6, table captions and notes included; tables, references, declarations and figure captions excluded). Abstract 250 words.</w:t>
       </w:r>
     </w:p>
     <w:bookmarkStart w:id="18" w:name="abstract"/>
@@ -2086,19 +2086,37 @@
         <w:t xml:space="preserve"> </w:t>
       </w:r>
       <w:r>
-        <w:t xml:space="preserve">WorldCover v200 is built from 2021 images, which is after the fire for the four 2021</w:t>
-      </w:r>
-      <w:r>
-        <w:t xml:space="preserve"> </w:t>
-      </w:r>
-      <w:r>
-        <w:t xml:space="preserve">events. Burned land may therefore be under-represented in its pre-fire vegetation class. The wide</w:t>
-      </w:r>
-      <w:r>
-        <w:t xml:space="preserve"> </w:t>
-      </w:r>
-      <w:r>
-        <w:t xml:space="preserve">gate margins (Section 4.1) make it unlikely that this changes a gate decision.</w:t>
+        <w:t xml:space="preserve">WorldCover v200 is built from 2021 images, which is after the fire for the four</w:t>
+      </w:r>
+      <w:r>
+        <w:t xml:space="preserve"> </w:t>
+      </w:r>
+      <w:r>
+        <w:t xml:space="preserve">2021 events. All analyses were therefore repeated with the 2020 map (WorldCover v100), aggregated to</w:t>
+      </w:r>
+      <w:r>
+        <w:t xml:space="preserve"> </w:t>
+      </w:r>
+      <w:r>
+        <w:t xml:space="preserve">the same cells. The 2020 map changed the population by at most 43 burned cells in four regions. In</w:t>
+      </w:r>
+      <w:r>
+        <w:t xml:space="preserve"> </w:t>
+      </w:r>
+      <w:r>
+        <w:t xml:space="preserve">Montiferru, however, it added 142 burned cells that the 2021 map did not class as natural</w:t>
+      </w:r>
+      <w:r>
+        <w:t xml:space="preserve"> </w:t>
+      </w:r>
+      <w:r>
+        <w:t xml:space="preserve">vegetation. The within-region gains and the transfer results did not change in any conclusion</w:t>
+      </w:r>
+      <w:r>
+        <w:t xml:space="preserve"> </w:t>
+      </w:r>
+      <w:r>
+        <w:t xml:space="preserve">(Section S1.23).</w:t>
       </w:r>
     </w:p>
     <w:bookmarkEnd w:id="30"/>
@@ -10682,13 +10700,19 @@
         <w:t xml:space="preserve"> </w:t>
       </w:r>
       <w:r>
-        <w:t xml:space="preserve">WorldCover v200 is built from 2021 images</w:t>
-      </w:r>
-      <w:r>
-        <w:t xml:space="preserve"> </w:t>
-      </w:r>
-      <w:r>
-        <w:t xml:space="preserve">(Section 3.4).</w:t>
+        <w:t xml:space="preserve">With the 2020 map, mean transfer was 0.513</w:t>
+      </w:r>
+      <w:r>
+        <w:t xml:space="preserve"> </w:t>
+      </w:r>
+      <w:r>
+        <w:t xml:space="preserve">instead of 0.527, and no conclusion changed; in Montiferru, however, the 2021 map left out about a</w:t>
+      </w:r>
+      <w:r>
+        <w:t xml:space="preserve"> </w:t>
+      </w:r>
+      <w:r>
+        <w:t xml:space="preserve">fifth of the burned natural vegetation (Section 3.4; S1.23).</w:t>
       </w:r>
     </w:p>
     <w:p>

</xml_diff>

<commit_message>
Cite the Zenodo archive (10.5281/zenodo.23035271)
</commit_message>
<xml_diff>
--- a/paper/submission/manuscript.docx
+++ b/paper/submission/manuscript.docx
@@ -11170,7 +11170,7 @@
         <w:t xml:space="preserve"> </w:t>
       </w:r>
       <w:r>
-        <w:t xml:space="preserve">(Cogurcu and Metin 2026)</w:t>
+        <w:t xml:space="preserve">(Metin and Cogurcu 2026)</w:t>
       </w:r>
       <w:r>
         <w:t xml:space="preserve">. Each dataset is identified by SHA-256</w:t>
@@ -11315,6 +11315,21 @@
         </w:r>
       </w:hyperlink>
       <w:r>
+        <w:t xml:space="preserve">, and version 1.0.1</w:t>
+      </w:r>
+      <w:r>
+        <w:t xml:space="preserve"> </w:t>
+      </w:r>
+      <w:r>
+        <w:t xml:space="preserve">is archived at Zenodo</w:t>
+      </w:r>
+      <w:r>
+        <w:t xml:space="preserve"> </w:t>
+      </w:r>
+      <w:r>
+        <w:t xml:space="preserve">(Metin and Cogurcu 2026)</w:t>
+      </w:r>
+      <w:r>
         <w:t xml:space="preserve">. Figs. 1 to 8 are drawn</w:t>
       </w:r>
       <w:r>
@@ -11470,7 +11485,7 @@
     </w:p>
     <w:bookmarkEnd w:id="66"/>
     <w:bookmarkEnd w:id="67"/>
-    <w:bookmarkStart w:id="186" w:name="references"/>
+    <w:bookmarkStart w:id="187" w:name="references"/>
     <w:p>
       <w:pPr>
         <w:pStyle w:val="Heading1"/>
@@ -11479,7 +11494,7 @@
         <w:t xml:space="preserve">References</w:t>
       </w:r>
     </w:p>
-    <w:bookmarkStart w:id="185" w:name="refs"/>
+    <w:bookmarkStart w:id="186" w:name="refs"/>
     <w:bookmarkStart w:id="69" w:name="ref-AlkanAkinci2023"/>
     <w:p>
       <w:pPr>
@@ -11717,45 +11732,12 @@
       </w:hyperlink>
     </w:p>
     <w:bookmarkEnd w:id="81"/>
-    <w:bookmarkStart w:id="82" w:name="ref-ThermalTwinRepo"/>
+    <w:bookmarkStart w:id="83" w:name="ref-Dimarco2026"/>
     <w:p>
       <w:pPr>
         <w:pStyle w:val="Bibliography"/>
       </w:pPr>
       <w:r>
-        <w:t xml:space="preserve">Cogurcu YE, Metin E (2026)</w:t>
-      </w:r>
-      <w:r>
-        <w:t xml:space="preserve"> </w:t>
-      </w:r>
-      <w:r>
-        <w:t xml:space="preserve">thermal-twin</w:t>
-      </w:r>
-      <w:r>
-        <w:t xml:space="preserve">: Analysis code, modelling datasets and frozen outputs.</w:t>
-      </w:r>
-      <w:r>
-        <w:t xml:space="preserve"> </w:t>
-      </w:r>
-      <w:hyperlink r:id="rId63">
-        <w:r>
-          <w:rPr>
-            <w:rStyle w:val="Hyperlink"/>
-          </w:rPr>
-          <w:t xml:space="preserve">https://github.com/dryuemco/thermal-twin</w:t>
-        </w:r>
-      </w:hyperlink>
-      <w:r>
-        <w:t xml:space="preserve">. Accessed 29 Sept 2026</w:t>
-      </w:r>
-    </w:p>
-    <w:bookmarkEnd w:id="82"/>
-    <w:bookmarkStart w:id="84" w:name="ref-Dimarco2026"/>
-    <w:p>
-      <w:pPr>
-        <w:pStyle w:val="Bibliography"/>
-      </w:pPr>
-      <w:r>
         <w:t xml:space="preserve">Dimarco NA, Faraji I, Wahbi M, et al (2026) Generalizing human-driven wildfire ignition models across</w:t>
       </w:r>
       <w:r>
@@ -11773,7 +11755,7 @@
       <w:r>
         <w:t xml:space="preserve"> </w:t>
       </w:r>
-      <w:hyperlink r:id="rId83">
+      <w:hyperlink r:id="rId82">
         <w:r>
           <w:rPr>
             <w:rStyle w:val="Hyperlink"/>
@@ -11782,8 +11764,8 @@
         </w:r>
       </w:hyperlink>
     </w:p>
-    <w:bookmarkEnd w:id="84"/>
-    <w:bookmarkStart w:id="86" w:name="ref-CopernicusDEM"/>
+    <w:bookmarkEnd w:id="83"/>
+    <w:bookmarkStart w:id="85" w:name="ref-CopernicusDEM"/>
     <w:p>
       <w:pPr>
         <w:pStyle w:val="Bibliography"/>
@@ -11812,7 +11794,7 @@
       <w:r>
         <w:t xml:space="preserve"> </w:t>
       </w:r>
-      <w:hyperlink r:id="rId85">
+      <w:hyperlink r:id="rId84">
         <w:r>
           <w:rPr>
             <w:rStyle w:val="Hyperlink"/>
@@ -11821,8 +11803,8 @@
         </w:r>
       </w:hyperlink>
     </w:p>
-    <w:bookmarkEnd w:id="86"/>
-    <w:bookmarkStart w:id="88" w:name="ref-Gelabert2025"/>
+    <w:bookmarkEnd w:id="85"/>
+    <w:bookmarkStart w:id="87" w:name="ref-Gelabert2025"/>
     <w:p>
       <w:pPr>
         <w:pStyle w:val="Bibliography"/>
@@ -11842,7 +11824,7 @@
       <w:r>
         <w:t xml:space="preserve"> </w:t>
       </w:r>
-      <w:hyperlink r:id="rId87">
+      <w:hyperlink r:id="rId86">
         <w:r>
           <w:rPr>
             <w:rStyle w:val="Hyperlink"/>
@@ -11851,8 +11833,8 @@
         </w:r>
       </w:hyperlink>
     </w:p>
-    <w:bookmarkEnd w:id="88"/>
-    <w:bookmarkStart w:id="90" w:name="ref-VNP64A1"/>
+    <w:bookmarkEnd w:id="87"/>
+    <w:bookmarkStart w:id="89" w:name="ref-VNP64A1"/>
     <w:p>
       <w:pPr>
         <w:pStyle w:val="Bibliography"/>
@@ -11911,7 +11893,7 @@
       <w:r>
         <w:t xml:space="preserve"> </w:t>
       </w:r>
-      <w:hyperlink r:id="rId89">
+      <w:hyperlink r:id="rId88">
         <w:r>
           <w:rPr>
             <w:rStyle w:val="Hyperlink"/>
@@ -11920,8 +11902,8 @@
         </w:r>
       </w:hyperlink>
     </w:p>
-    <w:bookmarkEnd w:id="90"/>
-    <w:bookmarkStart w:id="92" w:name="ref-Giglio2018"/>
+    <w:bookmarkEnd w:id="89"/>
+    <w:bookmarkStart w:id="91" w:name="ref-Giglio2018"/>
     <w:p>
       <w:pPr>
         <w:pStyle w:val="Bibliography"/>
@@ -11956,7 +11938,7 @@
       <w:r>
         <w:t xml:space="preserve"> </w:t>
       </w:r>
-      <w:hyperlink r:id="rId91">
+      <w:hyperlink r:id="rId90">
         <w:r>
           <w:rPr>
             <w:rStyle w:val="Hyperlink"/>
@@ -11965,8 +11947,8 @@
         </w:r>
       </w:hyperlink>
     </w:p>
-    <w:bookmarkEnd w:id="92"/>
-    <w:bookmarkStart w:id="94" w:name="ref-MCD64A1"/>
+    <w:bookmarkEnd w:id="91"/>
+    <w:bookmarkStart w:id="93" w:name="ref-MCD64A1"/>
     <w:p>
       <w:pPr>
         <w:pStyle w:val="Bibliography"/>
@@ -12025,7 +12007,7 @@
       <w:r>
         <w:t xml:space="preserve"> </w:t>
       </w:r>
-      <w:hyperlink r:id="rId93">
+      <w:hyperlink r:id="rId92">
         <w:r>
           <w:rPr>
             <w:rStyle w:val="Hyperlink"/>
@@ -12034,8 +12016,8 @@
         </w:r>
       </w:hyperlink>
     </w:p>
-    <w:bookmarkEnd w:id="94"/>
-    <w:bookmarkStart w:id="96" w:name="ref-Gorelick2017"/>
+    <w:bookmarkEnd w:id="93"/>
+    <w:bookmarkStart w:id="95" w:name="ref-Gorelick2017"/>
     <w:p>
       <w:pPr>
         <w:pStyle w:val="Bibliography"/>
@@ -12067,7 +12049,7 @@
       <w:r>
         <w:t xml:space="preserve"> </w:t>
       </w:r>
-      <w:hyperlink r:id="rId95">
+      <w:hyperlink r:id="rId94">
         <w:r>
           <w:rPr>
             <w:rStyle w:val="Hyperlink"/>
@@ -12076,8 +12058,8 @@
         </w:r>
       </w:hyperlink>
     </w:p>
-    <w:bookmarkEnd w:id="96"/>
-    <w:bookmarkStart w:id="98" w:name="ref-Hijmans2012"/>
+    <w:bookmarkEnd w:id="95"/>
+    <w:bookmarkStart w:id="97" w:name="ref-Hijmans2012"/>
     <w:p>
       <w:pPr>
         <w:pStyle w:val="Bibliography"/>
@@ -12088,7 +12070,7 @@
       <w:r>
         <w:t xml:space="preserve"> </w:t>
       </w:r>
-      <w:hyperlink r:id="rId97">
+      <w:hyperlink r:id="rId96">
         <w:r>
           <w:rPr>
             <w:rStyle w:val="Hyperlink"/>
@@ -12097,8 +12079,8 @@
         </w:r>
       </w:hyperlink>
     </w:p>
-    <w:bookmarkEnd w:id="98"/>
-    <w:bookmarkStart w:id="100" w:name="ref-Huang2026"/>
+    <w:bookmarkEnd w:id="97"/>
+    <w:bookmarkStart w:id="99" w:name="ref-Huang2026"/>
     <w:p>
       <w:pPr>
         <w:pStyle w:val="Bibliography"/>
@@ -12109,7 +12091,7 @@
       <w:r>
         <w:t xml:space="preserve"> </w:t>
       </w:r>
-      <w:hyperlink r:id="rId99">
+      <w:hyperlink r:id="rId98">
         <w:r>
           <w:rPr>
             <w:rStyle w:val="Hyperlink"/>
@@ -12118,8 +12100,8 @@
         </w:r>
       </w:hyperlink>
     </w:p>
-    <w:bookmarkEnd w:id="100"/>
-    <w:bookmarkStart w:id="102" w:name="ref-Iban2022"/>
+    <w:bookmarkEnd w:id="99"/>
+    <w:bookmarkStart w:id="101" w:name="ref-Iban2022"/>
     <w:p>
       <w:pPr>
         <w:pStyle w:val="Bibliography"/>
@@ -12172,7 +12154,7 @@
       <w:r>
         <w:t xml:space="preserve"> </w:t>
       </w:r>
-      <w:hyperlink r:id="rId101">
+      <w:hyperlink r:id="rId100">
         <w:r>
           <w:rPr>
             <w:rStyle w:val="Hyperlink"/>
@@ -12181,8 +12163,8 @@
         </w:r>
       </w:hyperlink>
     </w:p>
-    <w:bookmarkEnd w:id="102"/>
-    <w:bookmarkStart w:id="104" w:name="ref-Jain2020"/>
+    <w:bookmarkEnd w:id="101"/>
+    <w:bookmarkStart w:id="103" w:name="ref-Jain2020"/>
     <w:p>
       <w:pPr>
         <w:pStyle w:val="Bibliography"/>
@@ -12193,7 +12175,7 @@
       <w:r>
         <w:t xml:space="preserve"> </w:t>
       </w:r>
-      <w:hyperlink r:id="rId103">
+      <w:hyperlink r:id="rId102">
         <w:r>
           <w:rPr>
             <w:rStyle w:val="Hyperlink"/>
@@ -12202,8 +12184,8 @@
         </w:r>
       </w:hyperlink>
     </w:p>
-    <w:bookmarkEnd w:id="104"/>
-    <w:bookmarkStart w:id="106" w:name="ref-JimenezValverde2012"/>
+    <w:bookmarkEnd w:id="103"/>
+    <w:bookmarkStart w:id="105" w:name="ref-JimenezValverde2012"/>
     <w:p>
       <w:pPr>
         <w:pStyle w:val="Bibliography"/>
@@ -12220,7 +12202,7 @@
       <w:r>
         <w:t xml:space="preserve"> </w:t>
       </w:r>
-      <w:hyperlink r:id="rId105">
+      <w:hyperlink r:id="rId104">
         <w:r>
           <w:rPr>
             <w:rStyle w:val="Hyperlink"/>
@@ -12229,8 +12211,8 @@
         </w:r>
       </w:hyperlink>
     </w:p>
-    <w:bookmarkEnd w:id="106"/>
-    <w:bookmarkStart w:id="108" w:name="ref-Jodhani2026"/>
+    <w:bookmarkEnd w:id="105"/>
+    <w:bookmarkStart w:id="107" w:name="ref-Jodhani2026"/>
     <w:p>
       <w:pPr>
         <w:pStyle w:val="Bibliography"/>
@@ -12241,7 +12223,7 @@
       <w:r>
         <w:t xml:space="preserve"> </w:t>
       </w:r>
-      <w:hyperlink r:id="rId107">
+      <w:hyperlink r:id="rId106">
         <w:r>
           <w:rPr>
             <w:rStyle w:val="Hyperlink"/>
@@ -12250,8 +12232,8 @@
         </w:r>
       </w:hyperlink>
     </w:p>
-    <w:bookmarkEnd w:id="108"/>
-    <w:bookmarkStart w:id="110" w:name="ref-Katagis2022"/>
+    <w:bookmarkEnd w:id="107"/>
+    <w:bookmarkStart w:id="109" w:name="ref-Katagis2022"/>
     <w:p>
       <w:pPr>
         <w:pStyle w:val="Bibliography"/>
@@ -12310,7 +12292,7 @@
       <w:r>
         <w:t xml:space="preserve"> </w:t>
       </w:r>
-      <w:hyperlink r:id="rId109">
+      <w:hyperlink r:id="rId108">
         <w:r>
           <w:rPr>
             <w:rStyle w:val="Hyperlink"/>
@@ -12319,8 +12301,8 @@
         </w:r>
       </w:hyperlink>
     </w:p>
-    <w:bookmarkEnd w:id="110"/>
-    <w:bookmarkStart w:id="112" w:name="ref-Kondylatos2023"/>
+    <w:bookmarkEnd w:id="109"/>
+    <w:bookmarkStart w:id="111" w:name="ref-Kondylatos2023"/>
     <w:p>
       <w:pPr>
         <w:pStyle w:val="Bibliography"/>
@@ -12331,7 +12313,7 @@
       <w:r>
         <w:t xml:space="preserve"> </w:t>
       </w:r>
-      <w:hyperlink r:id="rId111">
+      <w:hyperlink r:id="rId110">
         <w:r>
           <w:rPr>
             <w:rStyle w:val="Hyperlink"/>
@@ -12361,8 +12343,8 @@
         <w:t xml:space="preserve">. In: Advances in neural information processing systems 36 (NeurIPS 2023) datasets and benchmarks track. pp 50661–50676</w:t>
       </w:r>
     </w:p>
-    <w:bookmarkEnd w:id="112"/>
-    <w:bookmarkStart w:id="114" w:name="ref-Liu2025"/>
+    <w:bookmarkEnd w:id="111"/>
+    <w:bookmarkStart w:id="113" w:name="ref-Liu2025"/>
     <w:p>
       <w:pPr>
         <w:pStyle w:val="Bibliography"/>
@@ -12382,7 +12364,7 @@
       <w:r>
         <w:t xml:space="preserve"> </w:t>
       </w:r>
-      <w:hyperlink r:id="rId113">
+      <w:hyperlink r:id="rId112">
         <w:r>
           <w:rPr>
             <w:rStyle w:val="Hyperlink"/>
@@ -12391,8 +12373,8 @@
         </w:r>
       </w:hyperlink>
     </w:p>
-    <w:bookmarkEnd w:id="114"/>
-    <w:bookmarkStart w:id="116" w:name="ref-Lobo2008"/>
+    <w:bookmarkEnd w:id="113"/>
+    <w:bookmarkStart w:id="115" w:name="ref-Lobo2008"/>
     <w:p>
       <w:pPr>
         <w:pStyle w:val="Bibliography"/>
@@ -12412,7 +12394,7 @@
       <w:r>
         <w:t xml:space="preserve"> </w:t>
       </w:r>
-      <w:hyperlink r:id="rId115">
+      <w:hyperlink r:id="rId114">
         <w:r>
           <w:rPr>
             <w:rStyle w:val="Hyperlink"/>
@@ -12421,8 +12403,8 @@
         </w:r>
       </w:hyperlink>
     </w:p>
-    <w:bookmarkEnd w:id="116"/>
-    <w:bookmarkStart w:id="118" w:name="ref-Maffei2018"/>
+    <w:bookmarkEnd w:id="115"/>
+    <w:bookmarkStart w:id="117" w:name="ref-Maffei2018"/>
     <w:p>
       <w:pPr>
         <w:pStyle w:val="Bibliography"/>
@@ -12433,7 +12415,7 @@
       <w:r>
         <w:t xml:space="preserve"> </w:t>
       </w:r>
-      <w:hyperlink r:id="rId117">
+      <w:hyperlink r:id="rId116">
         <w:r>
           <w:rPr>
             <w:rStyle w:val="Hyperlink"/>
@@ -12442,8 +12424,8 @@
         </w:r>
       </w:hyperlink>
     </w:p>
-    <w:bookmarkEnd w:id="118"/>
-    <w:bookmarkStart w:id="120" w:name="ref-Maffei2021"/>
+    <w:bookmarkEnd w:id="117"/>
+    <w:bookmarkStart w:id="119" w:name="ref-Maffei2021"/>
     <w:p>
       <w:pPr>
         <w:pStyle w:val="Bibliography"/>
@@ -12454,7 +12436,7 @@
       <w:r>
         <w:t xml:space="preserve"> </w:t>
       </w:r>
-      <w:hyperlink r:id="rId119">
+      <w:hyperlink r:id="rId118">
         <w:r>
           <w:rPr>
             <w:rStyle w:val="Hyperlink"/>
@@ -12463,8 +12445,8 @@
         </w:r>
       </w:hyperlink>
     </w:p>
-    <w:bookmarkEnd w:id="120"/>
-    <w:bookmarkStart w:id="122" w:name="ref-MaffeiMenenti2019"/>
+    <w:bookmarkEnd w:id="119"/>
+    <w:bookmarkStart w:id="121" w:name="ref-MaffeiMenenti2019"/>
     <w:p>
       <w:pPr>
         <w:pStyle w:val="Bibliography"/>
@@ -12475,7 +12457,7 @@
       <w:r>
         <w:t xml:space="preserve"> </w:t>
       </w:r>
-      <w:hyperlink r:id="rId121">
+      <w:hyperlink r:id="rId120">
         <w:r>
           <w:rPr>
             <w:rStyle w:val="Hyperlink"/>
@@ -12484,8 +12466,8 @@
         </w:r>
       </w:hyperlink>
     </w:p>
-    <w:bookmarkEnd w:id="122"/>
-    <w:bookmarkStart w:id="124" w:name="ref-Marino2024"/>
+    <w:bookmarkEnd w:id="121"/>
+    <w:bookmarkStart w:id="123" w:name="ref-Marino2024"/>
     <w:p>
       <w:pPr>
         <w:pStyle w:val="Bibliography"/>
@@ -12496,7 +12478,7 @@
       <w:r>
         <w:t xml:space="preserve"> </w:t>
       </w:r>
-      <w:hyperlink r:id="rId123">
+      <w:hyperlink r:id="rId122">
         <w:r>
           <w:rPr>
             <w:rStyle w:val="Hyperlink"/>
@@ -12505,13 +12487,34 @@
         </w:r>
       </w:hyperlink>
     </w:p>
-    <w:bookmarkEnd w:id="124"/>
-    <w:bookmarkStart w:id="126" w:name="ref-Meyer2021"/>
+    <w:bookmarkEnd w:id="123"/>
+    <w:bookmarkStart w:id="125" w:name="ref-ThermalTwinRepo"/>
     <w:p>
       <w:pPr>
         <w:pStyle w:val="Bibliography"/>
       </w:pPr>
       <w:r>
+        <w:t xml:space="preserve">Metin E, Cogurcu YE (2026) Evaluation area and the limits of cross-region transfer of pre-fire thermal wildfire models: Analysis code, modelling datasets and frozen outputs [software], version 1.0.1. Zenodo.</w:t>
+      </w:r>
+      <w:r>
+        <w:t xml:space="preserve"> </w:t>
+      </w:r>
+      <w:hyperlink r:id="rId124">
+        <w:r>
+          <w:rPr>
+            <w:rStyle w:val="Hyperlink"/>
+          </w:rPr>
+          <w:t xml:space="preserve">https://doi.org/10.5281/zenodo.23035271</w:t>
+        </w:r>
+      </w:hyperlink>
+    </w:p>
+    <w:bookmarkEnd w:id="125"/>
+    <w:bookmarkStart w:id="127" w:name="ref-Meyer2021"/>
+    <w:p>
+      <w:pPr>
+        <w:pStyle w:val="Bibliography"/>
+      </w:pPr>
+      <w:r>
         <w:t xml:space="preserve">Meyer H, Pebesma E (2021) Predicting into unknown space?</w:t>
       </w:r>
       <w:r>
@@ -12529,7 +12532,7 @@
       <w:r>
         <w:t xml:space="preserve"> </w:t>
       </w:r>
-      <w:hyperlink r:id="rId125">
+      <w:hyperlink r:id="rId126">
         <w:r>
           <w:rPr>
             <w:rStyle w:val="Hyperlink"/>
@@ -12538,8 +12541,8 @@
         </w:r>
       </w:hyperlink>
     </w:p>
-    <w:bookmarkEnd w:id="126"/>
-    <w:bookmarkStart w:id="128" w:name="ref-Meyer2018"/>
+    <w:bookmarkEnd w:id="127"/>
+    <w:bookmarkStart w:id="129" w:name="ref-Meyer2018"/>
     <w:p>
       <w:pPr>
         <w:pStyle w:val="Bibliography"/>
@@ -12550,7 +12553,7 @@
       <w:r>
         <w:t xml:space="preserve"> </w:t>
       </w:r>
-      <w:hyperlink r:id="rId127">
+      <w:hyperlink r:id="rId128">
         <w:r>
           <w:rPr>
             <w:rStyle w:val="Hyperlink"/>
@@ -12559,8 +12562,8 @@
         </w:r>
       </w:hyperlink>
     </w:p>
-    <w:bookmarkEnd w:id="128"/>
-    <w:bookmarkStart w:id="130" w:name="ref-Mila2022"/>
+    <w:bookmarkEnd w:id="129"/>
+    <w:bookmarkStart w:id="131" w:name="ref-Mila2022"/>
     <w:p>
       <w:pPr>
         <w:pStyle w:val="Bibliography"/>
@@ -12589,7 +12592,7 @@
       <w:r>
         <w:t xml:space="preserve"> </w:t>
       </w:r>
-      <w:hyperlink r:id="rId129">
+      <w:hyperlink r:id="rId130">
         <w:r>
           <w:rPr>
             <w:rStyle w:val="Hyperlink"/>
@@ -12598,8 +12601,8 @@
         </w:r>
       </w:hyperlink>
     </w:p>
-    <w:bookmarkEnd w:id="130"/>
-    <w:bookmarkStart w:id="132" w:name="ref-MorenoTorres2012"/>
+    <w:bookmarkEnd w:id="131"/>
+    <w:bookmarkStart w:id="133" w:name="ref-MorenoTorres2012"/>
     <w:p>
       <w:pPr>
         <w:pStyle w:val="Bibliography"/>
@@ -12610,7 +12613,7 @@
       <w:r>
         <w:t xml:space="preserve"> </w:t>
       </w:r>
-      <w:hyperlink r:id="rId131">
+      <w:hyperlink r:id="rId132">
         <w:r>
           <w:rPr>
             <w:rStyle w:val="Hyperlink"/>
@@ -12619,8 +12622,8 @@
         </w:r>
       </w:hyperlink>
     </w:p>
-    <w:bookmarkEnd w:id="132"/>
-    <w:bookmarkStart w:id="134" w:name="ref-Oliveira2012"/>
+    <w:bookmarkEnd w:id="133"/>
+    <w:bookmarkStart w:id="135" w:name="ref-Oliveira2012"/>
     <w:p>
       <w:pPr>
         <w:pStyle w:val="Bibliography"/>
@@ -12643,7 +12646,7 @@
       <w:r>
         <w:t xml:space="preserve"> </w:t>
       </w:r>
-      <w:hyperlink r:id="rId133">
+      <w:hyperlink r:id="rId134">
         <w:r>
           <w:rPr>
             <w:rStyle w:val="Hyperlink"/>
@@ -12652,8 +12655,8 @@
         </w:r>
       </w:hyperlink>
     </w:p>
-    <w:bookmarkEnd w:id="134"/>
-    <w:bookmarkStart w:id="136" w:name="ref-ParisienMoritz2009"/>
+    <w:bookmarkEnd w:id="135"/>
+    <w:bookmarkStart w:id="137" w:name="ref-ParisienMoritz2009"/>
     <w:p>
       <w:pPr>
         <w:pStyle w:val="Bibliography"/>
@@ -12664,7 +12667,7 @@
       <w:r>
         <w:t xml:space="preserve"> </w:t>
       </w:r>
-      <w:hyperlink r:id="rId135">
+      <w:hyperlink r:id="rId136">
         <w:r>
           <w:rPr>
             <w:rStyle w:val="Hyperlink"/>
@@ -12673,8 +12676,8 @@
         </w:r>
       </w:hyperlink>
     </w:p>
-    <w:bookmarkEnd w:id="136"/>
-    <w:bookmarkStart w:id="138" w:name="ref-Pausas2021"/>
+    <w:bookmarkEnd w:id="137"/>
+    <w:bookmarkStart w:id="139" w:name="ref-Pausas2021"/>
     <w:p>
       <w:pPr>
         <w:pStyle w:val="Bibliography"/>
@@ -12685,7 +12688,7 @@
       <w:r>
         <w:t xml:space="preserve"> </w:t>
       </w:r>
-      <w:hyperlink r:id="rId137">
+      <w:hyperlink r:id="rId138">
         <w:r>
           <w:rPr>
             <w:rStyle w:val="Hyperlink"/>
@@ -12694,8 +12697,8 @@
         </w:r>
       </w:hyperlink>
     </w:p>
-    <w:bookmarkEnd w:id="138"/>
-    <w:bookmarkStart w:id="140" w:name="ref-PausasPaula2012"/>
+    <w:bookmarkEnd w:id="139"/>
+    <w:bookmarkStart w:id="141" w:name="ref-PausasPaula2012"/>
     <w:p>
       <w:pPr>
         <w:pStyle w:val="Bibliography"/>
@@ -12718,7 +12721,7 @@
       <w:r>
         <w:t xml:space="preserve"> </w:t>
       </w:r>
-      <w:hyperlink r:id="rId139">
+      <w:hyperlink r:id="rId140">
         <w:r>
           <w:rPr>
             <w:rStyle w:val="Hyperlink"/>
@@ -12727,8 +12730,8 @@
         </w:r>
       </w:hyperlink>
     </w:p>
-    <w:bookmarkEnd w:id="140"/>
-    <w:bookmarkStart w:id="142" w:name="ref-Persello2012"/>
+    <w:bookmarkEnd w:id="141"/>
+    <w:bookmarkStart w:id="143" w:name="ref-Persello2012"/>
     <w:p>
       <w:pPr>
         <w:pStyle w:val="Bibliography"/>
@@ -12739,7 +12742,7 @@
       <w:r>
         <w:t xml:space="preserve"> </w:t>
       </w:r>
-      <w:hyperlink r:id="rId141">
+      <w:hyperlink r:id="rId142">
         <w:r>
           <w:rPr>
             <w:rStyle w:val="Hyperlink"/>
@@ -12748,8 +12751,8 @@
         </w:r>
       </w:hyperlink>
     </w:p>
-    <w:bookmarkEnd w:id="142"/>
-    <w:bookmarkStart w:id="144" w:name="ref-Ploton2020"/>
+    <w:bookmarkEnd w:id="143"/>
+    <w:bookmarkStart w:id="145" w:name="ref-Ploton2020"/>
     <w:p>
       <w:pPr>
         <w:pStyle w:val="Bibliography"/>
@@ -12760,7 +12763,7 @@
       <w:r>
         <w:t xml:space="preserve"> </w:t>
       </w:r>
-      <w:hyperlink r:id="rId143">
+      <w:hyperlink r:id="rId144">
         <w:r>
           <w:rPr>
             <w:rStyle w:val="Hyperlink"/>
@@ -12769,8 +12772,8 @@
         </w:r>
       </w:hyperlink>
     </w:p>
-    <w:bookmarkEnd w:id="144"/>
-    <w:bookmarkStart w:id="146" w:name="ref-Podschwit2022"/>
+    <w:bookmarkEnd w:id="145"/>
+    <w:bookmarkStart w:id="147" w:name="ref-Podschwit2022"/>
     <w:p>
       <w:pPr>
         <w:pStyle w:val="Bibliography"/>
@@ -12793,7 +12796,7 @@
       <w:r>
         <w:t xml:space="preserve"> </w:t>
       </w:r>
-      <w:hyperlink r:id="rId145">
+      <w:hyperlink r:id="rId146">
         <w:r>
           <w:rPr>
             <w:rStyle w:val="Hyperlink"/>
@@ -12802,8 +12805,8 @@
         </w:r>
       </w:hyperlink>
     </w:p>
-    <w:bookmarkEnd w:id="146"/>
-    <w:bookmarkStart w:id="148" w:name="ref-Roberts2017"/>
+    <w:bookmarkEnd w:id="147"/>
+    <w:bookmarkStart w:id="149" w:name="ref-Roberts2017"/>
     <w:p>
       <w:pPr>
         <w:pStyle w:val="Bibliography"/>
@@ -12814,7 +12817,7 @@
       <w:r>
         <w:t xml:space="preserve"> </w:t>
       </w:r>
-      <w:hyperlink r:id="rId147">
+      <w:hyperlink r:id="rId148">
         <w:r>
           <w:rPr>
             <w:rStyle w:val="Hyperlink"/>
@@ -12823,8 +12826,8 @@
         </w:r>
       </w:hyperlink>
     </w:p>
-    <w:bookmarkEnd w:id="148"/>
-    <w:bookmarkStart w:id="150" w:name="ref-Rousseau2022"/>
+    <w:bookmarkEnd w:id="149"/>
+    <w:bookmarkStart w:id="151" w:name="ref-Rousseau2022"/>
     <w:p>
       <w:pPr>
         <w:pStyle w:val="Bibliography"/>
@@ -12835,7 +12838,7 @@
       <w:r>
         <w:t xml:space="preserve"> </w:t>
       </w:r>
-      <w:hyperlink r:id="rId149">
+      <w:hyperlink r:id="rId150">
         <w:r>
           <w:rPr>
             <w:rStyle w:val="Hyperlink"/>
@@ -12844,8 +12847,8 @@
         </w:r>
       </w:hyperlink>
     </w:p>
-    <w:bookmarkEnd w:id="150"/>
-    <w:bookmarkStart w:id="152" w:name="ref-Sandholt2002"/>
+    <w:bookmarkEnd w:id="151"/>
+    <w:bookmarkStart w:id="153" w:name="ref-Sandholt2002"/>
     <w:p>
       <w:pPr>
         <w:pStyle w:val="Bibliography"/>
@@ -12856,7 +12859,7 @@
       <w:r>
         <w:t xml:space="preserve"> </w:t>
       </w:r>
-      <w:hyperlink r:id="rId151">
+      <w:hyperlink r:id="rId152">
         <w:r>
           <w:rPr>
             <w:rStyle w:val="Hyperlink"/>
@@ -12865,8 +12868,8 @@
         </w:r>
       </w:hyperlink>
     </w:p>
-    <w:bookmarkEnd w:id="152"/>
-    <w:bookmarkStart w:id="154" w:name="ref-Schoener1968"/>
+    <w:bookmarkEnd w:id="153"/>
+    <w:bookmarkStart w:id="155" w:name="ref-Schoener1968"/>
     <w:p>
       <w:pPr>
         <w:pStyle w:val="Bibliography"/>
@@ -12898,7 +12901,7 @@
       <w:r>
         <w:t xml:space="preserve"> </w:t>
       </w:r>
-      <w:hyperlink r:id="rId153">
+      <w:hyperlink r:id="rId154">
         <w:r>
           <w:rPr>
             <w:rStyle w:val="Hyperlink"/>
@@ -12907,8 +12910,8 @@
         </w:r>
       </w:hyperlink>
     </w:p>
-    <w:bookmarkEnd w:id="154"/>
-    <w:bookmarkStart w:id="156" w:name="ref-Sofaer2019"/>
+    <w:bookmarkEnd w:id="155"/>
+    <w:bookmarkStart w:id="157" w:name="ref-Sofaer2019"/>
     <w:p>
       <w:pPr>
         <w:pStyle w:val="Bibliography"/>
@@ -12919,7 +12922,7 @@
       <w:r>
         <w:t xml:space="preserve"> </w:t>
       </w:r>
-      <w:hyperlink r:id="rId155">
+      <w:hyperlink r:id="rId156">
         <w:r>
           <w:rPr>
             <w:rStyle w:val="Hyperlink"/>
@@ -12928,8 +12931,8 @@
         </w:r>
       </w:hyperlink>
     </w:p>
-    <w:bookmarkEnd w:id="156"/>
-    <w:bookmarkStart w:id="158" w:name="ref-Sun2016"/>
+    <w:bookmarkEnd w:id="157"/>
+    <w:bookmarkStart w:id="159" w:name="ref-Sun2016"/>
     <w:p>
       <w:pPr>
         <w:pStyle w:val="Bibliography"/>
@@ -12940,7 +12943,7 @@
       <w:r>
         <w:t xml:space="preserve"> </w:t>
       </w:r>
-      <w:hyperlink r:id="rId157">
+      <w:hyperlink r:id="rId158">
         <w:r>
           <w:rPr>
             <w:rStyle w:val="Hyperlink"/>
@@ -12970,8 +12973,8 @@
         <w:t xml:space="preserve">-16). AAAI Press, Phoenix, Arizona, USA, pp 2058–2065</w:t>
       </w:r>
     </w:p>
-    <w:bookmarkEnd w:id="158"/>
-    <w:bookmarkStart w:id="160" w:name="ref-Tuia2016"/>
+    <w:bookmarkEnd w:id="159"/>
+    <w:bookmarkStart w:id="161" w:name="ref-Tuia2016"/>
     <w:p>
       <w:pPr>
         <w:pStyle w:val="Bibliography"/>
@@ -12982,7 +12985,7 @@
       <w:r>
         <w:t xml:space="preserve"> </w:t>
       </w:r>
-      <w:hyperlink r:id="rId159">
+      <w:hyperlink r:id="rId160">
         <w:r>
           <w:rPr>
             <w:rStyle w:val="Hyperlink"/>
@@ -12991,8 +12994,8 @@
         </w:r>
       </w:hyperlink>
     </w:p>
-    <w:bookmarkEnd w:id="160"/>
-    <w:bookmarkStart w:id="162" w:name="ref-LandsatC2L2"/>
+    <w:bookmarkEnd w:id="161"/>
+    <w:bookmarkStart w:id="163" w:name="ref-LandsatC2L2"/>
     <w:p>
       <w:pPr>
         <w:pStyle w:val="Bibliography"/>
@@ -13003,7 +13006,7 @@
       <w:r>
         <w:t xml:space="preserve"> </w:t>
       </w:r>
-      <w:hyperlink r:id="rId161">
+      <w:hyperlink r:id="rId162">
         <w:r>
           <w:rPr>
             <w:rStyle w:val="Hyperlink"/>
@@ -13012,8 +13015,8 @@
         </w:r>
       </w:hyperlink>
     </w:p>
-    <w:bookmarkEnd w:id="162"/>
-    <w:bookmarkStart w:id="164" w:name="ref-Valavi2019"/>
+    <w:bookmarkEnd w:id="163"/>
+    <w:bookmarkStart w:id="165" w:name="ref-Valavi2019"/>
     <w:p>
       <w:pPr>
         <w:pStyle w:val="Bibliography"/>
@@ -13045,7 +13048,7 @@
       <w:r>
         <w:t xml:space="preserve"> </w:t>
       </w:r>
-      <w:hyperlink r:id="rId163">
+      <w:hyperlink r:id="rId164">
         <w:r>
           <w:rPr>
             <w:rStyle w:val="Hyperlink"/>
@@ -13054,8 +13057,8 @@
         </w:r>
       </w:hyperlink>
     </w:p>
-    <w:bookmarkEnd w:id="164"/>
-    <w:bookmarkStart w:id="166" w:name="ref-VanDerWal2009"/>
+    <w:bookmarkEnd w:id="165"/>
+    <w:bookmarkStart w:id="167" w:name="ref-VanDerWal2009"/>
     <w:p>
       <w:pPr>
         <w:pStyle w:val="Bibliography"/>
@@ -13066,7 +13069,7 @@
       <w:r>
         <w:t xml:space="preserve"> </w:t>
       </w:r>
-      <w:hyperlink r:id="rId165">
+      <w:hyperlink r:id="rId166">
         <w:r>
           <w:rPr>
             <w:rStyle w:val="Hyperlink"/>
@@ -13075,8 +13078,8 @@
         </w:r>
       </w:hyperlink>
     </w:p>
-    <w:bookmarkEnd w:id="166"/>
-    <w:bookmarkStart w:id="168" w:name="ref-Vesk2021"/>
+    <w:bookmarkEnd w:id="167"/>
+    <w:bookmarkStart w:id="169" w:name="ref-Vesk2021"/>
     <w:p>
       <w:pPr>
         <w:pStyle w:val="Bibliography"/>
@@ -13087,7 +13090,7 @@
       <w:r>
         <w:t xml:space="preserve"> </w:t>
       </w:r>
-      <w:hyperlink r:id="rId167">
+      <w:hyperlink r:id="rId168">
         <w:r>
           <w:rPr>
             <w:rStyle w:val="Hyperlink"/>
@@ -13096,8 +13099,8 @@
         </w:r>
       </w:hyperlink>
     </w:p>
-    <w:bookmarkEnd w:id="168"/>
-    <w:bookmarkStart w:id="170" w:name="ref-Vibhandik2026"/>
+    <w:bookmarkEnd w:id="169"/>
+    <w:bookmarkStart w:id="171" w:name="ref-Vibhandik2026"/>
     <w:p>
       <w:pPr>
         <w:pStyle w:val="Bibliography"/>
@@ -13108,7 +13111,7 @@
       <w:r>
         <w:t xml:space="preserve"> </w:t>
       </w:r>
-      <w:hyperlink r:id="rId169">
+      <w:hyperlink r:id="rId170">
         <w:r>
           <w:rPr>
             <w:rStyle w:val="Hyperlink"/>
@@ -13117,8 +13120,8 @@
         </w:r>
       </w:hyperlink>
     </w:p>
-    <w:bookmarkEnd w:id="170"/>
-    <w:bookmarkStart w:id="172" w:name="ref-Wadoux2021"/>
+    <w:bookmarkEnd w:id="171"/>
+    <w:bookmarkStart w:id="173" w:name="ref-Wadoux2021"/>
     <w:p>
       <w:pPr>
         <w:pStyle w:val="Bibliography"/>
@@ -13129,7 +13132,7 @@
       <w:r>
         <w:t xml:space="preserve"> </w:t>
       </w:r>
-      <w:hyperlink r:id="rId171">
+      <w:hyperlink r:id="rId172">
         <w:r>
           <w:rPr>
             <w:rStyle w:val="Hyperlink"/>
@@ -13138,8 +13141,8 @@
         </w:r>
       </w:hyperlink>
     </w:p>
-    <w:bookmarkEnd w:id="172"/>
-    <w:bookmarkStart w:id="174" w:name="ref-MOD11A1"/>
+    <w:bookmarkEnd w:id="173"/>
+    <w:bookmarkStart w:id="175" w:name="ref-MOD11A1"/>
     <w:p>
       <w:pPr>
         <w:pStyle w:val="Bibliography"/>
@@ -13198,7 +13201,7 @@
       <w:r>
         <w:t xml:space="preserve"> </w:t>
       </w:r>
-      <w:hyperlink r:id="rId173">
+      <w:hyperlink r:id="rId174">
         <w:r>
           <w:rPr>
             <w:rStyle w:val="Hyperlink"/>
@@ -13207,8 +13210,8 @@
         </w:r>
       </w:hyperlink>
     </w:p>
-    <w:bookmarkEnd w:id="174"/>
-    <w:bookmarkStart w:id="176" w:name="ref-Warren2008"/>
+    <w:bookmarkEnd w:id="175"/>
+    <w:bookmarkStart w:id="177" w:name="ref-Warren2008"/>
     <w:p>
       <w:pPr>
         <w:pStyle w:val="Bibliography"/>
@@ -13219,7 +13222,7 @@
       <w:r>
         <w:t xml:space="preserve"> </w:t>
       </w:r>
-      <w:hyperlink r:id="rId175">
+      <w:hyperlink r:id="rId176">
         <w:r>
           <w:rPr>
             <w:rStyle w:val="Hyperlink"/>
@@ -13228,8 +13231,8 @@
         </w:r>
       </w:hyperlink>
     </w:p>
-    <w:bookmarkEnd w:id="176"/>
-    <w:bookmarkStart w:id="178" w:name="ref-Xu2026"/>
+    <w:bookmarkEnd w:id="177"/>
+    <w:bookmarkStart w:id="179" w:name="ref-Xu2026"/>
     <w:p>
       <w:pPr>
         <w:pStyle w:val="Bibliography"/>
@@ -13240,7 +13243,7 @@
       <w:r>
         <w:t xml:space="preserve"> </w:t>
       </w:r>
-      <w:hyperlink r:id="rId177">
+      <w:hyperlink r:id="rId178">
         <w:r>
           <w:rPr>
             <w:rStyle w:val="Hyperlink"/>
@@ -13249,8 +13252,8 @@
         </w:r>
       </w:hyperlink>
     </w:p>
-    <w:bookmarkEnd w:id="178"/>
-    <w:bookmarkStart w:id="180" w:name="ref-Yates2018"/>
+    <w:bookmarkEnd w:id="179"/>
+    <w:bookmarkStart w:id="181" w:name="ref-Yates2018"/>
     <w:p>
       <w:pPr>
         <w:pStyle w:val="Bibliography"/>
@@ -13261,7 +13264,7 @@
       <w:r>
         <w:t xml:space="preserve"> </w:t>
       </w:r>
-      <w:hyperlink r:id="rId179">
+      <w:hyperlink r:id="rId180">
         <w:r>
           <w:rPr>
             <w:rStyle w:val="Hyperlink"/>
@@ -13270,8 +13273,8 @@
         </w:r>
       </w:hyperlink>
     </w:p>
-    <w:bookmarkEnd w:id="180"/>
-    <w:bookmarkStart w:id="182" w:name="ref-Yebra2013"/>
+    <w:bookmarkEnd w:id="181"/>
+    <w:bookmarkStart w:id="183" w:name="ref-Yebra2013"/>
     <w:p>
       <w:pPr>
         <w:pStyle w:val="Bibliography"/>
@@ -13282,7 +13285,7 @@
       <w:r>
         <w:t xml:space="preserve"> </w:t>
       </w:r>
-      <w:hyperlink r:id="rId181">
+      <w:hyperlink r:id="rId182">
         <w:r>
           <w:rPr>
             <w:rStyle w:val="Hyperlink"/>
@@ -13291,8 +13294,8 @@
         </w:r>
       </w:hyperlink>
     </w:p>
-    <w:bookmarkEnd w:id="182"/>
-    <w:bookmarkStart w:id="184" w:name="ref-Zanaga2022"/>
+    <w:bookmarkEnd w:id="183"/>
+    <w:bookmarkStart w:id="185" w:name="ref-Zanaga2022"/>
     <w:p>
       <w:pPr>
         <w:pStyle w:val="Bibliography"/>
@@ -13321,7 +13324,7 @@
       <w:r>
         <w:t xml:space="preserve"> </w:t>
       </w:r>
-      <w:hyperlink r:id="rId183">
+      <w:hyperlink r:id="rId184">
         <w:r>
           <w:rPr>
             <w:rStyle w:val="Hyperlink"/>
@@ -13330,10 +13333,10 @@
         </w:r>
       </w:hyperlink>
     </w:p>
-    <w:bookmarkEnd w:id="184"/>
     <w:bookmarkEnd w:id="185"/>
     <w:bookmarkEnd w:id="186"/>
-    <w:bookmarkStart w:id="187" w:name="figure-captions"/>
+    <w:bookmarkEnd w:id="187"/>
+    <w:bookmarkStart w:id="188" w:name="figure-captions"/>
     <w:p>
       <w:pPr>
         <w:pStyle w:val="Heading1"/>
@@ -14033,7 +14036,7 @@
         <w:t xml:space="preserve">Manavgat has, so the contrast is stated at the point estimates.</w:t>
       </w:r>
     </w:p>
-    <w:bookmarkEnd w:id="187"/>
+    <w:bookmarkEnd w:id="188"/>
     <w:sectPr>
       <w:footerReference r:id="rId9" w:type="default"/>
       <w:footnotePr>

</xml_diff>

<commit_message>
Open reviewer items: VNP64A1 labels, aspect, Landsat observation counts, ERA5 comparison, statistics checks, Fig. S1, Fig. 4 and 5 markers, supplement trimmed
</commit_message>
<xml_diff>
--- a/paper/submission/manuscript.docx
+++ b/paper/submission/manuscript.docx
@@ -96,7 +96,7 @@
         <w:t xml:space="preserve"> </w:t>
       </w:r>
       <w:r>
-        <w:t xml:space="preserve">8,485 words in the main text (Sections 1 to 6, table captions and notes included; tables, references, declarations and figure captions excluded). Abstract 250 words.</w:t>
+        <w:t xml:space="preserve">8,793 words in the main text (Sections 1 to 6, table captions and notes included; tables, references, declarations and figure captions excluded). Abstract 250 words.</w:t>
       </w:r>
     </w:p>
     <w:bookmarkStart w:id="18" w:name="abstract"/>
@@ -1709,19 +1709,43 @@
         <w:t xml:space="preserve"> </w:t>
       </w:r>
       <w:r>
-        <w:t xml:space="preserve">limit every</w:t>
-      </w:r>
-      <w:r>
-        <w:t xml:space="preserve"> </w:t>
-      </w:r>
-      <w:r>
-        <w:t xml:space="preserve">model in this study. The analysis grid is built from the 30 m reference grid of the processing</w:t>
-      </w:r>
-      <w:r>
-        <w:t xml:space="preserve"> </w:t>
-      </w:r>
-      <w:r>
-        <w:t xml:space="preserve">pipeline in blocks of 17 × 17 pixels. A cell is therefore about 510 m from north to south and 390 to</w:t>
+        <w:t xml:space="preserve">limit every model in this study. As a check, the within-region and transfer analyses</w:t>
+      </w:r>
+      <w:r>
+        <w:t xml:space="preserve"> </w:t>
+      </w:r>
+      <w:r>
+        <w:t xml:space="preserve">were repeated with the VIIRS VNP64A1 product</w:t>
+      </w:r>
+      <w:r>
+        <w:t xml:space="preserve"> </w:t>
+      </w:r>
+      <w:r>
+        <w:t xml:space="preserve">(Giglio 2024)</w:t>
+      </w:r>
+      <w:r>
+        <w:t xml:space="preserve"> </w:t>
+      </w:r>
+      <w:r>
+        <w:t xml:space="preserve">(Section S1.23). The MCD64A1 monthly burn-date</w:t>
+      </w:r>
+      <w:r>
+        <w:t xml:space="preserve"> </w:t>
+      </w:r>
+      <w:r>
+        <w:t xml:space="preserve">layer was sampled onto the 30 m reference grid of the processing pipeline by</w:t>
+      </w:r>
+      <w:r>
+        <w:t xml:space="preserve"> </w:t>
+      </w:r>
+      <w:r>
+        <w:t xml:space="preserve">nearest neighbour, so each ~500 m observation is repeated over the 30 m pixels below it. The</w:t>
+      </w:r>
+      <w:r>
+        <w:t xml:space="preserve"> </w:t>
+      </w:r>
+      <w:r>
+        <w:t xml:space="preserve">analysis grid is built from this grid in blocks of 17 × 17 pixels. A cell is therefore about 510 m from north to south and 390 to</w:t>
       </w:r>
       <w:r>
         <w:t xml:space="preserve"> </w:t>
@@ -2002,13 +2026,7 @@
         <w:t xml:space="preserve">(Sandholt et al. 2002)</w:t>
       </w:r>
       <w:r>
-        <w:t xml:space="preserve">, its difference from the baseline years, a downscaled LST and a fused LST. The last</w:t>
-      </w:r>
-      <w:r>
-        <w:t xml:space="preserve"> </w:t>
-      </w:r>
-      <w:r>
-        <w:t xml:space="preserve">two use MODIS MOD11A1 v061 daily LST</w:t>
+        <w:t xml:space="preserve">, its difference from the baseline years, a downscaled LST and a fused LST. The last two use MODIS MOD11A1 v061 daytime LST (Terra, about 10:30 local time)</w:t>
       </w:r>
       <w:r>
         <w:t xml:space="preserve"> </w:t>
@@ -2020,19 +2038,37 @@
         <w:t xml:space="preserve"> </w:t>
       </w:r>
       <w:r>
-        <w:t xml:space="preserve">to fill gaps in Landsat (0.11 % to 9.70 % of pixels,</w:t>
-      </w:r>
-      <w:r>
-        <w:t xml:space="preserve"> </w:t>
-      </w:r>
-      <w:r>
-        <w:t xml:space="preserve">depending on the region). Because TVDI edges are fitted inside each study area and window, a TVDI</w:t>
-      </w:r>
-      <w:r>
-        <w:t xml:space="preserve"> </w:t>
-      </w:r>
-      <w:r>
-        <w:t xml:space="preserve">value does not mean the same moisture state in two regions (Section S3.4).</w:t>
+        <w:t xml:space="preserve">and a</w:t>
+      </w:r>
+      <w:r>
+        <w:t xml:space="preserve"> </w:t>
+      </w:r>
+      <w:r>
+        <w:t xml:space="preserve">random-forest downscaling model to fill gaps in Landsat (0.11 % to 9.70 % of pixels,</w:t>
+      </w:r>
+      <w:r>
+        <w:t xml:space="preserve"> </w:t>
+      </w:r>
+      <w:r>
+        <w:t xml:space="preserve">depending on the region). Because TVDI edges are fitted inside each study area and window, a TVDI value does not mean the</w:t>
+      </w:r>
+      <w:r>
+        <w:t xml:space="preserve"> </w:t>
+      </w:r>
+      <w:r>
+        <w:t xml:space="preserve">same moisture state in two regions (Section S3.4). The median pixel had three to six clear Landsat</w:t>
+      </w:r>
+      <w:r>
+        <w:t xml:space="preserve"> </w:t>
+      </w:r>
+      <w:r>
+        <w:t xml:space="preserve">observations in the predictor window, and one to seven in each baseline year (Table S36). Landsat 9</w:t>
+      </w:r>
+      <w:r>
+        <w:t xml:space="preserve"> </w:t>
+      </w:r>
+      <w:r>
+        <w:t xml:space="preserve">was not used.</w:t>
       </w:r>
     </w:p>
     <w:p>
@@ -3081,19 +3117,13 @@
         <w:t xml:space="preserve"> </w:t>
       </w:r>
       <w:r>
-        <w:t xml:space="preserve">therefore change when the frame changes, even when no score changes (Section 3.12). Precision-recall</w:t>
-      </w:r>
-      <w:r>
-        <w:t xml:space="preserve"> </w:t>
-      </w:r>
-      <w:r>
-        <w:t xml:space="preserve">AUC is also reported, because it reflects how a susceptibility map is used when burned cells are</w:t>
-      </w:r>
-      <w:r>
-        <w:t xml:space="preserve"> </w:t>
-      </w:r>
-      <w:r>
-        <w:t xml:space="preserve">rare</w:t>
+        <w:t xml:space="preserve">therefore change when the frame changes, even when no score changes (Section 3.12). Precision-recall AUC is also reported, because it reflects how a susceptibility map is used when</w:t>
+      </w:r>
+      <w:r>
+        <w:t xml:space="preserve"> </w:t>
+      </w:r>
+      <w:r>
+        <w:t xml:space="preserve">burned cells are rare</w:t>
       </w:r>
       <w:r>
         <w:t xml:space="preserve"> </w:t>
@@ -3102,7 +3132,19 @@
         <w:t xml:space="preserve">(Sofaer et al. 2019)</w:t>
       </w:r>
       <w:r>
-        <w:t xml:space="preserve">.</w:t>
+        <w:t xml:space="preserve">. The out-of-fold residuals stay spatially correlated up to 5 to</w:t>
+      </w:r>
+      <w:r>
+        <w:t xml:space="preserve"> </w:t>
+      </w:r>
+      <w:r>
+        <w:t xml:space="preserve">10 km, and in three regions they fall below 0.05 only at 10 to 20 km (Section S1.23). Intervals at</w:t>
+      </w:r>
+      <w:r>
+        <w:t xml:space="preserve"> </w:t>
+      </w:r>
+      <w:r>
+        <w:t xml:space="preserve">5 km blocking may therefore still be somewhat too narrow, and the 10 km results are given as a check.</w:t>
       </w:r>
     </w:p>
     <w:p>
@@ -5226,6 +5268,14 @@
         <w:pStyle w:val="BodyText"/>
       </w:pPr>
       <w:r>
+        <w:t xml:space="preserve">The study areas, burned cells and collars are mapped in Fig. S1.</w:t>
+      </w:r>
+    </w:p>
+    <w:p>
+      <w:pPr>
+        <w:pStyle w:val="BodyText"/>
+      </w:pPr>
+      <w:r>
         <w:rPr>
           <w:b/>
           <w:bCs/>
@@ -5518,19 +5568,31 @@
         <w:t xml:space="preserve"> </w:t>
       </w:r>
       <w:r>
-        <w:t xml:space="preserve">but they rest on only 6 to 33 blocks that contain burned cells, so they are indicative. The gain also</w:t>
-      </w:r>
-      <w:r>
-        <w:t xml:space="preserve"> </w:t>
-      </w:r>
-      <w:r>
-        <w:t xml:space="preserve">stayed positive, with interval support in all five regions, when the predictor window was closed up</w:t>
-      </w:r>
-      <w:r>
-        <w:t xml:space="preserve"> </w:t>
-      </w:r>
-      <w:r>
-        <w:t xml:space="preserve">to two weeks earlier (Section S1.4).</w:t>
+        <w:t xml:space="preserve">but they rest on only 6 to 33 blocks that contain burned cells, so they are indicative. The gain also stayed positive, with interval support in all five regions, when the predictor window</w:t>
+      </w:r>
+      <w:r>
+        <w:t xml:space="preserve"> </w:t>
+      </w:r>
+      <w:r>
+        <w:t xml:space="preserve">was closed up to two weeks earlier (Section S1.4). With labels from VIIRS VNP64A1 instead of</w:t>
+      </w:r>
+      <w:r>
+        <w:t xml:space="preserve"> </w:t>
+      </w:r>
+      <w:r>
+        <w:t xml:space="preserve">MCD64A1, the gain stayed positive in all five regions at the point estimates (Section S1.23). When terrain aspect was added to both feature sets, the</w:t>
+      </w:r>
+      <w:r>
+        <w:t xml:space="preserve"> </w:t>
+      </w:r>
+      <w:r>
+        <w:t xml:space="preserve">gain stayed supported in four regions (+0.044 to +0.139) but fell to +0.020 [−0.025, +0.066] in</w:t>
+      </w:r>
+      <w:r>
+        <w:t xml:space="preserve"> </w:t>
+      </w:r>
+      <w:r>
+        <w:t xml:space="preserve">Montiferru (Section S1.23).</w:t>
       </w:r>
     </w:p>
     <w:p>
@@ -7395,7 +7457,7 @@
         <w:t xml:space="preserve"> </w:t>
       </w:r>
       <w:r>
-        <w:t xml:space="preserve">given in the text.</w:t>
+        <w:t xml:space="preserve">given in the text. Cell counts per scar are in Table S1.</w:t>
       </w:r>
     </w:p>
     <w:tbl>
@@ -9402,7 +9464,13 @@
         <w:t xml:space="preserve"> </w:t>
       </w:r>
       <w:r>
-        <w:t xml:space="preserve">0.070 to 0.287. Seven of twenty directions were below their own baseline. At 5 km blocking, two of these seven had intervals below the baseline, both into Manavgat (Table</w:t>
+        <w:t xml:space="preserve">0.070 to 0.287. The median lift over the baseline was 1.18. Seven of twenty directions were below their own</w:t>
+      </w:r>
+      <w:r>
+        <w:t xml:space="preserve"> </w:t>
+      </w:r>
+      <w:r>
+        <w:t xml:space="preserve">baseline. At 5 km blocking, two of these seven had intervals below the baseline, both into Manavgat (Table</w:t>
       </w:r>
       <w:r>
         <w:t xml:space="preserve"> </w:t>
@@ -10097,13 +10165,43 @@
         <w:t xml:space="preserve"> </w:t>
       </w:r>
       <w:r>
-        <w:t xml:space="preserve">and terrain. Dense, cooler vegetation carries more fuel, so a negative association is consistent</w:t>
-      </w:r>
-      <w:r>
-        <w:t xml:space="preserve"> </w:t>
-      </w:r>
-      <w:r>
-        <w:t xml:space="preserve">with LST acting as a land-surface descriptor. The normalised channels did not transfer better than</w:t>
+        <w:t xml:space="preserve">and terrain. Dense, cooler vegetation carries more fuel, so a negative association is consistent with LST acting</w:t>
+      </w:r>
+      <w:r>
+        <w:t xml:space="preserve"> </w:t>
+      </w:r>
+      <w:r>
+        <w:t xml:space="preserve">as a land-surface descriptor. In Montiferru, most of the within-region thermal gain disappeared once</w:t>
+      </w:r>
+      <w:r>
+        <w:t xml:space="preserve"> </w:t>
+      </w:r>
+      <w:r>
+        <w:t xml:space="preserve">terrain aspect was added, which fits this reading. Across the five regions, the mean LST anomaly</w:t>
+      </w:r>
+      <w:r>
+        <w:t xml:space="preserve"> </w:t>
+      </w:r>
+      <w:r>
+        <w:t xml:space="preserve">also followed the ERA5-Land</w:t>
+      </w:r>
+      <w:r>
+        <w:t xml:space="preserve"> </w:t>
+      </w:r>
+      <w:r>
+        <w:t xml:space="preserve">(Muñoz-Sabater et al. 2021)</w:t>
+      </w:r>
+      <w:r>
+        <w:t xml:space="preserve"> </w:t>
+      </w:r>
+      <w:r>
+        <w:t xml:space="preserve">air-temperature anomaly of the predictor window, but</w:t>
+      </w:r>
+      <w:r>
+        <w:t xml:space="preserve"> </w:t>
+      </w:r>
+      <w:r>
+        <w:t xml:space="preserve">not its relative-humidity anomaly (Section S1.23). The normalised channels did not transfer better than</w:t>
       </w:r>
       <w:r>
         <w:t xml:space="preserve"> </w:t>
@@ -10506,19 +10604,25 @@
           <w:b/>
           <w:bCs/>
         </w:rPr>
-        <w:t xml:space="preserve">The similarity tests rest on ten independent region pairs,</w:t>
-      </w:r>
-      <w:r>
-        <w:t xml:space="preserve"> </w:t>
-      </w:r>
-      <w:r>
-        <w:t xml:space="preserve">so both positive and negative</w:t>
-      </w:r>
-      <w:r>
-        <w:t xml:space="preserve"> </w:t>
-      </w:r>
-      <w:r>
-        <w:t xml:space="preserve">results have low power (S3.5(xiii)).</w:t>
+        <w:t xml:space="preserve">Spatial dependence reaches beyond the 5 km blocks.</w:t>
+      </w:r>
+      <w:r>
+        <w:t xml:space="preserve"> </w:t>
+      </w:r>
+      <w:r>
+        <w:t xml:space="preserve">Residual correlation falls below 0.05</w:t>
+      </w:r>
+      <w:r>
+        <w:t xml:space="preserve"> </w:t>
+      </w:r>
+      <w:r>
+        <w:t xml:space="preserve">only at 10 to 20 km in three regions, so intervals at 5 km blocking may be somewhat narrow</w:t>
+      </w:r>
+      <w:r>
+        <w:t xml:space="preserve"> </w:t>
+      </w:r>
+      <w:r>
+        <w:t xml:space="preserve">(Section 3.7; S1.23).</w:t>
       </w:r>
     </w:p>
     <w:p>
@@ -10534,19 +10638,19 @@
           <w:b/>
           <w:bCs/>
         </w:rPr>
-        <w:t xml:space="preserve">Measures based on interval support are unstable.</w:t>
-      </w:r>
-      <w:r>
-        <w:t xml:space="preserve"> </w:t>
-      </w:r>
-      <w:r>
-        <w:t xml:space="preserve">Five to six interval bounds lie within 0.01</w:t>
-      </w:r>
-      <w:r>
-        <w:t xml:space="preserve"> </w:t>
-      </w:r>
-      <w:r>
-        <w:t xml:space="preserve">of 0.5, and one changed flag moved a correlation by about 0.2 (Section S1.20; S3.5(viii)).</w:t>
+        <w:t xml:space="preserve">The similarity tests rest on ten independent region pairs,</w:t>
+      </w:r>
+      <w:r>
+        <w:t xml:space="preserve"> </w:t>
+      </w:r>
+      <w:r>
+        <w:t xml:space="preserve">so both positive and negative</w:t>
+      </w:r>
+      <w:r>
+        <w:t xml:space="preserve"> </w:t>
+      </w:r>
+      <w:r>
+        <w:t xml:space="preserve">results have low power (S3.5(xiii)).</w:t>
       </w:r>
     </w:p>
     <w:p>
@@ -10562,25 +10666,19 @@
           <w:b/>
           <w:bCs/>
         </w:rPr>
-        <w:t xml:space="preserve">The reversal test is marginal.</w:t>
-      </w:r>
-      <w:r>
-        <w:t xml:space="preserve"> </w:t>
-      </w:r>
-      <w:r>
-        <w:t xml:space="preserve">A reversal of a single predictor can also come from different</w:t>
-      </w:r>
-      <w:r>
-        <w:t xml:space="preserve"> </w:t>
-      </w:r>
-      <w:r>
-        <w:t xml:space="preserve">predictor distributions, so it does not prove a change in the predictor-burning relationship</w:t>
-      </w:r>
-      <w:r>
-        <w:t xml:space="preserve"> </w:t>
-      </w:r>
-      <w:r>
-        <w:t xml:space="preserve">(Section 3.10).</w:t>
+        <w:t xml:space="preserve">Measures based on interval support are unstable.</w:t>
+      </w:r>
+      <w:r>
+        <w:t xml:space="preserve"> </w:t>
+      </w:r>
+      <w:r>
+        <w:t xml:space="preserve">Five to six interval bounds lie within 0.01</w:t>
+      </w:r>
+      <w:r>
+        <w:t xml:space="preserve"> </w:t>
+      </w:r>
+      <w:r>
+        <w:t xml:space="preserve">of 0.5, and one changed flag moved a correlation by about 0.2 (Section S1.20; S3.5(viii)).</w:t>
       </w:r>
     </w:p>
     <w:p>
@@ -10596,25 +10694,25 @@
           <w:b/>
           <w:bCs/>
         </w:rPr>
-        <w:t xml:space="preserve">The low transfer into Manavgat is located but not explained.</w:t>
-      </w:r>
-      <w:r>
-        <w:t xml:space="preserve"> </w:t>
-      </w:r>
-      <w:r>
-        <w:t xml:space="preserve">Weather, quality screening and the</w:t>
-      </w:r>
-      <w:r>
-        <w:t xml:space="preserve"> </w:t>
-      </w:r>
-      <w:r>
-        <w:t xml:space="preserve">study area were tested, and none explained it. Terrain was held only through elevation, and in</w:t>
-      </w:r>
-      <w:r>
-        <w:t xml:space="preserve"> </w:t>
-      </w:r>
-      <w:r>
-        <w:t xml:space="preserve">Manavgat burn timing and elevation are confounded (S3.5(vii), S3.5(xi)).</w:t>
+        <w:t xml:space="preserve">The reversal test is marginal.</w:t>
+      </w:r>
+      <w:r>
+        <w:t xml:space="preserve"> </w:t>
+      </w:r>
+      <w:r>
+        <w:t xml:space="preserve">A reversal of a single predictor can also come from different</w:t>
+      </w:r>
+      <w:r>
+        <w:t xml:space="preserve"> </w:t>
+      </w:r>
+      <w:r>
+        <w:t xml:space="preserve">predictor distributions, so it does not prove a change in the predictor-burning relationship</w:t>
+      </w:r>
+      <w:r>
+        <w:t xml:space="preserve"> </w:t>
+      </w:r>
+      <w:r>
+        <w:t xml:space="preserve">(Section 3.10).</w:t>
       </w:r>
     </w:p>
     <w:p>
@@ -10630,6 +10728,40 @@
           <w:b/>
           <w:bCs/>
         </w:rPr>
+        <w:t xml:space="preserve">The low transfer into Manavgat is located but not explained.</w:t>
+      </w:r>
+      <w:r>
+        <w:t xml:space="preserve"> </w:t>
+      </w:r>
+      <w:r>
+        <w:t xml:space="preserve">Weather, quality screening and the</w:t>
+      </w:r>
+      <w:r>
+        <w:t xml:space="preserve"> </w:t>
+      </w:r>
+      <w:r>
+        <w:t xml:space="preserve">study area were tested, and none explained it. Terrain was held through elevation and aspect only, and in Manavgat burn timing and elevation are</w:t>
+      </w:r>
+      <w:r>
+        <w:t xml:space="preserve"> </w:t>
+      </w:r>
+      <w:r>
+        <w:t xml:space="preserve">confounded (S3.5(vii), S3.5(xi)).</w:t>
+      </w:r>
+    </w:p>
+    <w:p>
+      <w:pPr>
+        <w:pStyle w:val="Compact"/>
+        <w:numPr>
+          <w:ilvl w:val="0"/>
+          <w:numId w:val="1001"/>
+        </w:numPr>
+      </w:pPr>
+      <w:r>
+        <w:rPr>
+          <w:b/>
+          <w:bCs/>
+        </w:rPr>
         <w:t xml:space="preserve">All labels come from one burned-area product,</w:t>
       </w:r>
       <w:r>
@@ -10660,13 +10792,7 @@
         <w:t xml:space="preserve">(Boschetti et al. 2019; Katagis and Gitas 2022)</w:t>
       </w:r>
       <w:r>
-        <w:t xml:space="preserve">, which are concentrated at scar edges. VIIRS</w:t>
-      </w:r>
-      <w:r>
-        <w:t xml:space="preserve"> </w:t>
-      </w:r>
-      <w:r>
-        <w:t xml:space="preserve">VNP64A1</w:t>
+        <w:t xml:space="preserve">, which are concentrated at scar edges. With VIIRS VNP64A1 labels</w:t>
       </w:r>
       <w:r>
         <w:t xml:space="preserve"> </w:t>
@@ -10675,10 +10801,19 @@
         <w:t xml:space="preserve">(Giglio 2024)</w:t>
       </w:r>
       <w:r>
-        <w:t xml:space="preserve"> </w:t>
-      </w:r>
-      <w:r>
-        <w:t xml:space="preserve">and independent fire perimeters were not used as a label check (S3.5(iii)).</w:t>
+        <w:t xml:space="preserve">, which overlap MCD64A1</w:t>
+      </w:r>
+      <w:r>
+        <w:t xml:space="preserve"> </w:t>
+      </w:r>
+      <w:r>
+        <w:t xml:space="preserve">by 87 % to 98 %, no conclusion changed; independent fire perimeters were not used (S1.23;</w:t>
+      </w:r>
+      <w:r>
+        <w:t xml:space="preserve"> </w:t>
+      </w:r>
+      <w:r>
+        <w:t xml:space="preserve">S3.5(iii)).</w:t>
       </w:r>
     </w:p>
     <w:p>
@@ -11485,7 +11620,7 @@
     </w:p>
     <w:bookmarkEnd w:id="66"/>
     <w:bookmarkEnd w:id="67"/>
-    <w:bookmarkStart w:id="187" w:name="references"/>
+    <w:bookmarkStart w:id="189" w:name="references"/>
     <w:p>
       <w:pPr>
         <w:pStyle w:val="Heading1"/>
@@ -11494,7 +11629,7 @@
         <w:t xml:space="preserve">References</w:t>
       </w:r>
     </w:p>
-    <w:bookmarkStart w:id="186" w:name="refs"/>
+    <w:bookmarkStart w:id="188" w:name="refs"/>
     <w:bookmarkStart w:id="69" w:name="ref-AlkanAkinci2023"/>
     <w:p>
       <w:pPr>
@@ -12623,12 +12758,42 @@
       </w:hyperlink>
     </w:p>
     <w:bookmarkEnd w:id="133"/>
-    <w:bookmarkStart w:id="135" w:name="ref-Oliveira2012"/>
+    <w:bookmarkStart w:id="135" w:name="ref-MunozSabater2021"/>
     <w:p>
       <w:pPr>
         <w:pStyle w:val="Bibliography"/>
       </w:pPr>
       <w:r>
+        <w:t xml:space="preserve">Muñoz-Sabater J, Dutra E, Agustí-Panareda A, et al (2021)</w:t>
+      </w:r>
+      <w:r>
+        <w:t xml:space="preserve"> </w:t>
+      </w:r>
+      <w:r>
+        <w:t xml:space="preserve">ERA5-Land</w:t>
+      </w:r>
+      <w:r>
+        <w:t xml:space="preserve">: A state-of-the-art global reanalysis dataset for land applications. Earth System Science Data 13:4349–4383.</w:t>
+      </w:r>
+      <w:r>
+        <w:t xml:space="preserve"> </w:t>
+      </w:r>
+      <w:hyperlink r:id="rId134">
+        <w:r>
+          <w:rPr>
+            <w:rStyle w:val="Hyperlink"/>
+          </w:rPr>
+          <w:t xml:space="preserve">https://doi.org/10.5194/essd-13-4349-2021</w:t>
+        </w:r>
+      </w:hyperlink>
+    </w:p>
+    <w:bookmarkEnd w:id="135"/>
+    <w:bookmarkStart w:id="137" w:name="ref-Oliveira2012"/>
+    <w:p>
+      <w:pPr>
+        <w:pStyle w:val="Bibliography"/>
+      </w:pPr>
+      <w:r>
         <w:t xml:space="preserve">Oliveira S, Oehler F, San-Miguel-Ayanz J, et al (2012) Modeling spatial patterns of fire occurrence in</w:t>
       </w:r>
       <w:r>
@@ -12646,7 +12811,7 @@
       <w:r>
         <w:t xml:space="preserve"> </w:t>
       </w:r>
-      <w:hyperlink r:id="rId134">
+      <w:hyperlink r:id="rId136">
         <w:r>
           <w:rPr>
             <w:rStyle w:val="Hyperlink"/>
@@ -12655,8 +12820,8 @@
         </w:r>
       </w:hyperlink>
     </w:p>
-    <w:bookmarkEnd w:id="135"/>
-    <w:bookmarkStart w:id="137" w:name="ref-ParisienMoritz2009"/>
+    <w:bookmarkEnd w:id="137"/>
+    <w:bookmarkStart w:id="139" w:name="ref-ParisienMoritz2009"/>
     <w:p>
       <w:pPr>
         <w:pStyle w:val="Bibliography"/>
@@ -12667,7 +12832,7 @@
       <w:r>
         <w:t xml:space="preserve"> </w:t>
       </w:r>
-      <w:hyperlink r:id="rId136">
+      <w:hyperlink r:id="rId138">
         <w:r>
           <w:rPr>
             <w:rStyle w:val="Hyperlink"/>
@@ -12676,8 +12841,8 @@
         </w:r>
       </w:hyperlink>
     </w:p>
-    <w:bookmarkEnd w:id="137"/>
-    <w:bookmarkStart w:id="139" w:name="ref-Pausas2021"/>
+    <w:bookmarkEnd w:id="139"/>
+    <w:bookmarkStart w:id="141" w:name="ref-Pausas2021"/>
     <w:p>
       <w:pPr>
         <w:pStyle w:val="Bibliography"/>
@@ -12688,7 +12853,7 @@
       <w:r>
         <w:t xml:space="preserve"> </w:t>
       </w:r>
-      <w:hyperlink r:id="rId138">
+      <w:hyperlink r:id="rId140">
         <w:r>
           <w:rPr>
             <w:rStyle w:val="Hyperlink"/>
@@ -12697,8 +12862,8 @@
         </w:r>
       </w:hyperlink>
     </w:p>
-    <w:bookmarkEnd w:id="139"/>
-    <w:bookmarkStart w:id="141" w:name="ref-PausasPaula2012"/>
+    <w:bookmarkEnd w:id="141"/>
+    <w:bookmarkStart w:id="143" w:name="ref-PausasPaula2012"/>
     <w:p>
       <w:pPr>
         <w:pStyle w:val="Bibliography"/>
@@ -12721,7 +12886,7 @@
       <w:r>
         <w:t xml:space="preserve"> </w:t>
       </w:r>
-      <w:hyperlink r:id="rId140">
+      <w:hyperlink r:id="rId142">
         <w:r>
           <w:rPr>
             <w:rStyle w:val="Hyperlink"/>
@@ -12730,8 +12895,8 @@
         </w:r>
       </w:hyperlink>
     </w:p>
-    <w:bookmarkEnd w:id="141"/>
-    <w:bookmarkStart w:id="143" w:name="ref-Persello2012"/>
+    <w:bookmarkEnd w:id="143"/>
+    <w:bookmarkStart w:id="145" w:name="ref-Persello2012"/>
     <w:p>
       <w:pPr>
         <w:pStyle w:val="Bibliography"/>
@@ -12742,7 +12907,7 @@
       <w:r>
         <w:t xml:space="preserve"> </w:t>
       </w:r>
-      <w:hyperlink r:id="rId142">
+      <w:hyperlink r:id="rId144">
         <w:r>
           <w:rPr>
             <w:rStyle w:val="Hyperlink"/>
@@ -12751,8 +12916,8 @@
         </w:r>
       </w:hyperlink>
     </w:p>
-    <w:bookmarkEnd w:id="143"/>
-    <w:bookmarkStart w:id="145" w:name="ref-Ploton2020"/>
+    <w:bookmarkEnd w:id="145"/>
+    <w:bookmarkStart w:id="147" w:name="ref-Ploton2020"/>
     <w:p>
       <w:pPr>
         <w:pStyle w:val="Bibliography"/>
@@ -12763,7 +12928,7 @@
       <w:r>
         <w:t xml:space="preserve"> </w:t>
       </w:r>
-      <w:hyperlink r:id="rId144">
+      <w:hyperlink r:id="rId146">
         <w:r>
           <w:rPr>
             <w:rStyle w:val="Hyperlink"/>
@@ -12772,8 +12937,8 @@
         </w:r>
       </w:hyperlink>
     </w:p>
-    <w:bookmarkEnd w:id="145"/>
-    <w:bookmarkStart w:id="147" w:name="ref-Podschwit2022"/>
+    <w:bookmarkEnd w:id="147"/>
+    <w:bookmarkStart w:id="149" w:name="ref-Podschwit2022"/>
     <w:p>
       <w:pPr>
         <w:pStyle w:val="Bibliography"/>
@@ -12796,7 +12961,7 @@
       <w:r>
         <w:t xml:space="preserve"> </w:t>
       </w:r>
-      <w:hyperlink r:id="rId146">
+      <w:hyperlink r:id="rId148">
         <w:r>
           <w:rPr>
             <w:rStyle w:val="Hyperlink"/>
@@ -12805,8 +12970,8 @@
         </w:r>
       </w:hyperlink>
     </w:p>
-    <w:bookmarkEnd w:id="147"/>
-    <w:bookmarkStart w:id="149" w:name="ref-Roberts2017"/>
+    <w:bookmarkEnd w:id="149"/>
+    <w:bookmarkStart w:id="151" w:name="ref-Roberts2017"/>
     <w:p>
       <w:pPr>
         <w:pStyle w:val="Bibliography"/>
@@ -12817,7 +12982,7 @@
       <w:r>
         <w:t xml:space="preserve"> </w:t>
       </w:r>
-      <w:hyperlink r:id="rId148">
+      <w:hyperlink r:id="rId150">
         <w:r>
           <w:rPr>
             <w:rStyle w:val="Hyperlink"/>
@@ -12826,8 +12991,8 @@
         </w:r>
       </w:hyperlink>
     </w:p>
-    <w:bookmarkEnd w:id="149"/>
-    <w:bookmarkStart w:id="151" w:name="ref-Rousseau2022"/>
+    <w:bookmarkEnd w:id="151"/>
+    <w:bookmarkStart w:id="153" w:name="ref-Rousseau2022"/>
     <w:p>
       <w:pPr>
         <w:pStyle w:val="Bibliography"/>
@@ -12838,7 +13003,7 @@
       <w:r>
         <w:t xml:space="preserve"> </w:t>
       </w:r>
-      <w:hyperlink r:id="rId150">
+      <w:hyperlink r:id="rId152">
         <w:r>
           <w:rPr>
             <w:rStyle w:val="Hyperlink"/>
@@ -12847,8 +13012,8 @@
         </w:r>
       </w:hyperlink>
     </w:p>
-    <w:bookmarkEnd w:id="151"/>
-    <w:bookmarkStart w:id="153" w:name="ref-Sandholt2002"/>
+    <w:bookmarkEnd w:id="153"/>
+    <w:bookmarkStart w:id="155" w:name="ref-Sandholt2002"/>
     <w:p>
       <w:pPr>
         <w:pStyle w:val="Bibliography"/>
@@ -12859,7 +13024,7 @@
       <w:r>
         <w:t xml:space="preserve"> </w:t>
       </w:r>
-      <w:hyperlink r:id="rId152">
+      <w:hyperlink r:id="rId154">
         <w:r>
           <w:rPr>
             <w:rStyle w:val="Hyperlink"/>
@@ -12868,8 +13033,8 @@
         </w:r>
       </w:hyperlink>
     </w:p>
-    <w:bookmarkEnd w:id="153"/>
-    <w:bookmarkStart w:id="155" w:name="ref-Schoener1968"/>
+    <w:bookmarkEnd w:id="155"/>
+    <w:bookmarkStart w:id="157" w:name="ref-Schoener1968"/>
     <w:p>
       <w:pPr>
         <w:pStyle w:val="Bibliography"/>
@@ -12901,7 +13066,7 @@
       <w:r>
         <w:t xml:space="preserve"> </w:t>
       </w:r>
-      <w:hyperlink r:id="rId154">
+      <w:hyperlink r:id="rId156">
         <w:r>
           <w:rPr>
             <w:rStyle w:val="Hyperlink"/>
@@ -12910,8 +13075,8 @@
         </w:r>
       </w:hyperlink>
     </w:p>
-    <w:bookmarkEnd w:id="155"/>
-    <w:bookmarkStart w:id="157" w:name="ref-Sofaer2019"/>
+    <w:bookmarkEnd w:id="157"/>
+    <w:bookmarkStart w:id="159" w:name="ref-Sofaer2019"/>
     <w:p>
       <w:pPr>
         <w:pStyle w:val="Bibliography"/>
@@ -12922,7 +13087,7 @@
       <w:r>
         <w:t xml:space="preserve"> </w:t>
       </w:r>
-      <w:hyperlink r:id="rId156">
+      <w:hyperlink r:id="rId158">
         <w:r>
           <w:rPr>
             <w:rStyle w:val="Hyperlink"/>
@@ -12931,8 +13096,8 @@
         </w:r>
       </w:hyperlink>
     </w:p>
-    <w:bookmarkEnd w:id="157"/>
-    <w:bookmarkStart w:id="159" w:name="ref-Sun2016"/>
+    <w:bookmarkEnd w:id="159"/>
+    <w:bookmarkStart w:id="161" w:name="ref-Sun2016"/>
     <w:p>
       <w:pPr>
         <w:pStyle w:val="Bibliography"/>
@@ -12943,7 +13108,7 @@
       <w:r>
         <w:t xml:space="preserve"> </w:t>
       </w:r>
-      <w:hyperlink r:id="rId158">
+      <w:hyperlink r:id="rId160">
         <w:r>
           <w:rPr>
             <w:rStyle w:val="Hyperlink"/>
@@ -12973,8 +13138,8 @@
         <w:t xml:space="preserve">-16). AAAI Press, Phoenix, Arizona, USA, pp 2058–2065</w:t>
       </w:r>
     </w:p>
-    <w:bookmarkEnd w:id="159"/>
-    <w:bookmarkStart w:id="161" w:name="ref-Tuia2016"/>
+    <w:bookmarkEnd w:id="161"/>
+    <w:bookmarkStart w:id="163" w:name="ref-Tuia2016"/>
     <w:p>
       <w:pPr>
         <w:pStyle w:val="Bibliography"/>
@@ -12985,7 +13150,7 @@
       <w:r>
         <w:t xml:space="preserve"> </w:t>
       </w:r>
-      <w:hyperlink r:id="rId160">
+      <w:hyperlink r:id="rId162">
         <w:r>
           <w:rPr>
             <w:rStyle w:val="Hyperlink"/>
@@ -12994,8 +13159,8 @@
         </w:r>
       </w:hyperlink>
     </w:p>
-    <w:bookmarkEnd w:id="161"/>
-    <w:bookmarkStart w:id="163" w:name="ref-LandsatC2L2"/>
+    <w:bookmarkEnd w:id="163"/>
+    <w:bookmarkStart w:id="165" w:name="ref-LandsatC2L2"/>
     <w:p>
       <w:pPr>
         <w:pStyle w:val="Bibliography"/>
@@ -13006,7 +13171,7 @@
       <w:r>
         <w:t xml:space="preserve"> </w:t>
       </w:r>
-      <w:hyperlink r:id="rId162">
+      <w:hyperlink r:id="rId164">
         <w:r>
           <w:rPr>
             <w:rStyle w:val="Hyperlink"/>
@@ -13015,8 +13180,8 @@
         </w:r>
       </w:hyperlink>
     </w:p>
-    <w:bookmarkEnd w:id="163"/>
-    <w:bookmarkStart w:id="165" w:name="ref-Valavi2019"/>
+    <w:bookmarkEnd w:id="165"/>
+    <w:bookmarkStart w:id="167" w:name="ref-Valavi2019"/>
     <w:p>
       <w:pPr>
         <w:pStyle w:val="Bibliography"/>
@@ -13048,7 +13213,7 @@
       <w:r>
         <w:t xml:space="preserve"> </w:t>
       </w:r>
-      <w:hyperlink r:id="rId164">
+      <w:hyperlink r:id="rId166">
         <w:r>
           <w:rPr>
             <w:rStyle w:val="Hyperlink"/>
@@ -13057,8 +13222,8 @@
         </w:r>
       </w:hyperlink>
     </w:p>
-    <w:bookmarkEnd w:id="165"/>
-    <w:bookmarkStart w:id="167" w:name="ref-VanDerWal2009"/>
+    <w:bookmarkEnd w:id="167"/>
+    <w:bookmarkStart w:id="169" w:name="ref-VanDerWal2009"/>
     <w:p>
       <w:pPr>
         <w:pStyle w:val="Bibliography"/>
@@ -13069,7 +13234,7 @@
       <w:r>
         <w:t xml:space="preserve"> </w:t>
       </w:r>
-      <w:hyperlink r:id="rId166">
+      <w:hyperlink r:id="rId168">
         <w:r>
           <w:rPr>
             <w:rStyle w:val="Hyperlink"/>
@@ -13078,8 +13243,8 @@
         </w:r>
       </w:hyperlink>
     </w:p>
-    <w:bookmarkEnd w:id="167"/>
-    <w:bookmarkStart w:id="169" w:name="ref-Vesk2021"/>
+    <w:bookmarkEnd w:id="169"/>
+    <w:bookmarkStart w:id="171" w:name="ref-Vesk2021"/>
     <w:p>
       <w:pPr>
         <w:pStyle w:val="Bibliography"/>
@@ -13090,7 +13255,7 @@
       <w:r>
         <w:t xml:space="preserve"> </w:t>
       </w:r>
-      <w:hyperlink r:id="rId168">
+      <w:hyperlink r:id="rId170">
         <w:r>
           <w:rPr>
             <w:rStyle w:val="Hyperlink"/>
@@ -13099,8 +13264,8 @@
         </w:r>
       </w:hyperlink>
     </w:p>
-    <w:bookmarkEnd w:id="169"/>
-    <w:bookmarkStart w:id="171" w:name="ref-Vibhandik2026"/>
+    <w:bookmarkEnd w:id="171"/>
+    <w:bookmarkStart w:id="173" w:name="ref-Vibhandik2026"/>
     <w:p>
       <w:pPr>
         <w:pStyle w:val="Bibliography"/>
@@ -13111,7 +13276,7 @@
       <w:r>
         <w:t xml:space="preserve"> </w:t>
       </w:r>
-      <w:hyperlink r:id="rId170">
+      <w:hyperlink r:id="rId172">
         <w:r>
           <w:rPr>
             <w:rStyle w:val="Hyperlink"/>
@@ -13120,8 +13285,8 @@
         </w:r>
       </w:hyperlink>
     </w:p>
-    <w:bookmarkEnd w:id="171"/>
-    <w:bookmarkStart w:id="173" w:name="ref-Wadoux2021"/>
+    <w:bookmarkEnd w:id="173"/>
+    <w:bookmarkStart w:id="175" w:name="ref-Wadoux2021"/>
     <w:p>
       <w:pPr>
         <w:pStyle w:val="Bibliography"/>
@@ -13132,7 +13297,7 @@
       <w:r>
         <w:t xml:space="preserve"> </w:t>
       </w:r>
-      <w:hyperlink r:id="rId172">
+      <w:hyperlink r:id="rId174">
         <w:r>
           <w:rPr>
             <w:rStyle w:val="Hyperlink"/>
@@ -13141,8 +13306,8 @@
         </w:r>
       </w:hyperlink>
     </w:p>
-    <w:bookmarkEnd w:id="173"/>
-    <w:bookmarkStart w:id="175" w:name="ref-MOD11A1"/>
+    <w:bookmarkEnd w:id="175"/>
+    <w:bookmarkStart w:id="177" w:name="ref-MOD11A1"/>
     <w:p>
       <w:pPr>
         <w:pStyle w:val="Bibliography"/>
@@ -13201,7 +13366,7 @@
       <w:r>
         <w:t xml:space="preserve"> </w:t>
       </w:r>
-      <w:hyperlink r:id="rId174">
+      <w:hyperlink r:id="rId176">
         <w:r>
           <w:rPr>
             <w:rStyle w:val="Hyperlink"/>
@@ -13210,8 +13375,8 @@
         </w:r>
       </w:hyperlink>
     </w:p>
-    <w:bookmarkEnd w:id="175"/>
-    <w:bookmarkStart w:id="177" w:name="ref-Warren2008"/>
+    <w:bookmarkEnd w:id="177"/>
+    <w:bookmarkStart w:id="179" w:name="ref-Warren2008"/>
     <w:p>
       <w:pPr>
         <w:pStyle w:val="Bibliography"/>
@@ -13222,7 +13387,7 @@
       <w:r>
         <w:t xml:space="preserve"> </w:t>
       </w:r>
-      <w:hyperlink r:id="rId176">
+      <w:hyperlink r:id="rId178">
         <w:r>
           <w:rPr>
             <w:rStyle w:val="Hyperlink"/>
@@ -13231,8 +13396,8 @@
         </w:r>
       </w:hyperlink>
     </w:p>
-    <w:bookmarkEnd w:id="177"/>
-    <w:bookmarkStart w:id="179" w:name="ref-Xu2026"/>
+    <w:bookmarkEnd w:id="179"/>
+    <w:bookmarkStart w:id="181" w:name="ref-Xu2026"/>
     <w:p>
       <w:pPr>
         <w:pStyle w:val="Bibliography"/>
@@ -13243,7 +13408,7 @@
       <w:r>
         <w:t xml:space="preserve"> </w:t>
       </w:r>
-      <w:hyperlink r:id="rId178">
+      <w:hyperlink r:id="rId180">
         <w:r>
           <w:rPr>
             <w:rStyle w:val="Hyperlink"/>
@@ -13252,8 +13417,8 @@
         </w:r>
       </w:hyperlink>
     </w:p>
-    <w:bookmarkEnd w:id="179"/>
-    <w:bookmarkStart w:id="181" w:name="ref-Yates2018"/>
+    <w:bookmarkEnd w:id="181"/>
+    <w:bookmarkStart w:id="183" w:name="ref-Yates2018"/>
     <w:p>
       <w:pPr>
         <w:pStyle w:val="Bibliography"/>
@@ -13264,7 +13429,7 @@
       <w:r>
         <w:t xml:space="preserve"> </w:t>
       </w:r>
-      <w:hyperlink r:id="rId180">
+      <w:hyperlink r:id="rId182">
         <w:r>
           <w:rPr>
             <w:rStyle w:val="Hyperlink"/>
@@ -13273,8 +13438,8 @@
         </w:r>
       </w:hyperlink>
     </w:p>
-    <w:bookmarkEnd w:id="181"/>
-    <w:bookmarkStart w:id="183" w:name="ref-Yebra2013"/>
+    <w:bookmarkEnd w:id="183"/>
+    <w:bookmarkStart w:id="185" w:name="ref-Yebra2013"/>
     <w:p>
       <w:pPr>
         <w:pStyle w:val="Bibliography"/>
@@ -13285,7 +13450,7 @@
       <w:r>
         <w:t xml:space="preserve"> </w:t>
       </w:r>
-      <w:hyperlink r:id="rId182">
+      <w:hyperlink r:id="rId184">
         <w:r>
           <w:rPr>
             <w:rStyle w:val="Hyperlink"/>
@@ -13294,8 +13459,8 @@
         </w:r>
       </w:hyperlink>
     </w:p>
-    <w:bookmarkEnd w:id="183"/>
-    <w:bookmarkStart w:id="185" w:name="ref-Zanaga2022"/>
+    <w:bookmarkEnd w:id="185"/>
+    <w:bookmarkStart w:id="187" w:name="ref-Zanaga2022"/>
     <w:p>
       <w:pPr>
         <w:pStyle w:val="Bibliography"/>
@@ -13324,7 +13489,7 @@
       <w:r>
         <w:t xml:space="preserve"> </w:t>
       </w:r>
-      <w:hyperlink r:id="rId184">
+      <w:hyperlink r:id="rId186">
         <w:r>
           <w:rPr>
             <w:rStyle w:val="Hyperlink"/>
@@ -13333,10 +13498,10 @@
         </w:r>
       </w:hyperlink>
     </w:p>
-    <w:bookmarkEnd w:id="185"/>
-    <w:bookmarkEnd w:id="186"/>
     <w:bookmarkEnd w:id="187"/>
-    <w:bookmarkStart w:id="188" w:name="figure-captions"/>
+    <w:bookmarkEnd w:id="188"/>
+    <w:bookmarkEnd w:id="189"/>
+    <w:bookmarkStart w:id="190" w:name="figure-captions"/>
     <w:p>
       <w:pPr>
         <w:pStyle w:val="Heading1"/>
@@ -13608,7 +13773,18 @@
         <w:t xml:space="preserve"> </w:t>
       </w:r>
       <w:r>
-        <w:t xml:space="preserve">After CORAL. Rows are source regions and columns are target regions (Man. = Manavgat, Bej. = Bejís, Muğ. = Muğla, Evia = North Evia, Mont. = Montiferru). The diagonal is empty. The colour scale is centred on 0.5: orange is below chance and purple is above. Cells below chance are also hatched. The ranges are 0.314 to 0.677 (raw), 0.302 to 0.630 (z-score) and 0.406 to 0.624 (CORAL). Adaptation moves the matrix toward chance. Under z-scoring, Bejís</w:t>
+        <w:t xml:space="preserve">After CORAL. Rows are source regions and columns are target regions (Man. = Manavgat, Bej. = Bejís, Muğ. = Muğla, Evia = North Evia, Mont. = Montiferru). The diagonal is empty. The colour scale is centred on 0.5: orange is below chance and purple is above. Cells below chance are also hatched. In (a), a dot marks a direction whose 10-cell (</w:t>
+      </w:r>
+      <m:oMath>
+        <m:r>
+          <m:rPr>
+            <m:sty m:val="p"/>
+          </m:rPr>
+          <m:t>≈</m:t>
+        </m:r>
+      </m:oMath>
+      <w:r>
+        <w:t xml:space="preserve">5 km) target-block interval excludes 0.5 (nine above and six below chance). The ranges are 0.314 to 0.677 (raw), 0.302 to 0.630 (z-score) and 0.406 to 0.624 (CORAL). Adaptation moves the matrix toward chance. Under z-scoring, Bejís</w:t>
       </w:r>
       <m:oMath>
         <m:r>
@@ -13658,7 +13834,7 @@
         <w:t xml:space="preserve"> </w:t>
       </w:r>
       <w:r>
-        <w:t xml:space="preserve">The 12 ordered directions among Manavgat, Bejís, Muğla and Evia, the four regions of the pipeline’s gap decomposition; Montiferru is not part of that decomposition. Natural-vegetation population; original study areas. The open circle is raw transfer ROC-AUC. The arrow ends at the better of the two adapted results (z-score or CORAL). This choice uses target labels, so the arrows show an optimistic case. The grey tick is the target’s within-region reference at 1 km blocking, and the dashed line is chance.</w:t>
+        <w:t xml:space="preserve">The 12 ordered directions among Manavgat, Bejís, Muğla and Evia, the four regions of the pipeline’s gap decomposition; Montiferru is not part of that decomposition. Natural-vegetation population; original study areas. The open circle is raw transfer ROC-AUC. The arrow ends at the better of the two adapted results (z-score or CORAL). This choice uses target labels, so the arrows show an optimistic case. A cross marks the result of CORAL alone, which uses no target labels. The grey tick is the target’s within-region reference at 1 km blocking, and the dashed line is chance.</w:t>
       </w:r>
       <w:r>
         <w:t xml:space="preserve"> </w:t>
@@ -14036,7 +14212,7 @@
         <w:t xml:space="preserve">Manavgat has, so the contrast is stated at the point estimates.</w:t>
       </w:r>
     </w:p>
-    <w:bookmarkEnd w:id="188"/>
+    <w:bookmarkEnd w:id="190"/>
     <w:sectPr>
       <w:footerReference r:id="rId9" w:type="default"/>
       <w:footnotePr>

</xml_diff>

<commit_message>
Fixes from the verification review: unit counts, collar reversals, frame-cost wording, CORAL implementations, qualifiers, data sources, Fig. S1 scar frames
</commit_message>
<xml_diff>
--- a/paper/submission/manuscript.docx
+++ b/paper/submission/manuscript.docx
@@ -96,7 +96,7 @@
         <w:t xml:space="preserve"> </w:t>
       </w:r>
       <w:r>
-        <w:t xml:space="preserve">8,793 words in the main text (Sections 1 to 6, table captions and notes included; tables, references, declarations and figure captions excluded). Abstract 250 words.</w:t>
+        <w:t xml:space="preserve">9,050 words in the main text (Sections 1 to 6, table captions and notes included; tables, references, declarations and figure captions excluded). Abstract 250 words.</w:t>
       </w:r>
     </w:p>
     <w:bookmarkStart w:id="18" w:name="abstract"/>
@@ -1506,19 +1506,13 @@
         <w:t xml:space="preserve"> </w:t>
       </w:r>
       <w:r>
-        <w:t xml:space="preserve">correction of Section 3.2. By contrast, the frame test (Section 3.12), the distance collars, the</w:t>
-      </w:r>
-      <w:r>
-        <w:t xml:space="preserve"> </w:t>
-      </w:r>
-      <w:r>
-        <w:t xml:space="preserve">equivalence tests, the additional resampling units and the analyses listed in Table S21 were added</w:t>
-      </w:r>
-      <w:r>
-        <w:t xml:space="preserve"> </w:t>
-      </w:r>
-      <w:r>
-        <w:t xml:space="preserve">after the first results. These are exploratory, and they are reported as such.</w:t>
+        <w:t xml:space="preserve">correction of Section 3.2. By contrast, the frame test (Section 3.12), the distance collars, the equivalence tests, the additional resampling units and the analyses listed in Tables S21 and S35</w:t>
+      </w:r>
+      <w:r>
+        <w:t xml:space="preserve"> </w:t>
+      </w:r>
+      <w:r>
+        <w:t xml:space="preserve">(Sections S1.22 and S1.23) were added after the first results. These are exploratory, and they are reported as such.</w:t>
       </w:r>
     </w:p>
     <w:bookmarkStart w:id="27" w:name="study-regions-and-temporal-windows"/>
@@ -1799,7 +1793,7 @@
         <w:t xml:space="preserve"> </w:t>
       </w:r>
       <w:r>
-        <w:t xml:space="preserve">was not applied, so 49 cells that burned before the label window were kept. Burning in the five</w:t>
+        <w:t xml:space="preserve">was not applied, so 48 cells that burned before the label window were kept. Burning in the five</w:t>
       </w:r>
       <w:r>
         <w:t xml:space="preserve"> </w:t>
@@ -2128,13 +2122,22 @@
         <w:t xml:space="preserve"> </w:t>
       </w:r>
       <w:r>
-        <w:t xml:space="preserve">2021 events. All analyses were therefore repeated with the 2020 map (WorldCover v100), aggregated to</w:t>
-      </w:r>
-      <w:r>
-        <w:t xml:space="preserve"> </w:t>
-      </w:r>
-      <w:r>
-        <w:t xml:space="preserve">the same cells. The 2020 map changed the population by at most 43 burned cells in four regions. In</w:t>
+        <w:t xml:space="preserve">2021 events. All analyses were therefore repeated with the 2020 map (WorldCover v100</w:t>
+      </w:r>
+      <w:r>
+        <w:t xml:space="preserve"> </w:t>
+      </w:r>
+      <w:r>
+        <w:t xml:space="preserve">(Zanaga et al. 2021)</w:t>
+      </w:r>
+      <w:r>
+        <w:t xml:space="preserve">), aggregated</w:t>
+      </w:r>
+      <w:r>
+        <w:t xml:space="preserve"> </w:t>
+      </w:r>
+      <w:r>
+        <w:t xml:space="preserve">to the same cells. The 2020 map changed the population by at most 43 burned cells in four regions. In</w:t>
       </w:r>
       <w:r>
         <w:t xml:space="preserve"> </w:t>
@@ -2216,13 +2219,7 @@
         <w:t xml:space="preserve"> </w:t>
       </w:r>
       <w:r>
-        <w:t xml:space="preserve">the region. These values are filled inside the model pipeline (Section 3.6), and missingness is not</w:t>
-      </w:r>
-      <w:r>
-        <w:t xml:space="preserve"> </w:t>
-      </w:r>
-      <w:r>
-        <w:t xml:space="preserve">related to burning (AUC 0.49 to 0.51 in every region). A</w:t>
+        <w:t xml:space="preserve">the region. These values are filled inside the model pipeline (Section 3.6), and missingness is not related to burning (AUC 0.49 to 0.51 in every region; Table S35). A</w:t>
       </w:r>
       <w:r>
         <w:t xml:space="preserve"> </w:t>
@@ -3132,19 +3129,31 @@
         <w:t xml:space="preserve">(Sofaer et al. 2019)</w:t>
       </w:r>
       <w:r>
-        <w:t xml:space="preserve">. The out-of-fold residuals stay spatially correlated up to 5 to</w:t>
-      </w:r>
-      <w:r>
-        <w:t xml:space="preserve"> </w:t>
-      </w:r>
-      <w:r>
-        <w:t xml:space="preserve">10 km, and in three regions they fall below 0.05 only at 10 to 20 km (Section S1.23). Intervals at</w:t>
-      </w:r>
-      <w:r>
-        <w:t xml:space="preserve"> </w:t>
-      </w:r>
-      <w:r>
-        <w:t xml:space="preserve">5 km blocking may therefore still be somewhat too narrow, and the 10 km results are given as a check.</w:t>
+        <w:t xml:space="preserve">. The out-of-fold residuals stay spatially correlated beyond 5 km. Their correlation falls below 0.05</w:t>
+      </w:r>
+      <w:r>
+        <w:t xml:space="preserve"> </w:t>
+      </w:r>
+      <w:r>
+        <w:t xml:space="preserve">at 10 to 20 km in Manavgat, Bejís and Muğla, at 5 to 10 km in Montiferru, and only at 20 to 40 km in</w:t>
+      </w:r>
+      <w:r>
+        <w:t xml:space="preserve"> </w:t>
+      </w:r>
+      <w:r>
+        <w:t xml:space="preserve">North Evia (Section S1.23). Intervals at 5 km blocking may therefore be too narrow, especially in</w:t>
+      </w:r>
+      <w:r>
+        <w:t xml:space="preserve"> </w:t>
+      </w:r>
+      <w:r>
+        <w:t xml:space="preserve">North Evia, where even 10 km blocks do not remove the dependence; the 10 km results are given as a</w:t>
+      </w:r>
+      <w:r>
+        <w:t xml:space="preserve"> </w:t>
+      </w:r>
+      <w:r>
+        <w:t xml:space="preserve">check.</w:t>
       </w:r>
     </w:p>
     <w:p>
@@ -3374,7 +3383,7 @@
         <w:t xml:space="preserve"> </w:t>
       </w:r>
       <w:r>
-        <w:t xml:space="preserve">target labels. The value of λ was not chosen by performance; its effect is reported in Section S1.2.</w:t>
+        <w:t xml:space="preserve">target labels. The value of λ was not chosen by performance; its effect is reported in Sections S1.2 and S1.23.</w:t>
       </w:r>
       <w:r>
         <w:t xml:space="preserve"> </w:t>
@@ -5328,13 +5337,19 @@
         <w:t xml:space="preserve"> </w:t>
       </w:r>
       <w:r>
-        <w:t xml:space="preserve">direction-level intervals are conditional on one fitted source model. Refitting with ten seeds,</w:t>
-      </w:r>
-      <w:r>
-        <w:t xml:space="preserve"> </w:t>
-      </w:r>
-      <w:r>
-        <w:t xml:space="preserve">however, changed mean transfer by at most 0.003 (Section S1.23). Across five bootstrap seeds,</w:t>
+        <w:t xml:space="preserve">direction-level intervals are conditional on one fitted source model. Refitting with ten seeds changed mean transfer by at most 0.003, but single directions by up to</w:t>
+      </w:r>
+      <w:r>
+        <w:t xml:space="preserve"> </w:t>
+      </w:r>
+      <w:r>
+        <w:t xml:space="preserve">0.049 (seed-to-seed standard deviation at most 0.015; Section S1.23). This variation is not part of</w:t>
+      </w:r>
+      <w:r>
+        <w:t xml:space="preserve"> </w:t>
+      </w:r>
+      <w:r>
+        <w:t xml:space="preserve">the direction-level intervals. Across five bootstrap seeds,</w:t>
       </w:r>
       <w:r>
         <w:t xml:space="preserve"> </w:t>
@@ -7967,7 +7982,7 @@
           <w:b/>
           <w:bCs/>
         </w:rPr>
-        <w:t xml:space="preserve">The same model scores 0.16 lower on the scar frame.</w:t>
+        <w:t xml:space="preserve">The same model scores lower on the scar frame.</w:t>
       </w:r>
       <w:r>
         <w:t xml:space="preserve"> </w:t>
@@ -7979,7 +7994,25 @@
         <w:t xml:space="preserve"> </w:t>
       </w:r>
       <w:r>
-        <w:t xml:space="preserve">predictions, and only the scored cells differ. With the region as the unit, this change costs</w:t>
+        <w:t xml:space="preserve">predictions, and only the scored cells differ. Over the seven scars of Table 2, A minus B is 0.133</w:t>
+      </w:r>
+      <w:r>
+        <w:t xml:space="preserve"> </w:t>
+      </w:r>
+      <w:r>
+        <w:t xml:space="preserve">[+0.060, +0.207]. The primary estimate uses all nine scars, including the single scars of Manavgat</w:t>
+      </w:r>
+      <w:r>
+        <w:t xml:space="preserve"> </w:t>
+      </w:r>
+      <w:r>
+        <w:t xml:space="preserve">and Bejís, which have no row C (Tables S1 and S5). With the region as the unit, the change then</w:t>
+      </w:r>
+      <w:r>
+        <w:t xml:space="preserve"> </w:t>
+      </w:r>
+      <w:r>
+        <w:t xml:space="preserve">costs</w:t>
       </w:r>
       <w:r>
         <w:t xml:space="preserve"> </w:t>
@@ -7995,19 +8028,13 @@
         <w:t xml:space="preserve"> </w:t>
       </w:r>
       <w:r>
-        <w:t xml:space="preserve">over all nine scars in five regions, and +0.137 [+0.048, +0.226] over the</w:t>
-      </w:r>
-      <w:r>
-        <w:t xml:space="preserve"> </w:t>
-      </w:r>
-      <w:r>
-        <w:t xml:space="preserve">three regions of Table 2. Over the seven scars the cost is 0.133 [+0.060, +0.207], but this interval</w:t>
-      </w:r>
-      <w:r>
-        <w:t xml:space="preserve"> </w:t>
-      </w:r>
-      <w:r>
-        <w:t xml:space="preserve">is too narrow, because row A is repeated for each scar of a region. With the region as the unit, the</w:t>
+        <w:t xml:space="preserve">over five regions, and +0.137 [+0.048, +0.226] over the three</w:t>
+      </w:r>
+      <w:r>
+        <w:t xml:space="preserve"> </w:t>
+      </w:r>
+      <w:r>
+        <w:t xml:space="preserve">regions of Table 2. The seven-scar interval is too narrow, because row A is repeated for each scar of a region. With the region as the unit, the</w:t>
       </w:r>
       <w:r>
         <w:t xml:space="preserve"> </w:t>
@@ -8115,19 +8142,19 @@
         <w:t xml:space="preserve"> </w:t>
       </w:r>
       <w:r>
-        <w:t xml:space="preserve">unit (Table S21). Across regions, the cost was not related to the share of distant cells in the study</w:t>
-      </w:r>
-      <w:r>
-        <w:t xml:space="preserve"> </w:t>
-      </w:r>
-      <w:r>
-        <w:t xml:space="preserve">area (slope 0.005 [−0.41, +0.42], n = 5). The unburned cells next to a fire are therefore hard to rank,</w:t>
-      </w:r>
-      <w:r>
-        <w:t xml:space="preserve"> </w:t>
-      </w:r>
-      <w:r>
-        <w:t xml:space="preserve">rather than the distant cells being easy.</w:t>
+        <w:t xml:space="preserve">unit (Table S21). Across regions, the cost showed no relation to the share of distant cells in the study area (slope</w:t>
+      </w:r>
+      <w:r>
+        <w:t xml:space="preserve"> </w:t>
+      </w:r>
+      <w:r>
+        <w:t xml:space="preserve">0.005 [−0.41, +0.42], n = 5), although this test has little power. The pool swaps and the placebo</w:t>
+      </w:r>
+      <w:r>
+        <w:t xml:space="preserve"> </w:t>
+      </w:r>
+      <w:r>
+        <w:t xml:space="preserve">collar show that the cost comes from the unburned cells next to the fire.</w:t>
       </w:r>
     </w:p>
     <w:p>
@@ -8297,7 +8324,7 @@
         <w:t xml:space="preserve"> </w:t>
       </w:r>
       <w:r>
-        <w:t xml:space="preserve">S13). In Manavgat, the median elevation of these cells rises from 330 m within 5 km of the fire to</w:t>
+        <w:t xml:space="preserve">S13). In Manavgat, the median elevation of the modelled cells rises from 330 m within 5 km of the fire to</w:t>
       </w:r>
       <w:r>
         <w:t xml:space="preserve"> </w:t>
@@ -8406,7 +8433,13 @@
         <w:t xml:space="preserve"> </w:t>
       </w:r>
       <w:r>
-        <w:t xml:space="preserve">pair-cluster bootstrap interval, 1000 replicates. W − T is the within-region thermal gain minus the</w:t>
+        <w:t xml:space="preserve">pair-cluster bootstrap interval, 1000 replicates (with 20,000 replicates, as in Table S31, the collar</w:t>
+      </w:r>
+      <w:r>
+        <w:t xml:space="preserve"> </w:t>
+      </w:r>
+      <w:r>
+        <w:t xml:space="preserve">interval is [−0.003, +0.051]). W − T is the within-region thermal gain minus the</w:t>
       </w:r>
       <w:r>
         <w:t xml:space="preserve"> </w:t>
@@ -9059,7 +9092,7 @@
           <w:b/>
           <w:bCs/>
         </w:rPr>
-        <w:t xml:space="preserve">two reversals remain on the</w:t>
+        <w:t xml:space="preserve">two reversals are supported on the collar.</w:t>
       </w:r>
       <w:r>
         <w:rPr>
@@ -9073,19 +9106,37 @@
           <w:b/>
           <w:bCs/>
         </w:rPr>
-        <w:t xml:space="preserve">collar. Both are on elevation, and both involve Manavgat.</w:t>
-      </w:r>
-      <w:r>
-        <w:t xml:space="preserve"> </w:t>
-      </w:r>
-      <w:r>
-        <w:t xml:space="preserve">Neither survives a Holm correction over</w:t>
-      </w:r>
-      <w:r>
-        <w:t xml:space="preserve"> </w:t>
-      </w:r>
-      <w:r>
-        <w:t xml:space="preserve">the ninety feature-by-pair comparisons (adjusted</w:t>
+        <w:t xml:space="preserve">Both are on elevation, and both involve Manavgat.</w:t>
+      </w:r>
+      <w:r>
+        <w:t xml:space="preserve"> </w:t>
+      </w:r>
+      <w:r>
+        <w:t xml:space="preserve">They are not the same pairs as on the original</w:t>
+      </w:r>
+      <w:r>
+        <w:t xml:space="preserve"> </w:t>
+      </w:r>
+      <w:r>
+        <w:t xml:space="preserve">areas. Manavgat against Muğla is supported on both frames. Manavgat against Evia becomes supported on</w:t>
+      </w:r>
+      <w:r>
+        <w:t xml:space="preserve"> </w:t>
+      </w:r>
+      <w:r>
+        <w:t xml:space="preserve">the collar, because the Evia interval excludes 0.5 only there. Manavgat against Bejís loses support</w:t>
+      </w:r>
+      <w:r>
+        <w:t xml:space="preserve"> </w:t>
+      </w:r>
+      <w:r>
+        <w:t xml:space="preserve">narrowly: the Bejís interval, [0.496, 0.722], misses 0.5 by 0.004. Neither collar reversal survives</w:t>
+      </w:r>
+      <w:r>
+        <w:t xml:space="preserve"> </w:t>
+      </w:r>
+      <w:r>
+        <w:t xml:space="preserve">a Holm correction over the ninety feature-by-pair comparisons (adjusted</w:t>
       </w:r>
       <w:r>
         <w:t xml:space="preserve"> </w:t>
@@ -9101,13 +9152,13 @@
         <w:t xml:space="preserve"> </w:t>
       </w:r>
       <w:r>
-        <w:t xml:space="preserve">= 0.33 and 0.79; Section S1.19). All other</w:t>
-      </w:r>
-      <w:r>
-        <w:t xml:space="preserve"> </w:t>
-      </w:r>
-      <w:r>
-        <w:t xml:space="preserve">supported elevation reversals disappear on the collar.</w:t>
+        <w:t xml:space="preserve">= 0.33 and 0.79; Section</w:t>
+      </w:r>
+      <w:r>
+        <w:t xml:space="preserve"> </w:t>
+      </w:r>
+      <w:r>
+        <w:t xml:space="preserve">S1.19).</w:t>
       </w:r>
     </w:p>
     <w:p>
@@ -9584,19 +9635,19 @@
         <w:t xml:space="preserve"> </w:t>
       </w:r>
       <w:r>
-        <w:t xml:space="preserve">because each region appears in eight of them. Accordingly, all four resampling units that apply to</w:t>
-      </w:r>
-      <w:r>
-        <w:t xml:space="preserve"> </w:t>
-      </w:r>
-      <w:r>
-        <w:t xml:space="preserve">this frame give intervals that include zero, from [−0.018, +0.033] to [−0.028, +0.043] (Section</w:t>
-      </w:r>
-      <w:r>
-        <w:t xml:space="preserve"> </w:t>
-      </w:r>
-      <w:r>
-        <w:t xml:space="preserve">S1.20).</w:t>
+        <w:t xml:space="preserve">because each region appears in eight of them. Accordingly, all six resampling units that can be computed on this frame give intervals that include</w:t>
+      </w:r>
+      <w:r>
+        <w:t xml:space="preserve"> </w:t>
+      </w:r>
+      <w:r>
+        <w:t xml:space="preserve">zero, from [−0.006, +0.022] (clustering by target region) to [−0.028, +0.045] (pigeonhole bootstrap;</w:t>
+      </w:r>
+      <w:r>
+        <w:t xml:space="preserve"> </w:t>
+      </w:r>
+      <w:r>
+        <w:t xml:space="preserve">Sections S1.15 and S1.23).</w:t>
       </w:r>
     </w:p>
     <w:p>
@@ -9651,13 +9702,13 @@
         <w:t xml:space="preserve"> </w:t>
       </w:r>
       <w:r>
-        <w:t xml:space="preserve">each direction gave 0.523, but this choice uses target labels. The gap decomposition covers the</w:t>
-      </w:r>
-      <w:r>
-        <w:t xml:space="preserve"> </w:t>
-      </w:r>
-      <w:r>
-        <w:t xml:space="preserve">twelve directions among the four regions of the pipeline’s decomposition run, without Montiferru.</w:t>
+        <w:t xml:space="preserve">each direction gave 0.523, but this choice uses target labels. The gap decomposition covers the twelve directions among Manavgat, Bejís, Muğla and Evia. It was</w:t>
+      </w:r>
+      <w:r>
+        <w:t xml:space="preserve"> </w:t>
+      </w:r>
+      <w:r>
+        <w:t xml:space="preserve">computed before Montiferru was added to the cohort and does not include it.</w:t>
       </w:r>
       <w:r>
         <w:t xml:space="preserve"> </w:t>
@@ -9751,13 +9802,19 @@
         <w:t xml:space="preserve"> </w:t>
       </w:r>
       <w:r>
-        <w:t xml:space="preserve">Removing the two reversing features cost −0.076 AUC within regions and changed</w:t>
-      </w:r>
-      <w:r>
-        <w:t xml:space="preserve"> </w:t>
-      </w:r>
-      <w:r>
-        <w:t xml:space="preserve">transfer by +0.014 [−0.028, +0.056], which includes zero (Fig. 7).</w:t>
+        <w:t xml:space="preserve">Removing the two reversing features lowered within-region AUC by 0.076 and changed transfer by</w:t>
+      </w:r>
+      <w:r>
+        <w:t xml:space="preserve"> </w:t>
+      </w:r>
+      <w:r>
+        <w:t xml:space="preserve">+0.014 [−0.028, +0.056], which includes zero (Fig. 7); the primary pair-cluster bootstrap gives</w:t>
+      </w:r>
+      <w:r>
+        <w:t xml:space="preserve"> </w:t>
+      </w:r>
+      <w:r>
+        <w:t xml:space="preserve">[−0.018, +0.049] (Section S1.14).</w:t>
       </w:r>
     </w:p>
     <w:p>
@@ -9922,19 +9979,19 @@
         <w:t xml:space="preserve"> </w:t>
       </w:r>
       <w:r>
-        <w:t xml:space="preserve">between-region results changed (Section 4.4). Two results remained: transfer stayed well below</w:t>
-      </w:r>
-      <w:r>
-        <w:t xml:space="preserve"> </w:t>
-      </w:r>
-      <w:r>
-        <w:t xml:space="preserve">within-region skill, and one reversed relationship remained, the elevation association of Manavgat.</w:t>
-      </w:r>
-      <w:r>
-        <w:t xml:space="preserve"> </w:t>
-      </w:r>
-      <w:r>
-        <w:t xml:space="preserve">This reversal is supported under the per-comparison criterion but not after multiplicity correction.</w:t>
+        <w:t xml:space="preserve">between-region results changed (Section 4.4). Two results remained: transfer stayed well below within-region skill, and the elevation association</w:t>
+      </w:r>
+      <w:r>
+        <w:t xml:space="preserve"> </w:t>
+      </w:r>
+      <w:r>
+        <w:t xml:space="preserve">of Manavgat stayed reversed against other regions. The supported pairs, however, change between the</w:t>
+      </w:r>
+      <w:r>
+        <w:t xml:space="preserve"> </w:t>
+      </w:r>
+      <w:r>
+        <w:t xml:space="preserve">frames, and none survives multiplicity correction (Section 4.4).</w:t>
       </w:r>
       <w:r>
         <w:t xml:space="preserve"> </w:t>
@@ -9970,19 +10027,31 @@
         <w:pStyle w:val="FirstParagraph"/>
       </w:pPr>
       <w:r>
-        <w:t xml:space="preserve">The thermal gain within regions is robust. It was supported in all five regions under blocked</w:t>
-      </w:r>
-      <w:r>
-        <w:t xml:space="preserve"> </w:t>
-      </w:r>
-      <w:r>
-        <w:t xml:space="preserve">validation, in all sensitivity analyses (Sections S1.1 to S1.8), and when the predictor window was</w:t>
-      </w:r>
-      <w:r>
-        <w:t xml:space="preserve"> </w:t>
-      </w:r>
-      <w:r>
-        <w:t xml:space="preserve">closed up to two weeks earlier (Section S1.4). On the scar frame, however, the same gain fell to</w:t>
+        <w:t xml:space="preserve">The thermal gain within regions is robust, with one exception. It was supported in all five regions</w:t>
+      </w:r>
+      <w:r>
+        <w:t xml:space="preserve"> </w:t>
+      </w:r>
+      <w:r>
+        <w:t xml:space="preserve">under blocked validation, without the coordinate-informed channels (Section S1.7), when the predictor</w:t>
+      </w:r>
+      <w:r>
+        <w:t xml:space="preserve"> </w:t>
+      </w:r>
+      <w:r>
+        <w:t xml:space="preserve">window was closed up to two weeks earlier (Section S1.4), and at the point estimates with VNP64A1</w:t>
+      </w:r>
+      <w:r>
+        <w:t xml:space="preserve"> </w:t>
+      </w:r>
+      <w:r>
+        <w:t xml:space="preserve">labels. Once terrain aspect was added, however, the gain in Montiferru was no longer supported</w:t>
+      </w:r>
+      <w:r>
+        <w:t xml:space="preserve"> </w:t>
+      </w:r>
+      <w:r>
+        <w:t xml:space="preserve">(Section 4.2). On the scar frame, however, the same gain fell to</w:t>
       </w:r>
       <w:r>
         <w:t xml:space="preserve"> </w:t>
@@ -10153,13 +10222,13 @@
         <w:t xml:space="preserve"> </w:t>
       </w:r>
       <w:r>
-        <w:t xml:space="preserve">Hotter surfaces burned less in four of five regions, and in Manavgat once elevation was held</w:t>
-      </w:r>
-      <w:r>
-        <w:t xml:space="preserve"> </w:t>
-      </w:r>
-      <w:r>
-        <w:t xml:space="preserve">(Section 4.4). In summer, land surface temperature is strongly shaped by canopy cover, exposed soil</w:t>
+        <w:t xml:space="preserve">At the point estimates, hotter surfaces burned less in four of five regions, and in Manavgat once</w:t>
+      </w:r>
+      <w:r>
+        <w:t xml:space="preserve"> </w:t>
+      </w:r>
+      <w:r>
+        <w:t xml:space="preserve">elevation was held; the Manavgat result has interval support only on the collar (Section 4.4). In summer, land surface temperature is strongly shaped by canopy cover, exposed soil</w:t>
       </w:r>
       <w:r>
         <w:t xml:space="preserve"> </w:t>
@@ -10177,13 +10246,7 @@
         <w:t xml:space="preserve"> </w:t>
       </w:r>
       <w:r>
-        <w:t xml:space="preserve">terrain aspect was added, which fits this reading. Across the five regions, the mean LST anomaly</w:t>
-      </w:r>
-      <w:r>
-        <w:t xml:space="preserve"> </w:t>
-      </w:r>
-      <w:r>
-        <w:t xml:space="preserve">also followed the ERA5-Land</w:t>
+        <w:t xml:space="preserve">terrain aspect was added, which fits this reading. Descriptively, across only five regions, the mean LST anomaly also followed the ERA5-Land</w:t>
       </w:r>
       <w:r>
         <w:t xml:space="preserve"> </w:t>
@@ -10195,13 +10258,13 @@
         <w:t xml:space="preserve"> </w:t>
       </w:r>
       <w:r>
-        <w:t xml:space="preserve">air-temperature anomaly of the predictor window, but</w:t>
-      </w:r>
-      <w:r>
-        <w:t xml:space="preserve"> </w:t>
-      </w:r>
-      <w:r>
-        <w:t xml:space="preserve">not its relative-humidity anomaly (Section S1.23). The normalised channels did not transfer better than</w:t>
+        <w:t xml:space="preserve">air-temperature anomaly of the predictor window, but not its relative-humidity</w:t>
+      </w:r>
+      <w:r>
+        <w:t xml:space="preserve"> </w:t>
+      </w:r>
+      <w:r>
+        <w:t xml:space="preserve">anomaly (Section S1.23). The normalised channels did not transfer better than</w:t>
       </w:r>
       <w:r>
         <w:t xml:space="preserve"> </w:t>
@@ -10356,13 +10419,19 @@
         <w:t xml:space="preserve"> </w:t>
       </w:r>
       <w:r>
-        <w:t xml:space="preserve">elsewhere, and no similarity measure tested here could replace the measurement. A model moved to a new region did not usefully rank the burned cells there: its highest-scored</w:t>
-      </w:r>
-      <w:r>
-        <w:t xml:space="preserve"> </w:t>
-      </w:r>
-      <w:r>
-        <w:t xml:space="preserve">10 % of cells contained about as many burned cells as a random choice (Section 4.5). Target</w:t>
+        <w:t xml:space="preserve">elsewhere, and no similarity measure tested here could replace the measurement. On average, a model moved to a new region did not usefully rank the burned cells there: its</w:t>
+      </w:r>
+      <w:r>
+        <w:t xml:space="preserve"> </w:t>
+      </w:r>
+      <w:r>
+        <w:t xml:space="preserve">highest-scored 10 % of cells contained about as many burned cells as a random choice, although the</w:t>
+      </w:r>
+      <w:r>
+        <w:t xml:space="preserve"> </w:t>
+      </w:r>
+      <w:r>
+        <w:t xml:space="preserve">best direction reached 27 % (Section 4.5). Target</w:t>
       </w:r>
       <w:r>
         <w:t xml:space="preserve"> </w:t>
@@ -10582,13 +10651,19 @@
         <w:t xml:space="preserve"> </w:t>
       </w:r>
       <w:r>
-        <w:t xml:space="preserve">directions moved by up to 0.047, while ten random-forest seeds changed mean transfer by at most</w:t>
-      </w:r>
-      <w:r>
-        <w:t xml:space="preserve"> </w:t>
-      </w:r>
-      <w:r>
-        <w:t xml:space="preserve">0.003 (Section 3.13; S1.23; S3.5(vi)).</w:t>
+        <w:t xml:space="preserve">directions moved by up to 0.047; across ten random-forest seeds, single directions moved by up to</w:t>
+      </w:r>
+      <w:r>
+        <w:t xml:space="preserve"> </w:t>
+      </w:r>
+      <w:r>
+        <w:t xml:space="preserve">0.049 and mean transfer by at most 0.003. Direction-level intervals do not include this variation</w:t>
+      </w:r>
+      <w:r>
+        <w:t xml:space="preserve"> </w:t>
+      </w:r>
+      <w:r>
+        <w:t xml:space="preserve">(Section 3.13; S1.23; S3.5(vi)).</w:t>
       </w:r>
     </w:p>
     <w:p>
@@ -10616,13 +10691,13 @@
         <w:t xml:space="preserve"> </w:t>
       </w:r>
       <w:r>
-        <w:t xml:space="preserve">only at 10 to 20 km in three regions, so intervals at 5 km blocking may be somewhat narrow</w:t>
-      </w:r>
-      <w:r>
-        <w:t xml:space="preserve"> </w:t>
-      </w:r>
-      <w:r>
-        <w:t xml:space="preserve">(Section 3.7; S1.23).</w:t>
+        <w:t xml:space="preserve">only at 10 to 20 km in three regions and at 20 to 40 km in North Evia, so intervals at 5 km</w:t>
+      </w:r>
+      <w:r>
+        <w:t xml:space="preserve"> </w:t>
+      </w:r>
+      <w:r>
+        <w:t xml:space="preserve">blocking may be too narrow, especially in North Evia (Section 3.7; S1.23).</w:t>
       </w:r>
     </w:p>
     <w:p>
@@ -11255,7 +11330,46 @@
         <w:t xml:space="preserve">(Zanaga et al. 2022)</w:t>
       </w:r>
       <w:r>
-        <w:t xml:space="preserve">. The MODIS and Landsat products are courtesy of NASA’s Land Processes Distributed Active</w:t>
+        <w:t xml:space="preserve">. For the sensitivity analyses, burned area was also taken from VIIRS VNP64A1 v002</w:t>
+      </w:r>
+      <w:r>
+        <w:t xml:space="preserve"> </w:t>
+      </w:r>
+      <w:r>
+        <w:t xml:space="preserve">(Giglio 2024)</w:t>
+      </w:r>
+      <w:r>
+        <w:t xml:space="preserve"> </w:t>
+      </w:r>
+      <w:r>
+        <w:t xml:space="preserve">and land cover from ESA WorldCover v100</w:t>
+      </w:r>
+      <w:r>
+        <w:t xml:space="preserve"> </w:t>
+      </w:r>
+      <w:r>
+        <w:t xml:space="preserve">(Zanaga et al. 2021)</w:t>
+      </w:r>
+      <w:r>
+        <w:t xml:space="preserve">, and regional weather anomalies came</w:t>
+      </w:r>
+      <w:r>
+        <w:t xml:space="preserve"> </w:t>
+      </w:r>
+      <w:r>
+        <w:t xml:space="preserve">from ERA5-Land</w:t>
+      </w:r>
+      <w:r>
+        <w:t xml:space="preserve"> </w:t>
+      </w:r>
+      <w:r>
+        <w:t xml:space="preserve">(Muñoz-Sabater et al. 2021)</w:t>
+      </w:r>
+      <w:r>
+        <w:t xml:space="preserve"> </w:t>
+      </w:r>
+      <w:r>
+        <w:t xml:space="preserve">as computed by the processing pipeline. The MODIS, VIIRS and Landsat products are courtesy of NASA’s Land Processes Distributed Active</w:t>
       </w:r>
       <w:r>
         <w:t xml:space="preserve"> </w:t>
@@ -11285,7 +11399,13 @@
         <w:t xml:space="preserve"> </w:t>
       </w:r>
       <w:r>
-        <w:t xml:space="preserve">Union and ESA; all rights reserved. No proprietary or restricted data were used.</w:t>
+        <w:t xml:space="preserve">Union and ESA; all rights reserved. The ERA5-Land values contain modified Copernicus Climate Change</w:t>
+      </w:r>
+      <w:r>
+        <w:t xml:space="preserve"> </w:t>
+      </w:r>
+      <w:r>
+        <w:t xml:space="preserve">Service information. No proprietary or restricted data were used.</w:t>
       </w:r>
     </w:p>
     <w:p>
@@ -11620,7 +11740,7 @@
     </w:p>
     <w:bookmarkEnd w:id="66"/>
     <w:bookmarkEnd w:id="67"/>
-    <w:bookmarkStart w:id="189" w:name="references"/>
+    <w:bookmarkStart w:id="191" w:name="references"/>
     <w:p>
       <w:pPr>
         <w:pStyle w:val="Heading1"/>
@@ -11629,7 +11749,7 @@
         <w:t xml:space="preserve">References</w:t>
       </w:r>
     </w:p>
-    <w:bookmarkStart w:id="188" w:name="refs"/>
+    <w:bookmarkStart w:id="190" w:name="refs"/>
     <w:bookmarkStart w:id="69" w:name="ref-AlkanAkinci2023"/>
     <w:p>
       <w:pPr>
@@ -13499,9 +13619,48 @@
       </w:hyperlink>
     </w:p>
     <w:bookmarkEnd w:id="187"/>
-    <w:bookmarkEnd w:id="188"/>
+    <w:bookmarkStart w:id="189" w:name="ref-Zanaga2021"/>
+    <w:p>
+      <w:pPr>
+        <w:pStyle w:val="Bibliography"/>
+      </w:pPr>
+      <w:r>
+        <w:t xml:space="preserve">Zanaga D, Van De Kerchove R, De Keersmaecker W, et al (2021)</w:t>
+      </w:r>
+      <w:r>
+        <w:t xml:space="preserve"> </w:t>
+      </w:r>
+      <w:r>
+        <w:t xml:space="preserve">ESA</w:t>
+      </w:r>
+      <w:r>
+        <w:t xml:space="preserve"> </w:t>
+      </w:r>
+      <w:r>
+        <w:t xml:space="preserve">WorldCover</w:t>
+      </w:r>
+      <w:r>
+        <w:t xml:space="preserve"> </w:t>
+      </w:r>
+      <w:r>
+        <w:t xml:space="preserve">10 m 2020 v100. Zenodo.</w:t>
+      </w:r>
+      <w:r>
+        <w:t xml:space="preserve"> </w:t>
+      </w:r>
+      <w:hyperlink r:id="rId188">
+        <w:r>
+          <w:rPr>
+            <w:rStyle w:val="Hyperlink"/>
+          </w:rPr>
+          <w:t xml:space="preserve">https://doi.org/10.5281/zenodo.5571936</w:t>
+        </w:r>
+      </w:hyperlink>
+    </w:p>
     <w:bookmarkEnd w:id="189"/>
-    <w:bookmarkStart w:id="190" w:name="figure-captions"/>
+    <w:bookmarkEnd w:id="190"/>
+    <w:bookmarkEnd w:id="191"/>
+    <w:bookmarkStart w:id="192" w:name="figure-captions"/>
     <w:p>
       <w:pPr>
         <w:pStyle w:val="Heading1"/>
@@ -14212,7 +14371,7 @@
         <w:t xml:space="preserve">Manavgat has, so the contrast is stated at the point estimates.</w:t>
       </w:r>
     </w:p>
-    <w:bookmarkEnd w:id="190"/>
+    <w:bookmarkEnd w:id="192"/>
     <w:sectPr>
       <w:footerReference r:id="rId9" w:type="default"/>
       <w:footnotePr>

</xml_diff>

<commit_message>
Cite the Zenodo v1.1.0 archive (10.5281/zenodo.23038039)
</commit_message>
<xml_diff>
--- a/paper/submission/manuscript.docx
+++ b/paper/submission/manuscript.docx
@@ -11570,13 +11570,7 @@
         </w:r>
       </w:hyperlink>
       <w:r>
-        <w:t xml:space="preserve">, and version 1.0.1</w:t>
-      </w:r>
-      <w:r>
-        <w:t xml:space="preserve"> </w:t>
-      </w:r>
-      <w:r>
-        <w:t xml:space="preserve">is archived at Zenodo</w:t>
+        <w:t xml:space="preserve">, and version 1.1.0is archived at Zenodo</w:t>
       </w:r>
       <w:r>
         <w:t xml:space="preserve"> </w:t>
@@ -12749,7 +12743,7 @@
         <w:pStyle w:val="Bibliography"/>
       </w:pPr>
       <w:r>
-        <w:t xml:space="preserve">Metin E, Cogurcu YE (2026) Evaluation area and the limits of cross-region transfer of pre-fire thermal wildfire models: Analysis code, modelling datasets and frozen outputs [software], version 1.0.1. Zenodo.</w:t>
+        <w:t xml:space="preserve">Metin E, Cogurcu YE (2026) Evaluation area and the limits of cross-region transfer of pre-fire thermal wildfire models: Analysis code, modelling datasets and frozen outputs [software], version 1.1.0. Zenodo.</w:t>
       </w:r>
       <w:r>
         <w:t xml:space="preserve"> </w:t>
@@ -12759,7 +12753,7 @@
           <w:rPr>
             <w:rStyle w:val="Hyperlink"/>
           </w:rPr>
-          <w:t xml:space="preserve">https://doi.org/10.5281/zenodo.23035271</w:t>
+          <w:t xml:space="preserve">https://doi.org/10.5281/zenodo.23038039</w:t>
         </w:r>
       </w:hyperlink>
     </w:p>

</xml_diff>

<commit_message>
Final fixes from the readiness review: permutation minimum, within-gain wording, Declarations typo, sourced feature-removal interval
</commit_message>
<xml_diff>
--- a/paper/submission/manuscript.docx
+++ b/paper/submission/manuscript.docx
@@ -96,7 +96,7 @@
         <w:t xml:space="preserve"> </w:t>
       </w:r>
       <w:r>
-        <w:t xml:space="preserve">9,050 words in the main text (Sections 1 to 6, table captions and notes included; tables, references, declarations and figure captions excluded). Abstract 250 words.</w:t>
+        <w:t xml:space="preserve">9,060 words in the main text (Sections 1 to 6, table captions and notes included; tables, references, declarations and figure captions excluded). Abstract 250 words.</w:t>
       </w:r>
     </w:p>
     <w:bookmarkStart w:id="18" w:name="abstract"/>
@@ -10033,25 +10033,31 @@
         <w:t xml:space="preserve"> </w:t>
       </w:r>
       <w:r>
-        <w:t xml:space="preserve">under blocked validation, without the coordinate-informed channels (Section S1.7), when the predictor</w:t>
-      </w:r>
-      <w:r>
-        <w:t xml:space="preserve"> </w:t>
-      </w:r>
-      <w:r>
-        <w:t xml:space="preserve">window was closed up to two weeks earlier (Section S1.4), and at the point estimates with VNP64A1</w:t>
-      </w:r>
-      <w:r>
-        <w:t xml:space="preserve"> </w:t>
-      </w:r>
-      <w:r>
-        <w:t xml:space="preserve">labels. Once terrain aspect was added, however, the gain in Montiferru was no longer supported</w:t>
-      </w:r>
-      <w:r>
-        <w:t xml:space="preserve"> </w:t>
-      </w:r>
-      <w:r>
-        <w:t xml:space="preserve">(Section 4.2). On the scar frame, however, the same gain fell to</w:t>
+        <w:t xml:space="preserve">under blocked validation and when the predictor window was closed up to two weeks earlier (Section</w:t>
+      </w:r>
+      <w:r>
+        <w:t xml:space="preserve"> </w:t>
+      </w:r>
+      <w:r>
+        <w:t xml:space="preserve">S1.4). It stayed positive in every region at the point estimates without the coordinate-informed</w:t>
+      </w:r>
+      <w:r>
+        <w:t xml:space="preserve"> </w:t>
+      </w:r>
+      <w:r>
+        <w:t xml:space="preserve">channels (Section S1.7) and with VNP64A1 labels (Section S1.23). Once terrain aspect was added,</w:t>
+      </w:r>
+      <w:r>
+        <w:t xml:space="preserve"> </w:t>
+      </w:r>
+      <w:r>
+        <w:t xml:space="preserve">however, the gain in Montiferru was no longer supported (Section 4.2). In addition, on the scar</w:t>
+      </w:r>
+      <w:r>
+        <w:t xml:space="preserve"> </w:t>
+      </w:r>
+      <w:r>
+        <w:t xml:space="preserve">frame the same gain fell to</w:t>
       </w:r>
       <w:r>
         <w:t xml:space="preserve"> </w:t>
@@ -11570,7 +11576,13 @@
         </w:r>
       </w:hyperlink>
       <w:r>
-        <w:t xml:space="preserve">, and version 1.1.0is archived at Zenodo</w:t>
+        <w:t xml:space="preserve">, and version 1.1.0</w:t>
+      </w:r>
+      <w:r>
+        <w:t xml:space="preserve"> </w:t>
+      </w:r>
+      <w:r>
+        <w:t xml:space="preserve">is archived at Zenodo</w:t>
       </w:r>
       <w:r>
         <w:t xml:space="preserve"> </w:t>

</xml_diff>